<commit_message>
docs: THETIS_DIRECT_PORT_PLAN status registry current through P0.d + regenerate PDF/DOCX siblings
Registry updates: P0.a-P0.d rows (wdspcalls/cmcomm/ILV/AAMix/
CmBuffs/cmsetup/CMaster verbatim ports), TxChannel rows retired
(carve-out deleted at P0.d), new P0->P4 active stage table with
the P0.d HL2 bench gate marked PENDING, historical lettered
stages annotated as superseded, shipped-work log entries for the
2026-06-09..12 verbatim-rewrite arc.

PDF + DOCX regenerated from the MD via tools/sync_execution_plan
renderers (MD stays source-of-truth).

Co-Authored-By: Claude Fable 5 <noreply@anthropic.com>
</commit_message>
<xml_diff>
--- a/docs/THETIS_DIRECT_PORT_PLAN.docx
+++ b/docs/THETIS_DIRECT_PORT_PLAN.docx
@@ -960,16 +960,35 @@
             </w:r>
             <w:r>
               <w:rPr>
+                <w:sz w:val="18"/>
+              </w:rPr>
+              <w:t>WDSP exports linkage (</w:t>
+            </w:r>
+            <w:r>
+              <w:rPr>
                 <w:rFonts w:ascii="Consolas" w:hAnsi="Consolas"/>
                 <w:sz w:val="18"/>
               </w:rPr>
-              <w:t>ChannelMaster\cmaster.c</w:t>
-            </w:r>
-            <w:r>
-              <w:rPr>
-                <w:sz w:val="18"/>
-              </w:rPr>
-              <w:t xml:space="preserve"> (stubs only)</w:t>
+              <w:t>OpenChannel</w:t>
+            </w:r>
+            <w:r>
+              <w:rPr>
+                <w:sz w:val="18"/>
+              </w:rPr>
+              <w:t>/</w:t>
+            </w:r>
+            <w:r>
+              <w:rPr>
+                <w:rFonts w:ascii="Consolas" w:hAnsi="Consolas"/>
+                <w:sz w:val="18"/>
+              </w:rPr>
+              <w:t>fexchange0</w:t>
+            </w:r>
+            <w:r>
+              <w:rPr>
+                <w:sz w:val="18"/>
+              </w:rPr>
+              <w:t>/analyzers/PS family)</w:t>
             </w:r>
           </w:p>
         </w:tc>
@@ -988,13 +1007,13 @@
                 <w:rFonts w:ascii="Consolas" w:hAnsi="Consolas"/>
                 <w:sz w:val="18"/>
               </w:rPr>
-              <w:t>src/wire/CMaster.{h,cpp}</w:t>
-            </w:r>
-            <w:r>
-              <w:rPr>
-                <w:sz w:val="18"/>
-              </w:rPr>
-              <w:t xml:space="preserve"> (Stage A)</w:t>
+              <w:t>src/wire/wdspcalls.{h,cpp}</w:t>
+            </w:r>
+            <w:r>
+              <w:rPr>
+                <w:sz w:val="18"/>
+              </w:rPr>
+              <w:t xml:space="preserve"> (P0.a)</w:t>
             </w:r>
           </w:p>
         </w:tc>
@@ -1028,9 +1047,29 @@
             </w:r>
             <w:r>
               <w:rPr>
-                <w:sz w:val="18"/>
-              </w:rPr>
-              <w:t>Stage A stubs shipped earlier. SendpOutboundRx wired to AAMix Stage B.5. SendpOutboundTx pending Stage C ilv.c port. SendpOutboundTCIRxIQ + SendpInboundTCITxAudio stubs only.</w:t>
+                <w:b/>
+                <w:sz w:val="18"/>
+              </w:rPr>
+              <w:t>P0.a `e0c0f4a` 2026-06-09.</w:t>
+            </w:r>
+            <w:r>
+              <w:rPr>
+                <w:sz w:val="18"/>
+              </w:rPr>
+              <w:t xml:space="preserve"> The single operator-approved linkage seam: fn-ptr table carrying the WDSP exports' exact names, resolved once from the loaded wdsp.dll. PureSignal entry family complete (verified vs dumpbin). RESAMPLE-typed + </w:t>
+            </w:r>
+            <w:r>
+              <w:rPr>
+                <w:rFonts w:ascii="Consolas" w:hAnsi="Consolas"/>
+                <w:sz w:val="18"/>
+              </w:rPr>
+              <w:t>flush_resample</w:t>
+            </w:r>
+            <w:r>
+              <w:rPr>
+                <w:sz w:val="18"/>
+              </w:rPr>
+              <w:t xml:space="preserve"> added at P0.c.</w:t>
             </w:r>
           </w:p>
         </w:tc>
@@ -1051,7 +1090,13 @@
                 <w:rFonts w:ascii="Consolas" w:hAnsi="Consolas"/>
                 <w:sz w:val="18"/>
               </w:rPr>
-              <w:t>ChannelMaster\cmaster.c::create_xmtr</w:t>
+              <w:t>ChannelMaster\cmcomm.h</w:t>
+            </w:r>
+            <w:r>
+              <w:rPr>
+                <w:sz w:val="18"/>
+              </w:rPr>
+              <w:t xml:space="preserve"> (family common header)</w:t>
             </w:r>
           </w:p>
         </w:tc>
@@ -1070,7 +1115,13 @@
                 <w:rFonts w:ascii="Consolas" w:hAnsi="Consolas"/>
                 <w:sz w:val="18"/>
               </w:rPr>
-              <w:t>src/wdsp/TxChannel.{h,cpp}</w:t>
+              <w:t>src/wire/cmcomm.{h,cpp}</w:t>
+            </w:r>
+            <w:r>
+              <w:rPr>
+                <w:sz w:val="18"/>
+              </w:rPr>
+              <w:t xml:space="preserve"> (P0.b → P0.d)</w:t>
             </w:r>
           </w:p>
         </w:tc>
@@ -1088,7 +1139,7 @@
               <w:rPr>
                 <w:sz w:val="18"/>
               </w:rPr>
-              <w:t>🟡</w:t>
+              <w:t>✅</w:t>
             </w:r>
           </w:p>
         </w:tc>
@@ -1104,35 +1155,29 @@
             </w:r>
             <w:r>
               <w:rPr>
-                <w:sz w:val="18"/>
-              </w:rPr>
-              <w:t xml:space="preserve">TxChannel class shipped on </w:t>
-            </w:r>
-            <w:r>
-              <w:rPr>
                 <w:rFonts w:ascii="Consolas" w:hAnsi="Consolas"/>
                 <w:sz w:val="18"/>
               </w:rPr>
-              <w:t>main</w:t>
-            </w:r>
-            <w:r>
-              <w:rPr>
-                <w:sz w:val="18"/>
-              </w:rPr>
-              <w:t xml:space="preserve"> (TX-1 components 2-6); needs verify-against-reference pass to confirm parameter parity (the 2026-05-30 </w:t>
+              <w:t>complex</w:t>
+            </w:r>
+            <w:r>
+              <w:rPr>
+                <w:sz w:val="18"/>
+              </w:rPr>
+              <w:t xml:space="preserve"> typedef + PORT + verbatim malloc0 (wdsp/utilities.c:37-43) + PI + the reference include surface. P0.d added the opaque verbatim twin typedefs for deferred-subsystem types (ANB/NOB/EER/VOX/TXGAIN/ANALYZERS) + the umbrella-mapping note (.cpp files include explicit family headers — an include-list umbrella would be circular under </w:t>
             </w:r>
             <w:r>
               <w:rPr>
                 <w:rFonts w:ascii="Consolas" w:hAnsi="Consolas"/>
                 <w:sz w:val="18"/>
               </w:rPr>
-              <w:t>fexchange0</w:t>
-            </w:r>
-            <w:r>
-              <w:rPr>
-                <w:sz w:val="18"/>
-              </w:rPr>
-              <w:t xml:space="preserve"> arc forced an in-line reconciliation but TxChannel hasn't been formally registered as a direct-port).</w:t>
+              <w:t>#pragma once</w:t>
+            </w:r>
+            <w:r>
+              <w:rPr>
+                <w:sz w:val="18"/>
+              </w:rPr>
+              <w:t>).</w:t>
             </w:r>
           </w:p>
         </w:tc>
@@ -1178,13 +1223,13 @@
                 <w:rFonts w:ascii="Consolas" w:hAnsi="Consolas"/>
                 <w:sz w:val="18"/>
               </w:rPr>
-              <w:t>src/wdsp/Ilv.{h,cpp}</w:t>
-            </w:r>
-            <w:r>
-              <w:rPr>
-                <w:sz w:val="18"/>
-              </w:rPr>
-              <w:t xml:space="preserve"> (NEW, Stage C candidate)</w:t>
+              <w:t>src/wire/ILV.{h,cpp}</w:t>
+            </w:r>
+            <w:r>
+              <w:rPr>
+                <w:sz w:val="18"/>
+              </w:rPr>
+              <w:t xml:space="preserve"> (P0.b)</w:t>
             </w:r>
           </w:p>
         </w:tc>
@@ -1202,7 +1247,7 @@
               <w:rPr>
                 <w:sz w:val="18"/>
               </w:rPr>
-              <w:t>⏸</w:t>
+              <w:t>✅</w:t>
             </w:r>
           </w:p>
         </w:tc>
@@ -1218,9 +1263,55 @@
             </w:r>
             <w:r>
               <w:rPr>
-                <w:sz w:val="18"/>
-              </w:rPr>
-              <w:t>Pairs with the SendpOutboundTx stub already wired in CMaster Stage A. Required for the TX I/Q path to reach the EP2 packer reference-faithfully.</w:t>
+                <w:b/>
+                <w:sz w:val="18"/>
+              </w:rPr>
+              <w:t>P0.b `1f49d98` 2026-06-11.</w:t>
+            </w:r>
+            <w:r>
+              <w:rPr>
+                <w:sz w:val="18"/>
+              </w:rPr>
+              <w:t xml:space="preserve"> VERBATIM direct port (</w:t>
+            </w:r>
+            <w:r>
+              <w:rPr>
+                <w:rFonts w:ascii="Consolas" w:hAnsi="Consolas"/>
+                <w:sz w:val="18"/>
+              </w:rPr>
+              <w:t>ilv,*ILV</w:t>
+            </w:r>
+            <w:r>
+              <w:rPr>
+                <w:sz w:val="18"/>
+              </w:rPr>
+              <w:t xml:space="preserve"> twin typedef, raw Outbound fn ptr, </w:t>
+            </w:r>
+            <w:r>
+              <w:rPr>
+                <w:rFonts w:ascii="Consolas" w:hAnsi="Consolas"/>
+                <w:sz w:val="18"/>
+              </w:rPr>
+              <w:t>pcm-&gt;xmtr[].pilv</w:t>
+            </w:r>
+            <w:r>
+              <w:rPr>
+                <w:sz w:val="18"/>
+              </w:rPr>
+              <w:t xml:space="preserve"> setters, malloc0/_aligned_free). Mechanical diff vs ilv.{h,c} = whitespace-only. The earlier </w:t>
+            </w:r>
+            <w:r>
+              <w:rPr>
+                <w:rFonts w:ascii="Consolas" w:hAnsi="Consolas"/>
+                <w:sz w:val="18"/>
+              </w:rPr>
+              <w:t>src/wdsp/ILV</w:t>
+            </w:r>
+            <w:r>
+              <w:rPr>
+                <w:sz w:val="18"/>
+              </w:rPr>
+              <w:t xml:space="preserve"> retrofit + its pilv[] bank are retired. scratch/test_ilv ALL PASS.</w:t>
             </w:r>
           </w:p>
         </w:tc>
@@ -1241,13 +1332,13 @@
                 <w:rFonts w:ascii="Consolas" w:hAnsi="Consolas"/>
                 <w:sz w:val="18"/>
               </w:rPr>
-              <w:t>ChannelMaster\cmaster.c::xcmaster</w:t>
-            </w:r>
-            <w:r>
-              <w:rPr>
-                <w:sz w:val="18"/>
-              </w:rPr>
-              <w:t xml:space="preserve"> (pump body)</w:t>
+              <w:t>ChannelMaster\cmbuffs.{h,c}</w:t>
+            </w:r>
+            <w:r>
+              <w:rPr>
+                <w:sz w:val="18"/>
+              </w:rPr>
+              <w:t xml:space="preserve"> (CMB ring + cm_main pump)</w:t>
             </w:r>
           </w:p>
         </w:tc>
@@ -1266,13 +1357,13 @@
                 <w:rFonts w:ascii="Consolas" w:hAnsi="Consolas"/>
                 <w:sz w:val="18"/>
               </w:rPr>
-              <w:t>src/wire/CMaster.cpp::xcmaster</w:t>
-            </w:r>
-            <w:r>
-              <w:rPr>
-                <w:sz w:val="18"/>
-              </w:rPr>
-              <w:t xml:space="preserve"> (NEW, Stage D candidate)</w:t>
+              <w:t>src/wire/CmBuffs.{h,cpp}</w:t>
+            </w:r>
+            <w:r>
+              <w:rPr>
+                <w:sz w:val="18"/>
+              </w:rPr>
+              <w:t xml:space="preserve"> (P0.d)</w:t>
             </w:r>
           </w:p>
         </w:tc>
@@ -1290,7 +1381,7 @@
               <w:rPr>
                 <w:sz w:val="18"/>
               </w:rPr>
-              <w:t>⏸</w:t>
+              <w:t>🟡</w:t>
             </w:r>
           </w:p>
         </w:tc>
@@ -1306,9 +1397,55 @@
             </w:r>
             <w:r>
               <w:rPr>
-                <w:sz w:val="18"/>
-              </w:rPr>
-              <w:t>Currently Lyra-cpp uses its own pump driver. Direct port would replace the Lyra-native driver loop.</w:t>
+                <w:b/>
+                <w:sz w:val="18"/>
+              </w:rPr>
+              <w:t>P0.d `afc7950` 2026-06-12.</w:t>
+            </w:r>
+            <w:r>
+              <w:rPr>
+                <w:sz w:val="18"/>
+              </w:rPr>
+              <w:t xml:space="preserve"> VERBATIM rewrite (</w:t>
+            </w:r>
+            <w:r>
+              <w:rPr>
+                <w:rFonts w:ascii="Consolas" w:hAnsi="Consolas"/>
+                <w:sz w:val="18"/>
+              </w:rPr>
+              <w:t>cmb,*CMB</w:t>
+            </w:r>
+            <w:r>
+              <w:rPr>
+                <w:sz w:val="18"/>
+              </w:rPr>
+              <w:t xml:space="preserve">, </w:t>
+            </w:r>
+            <w:r>
+              <w:rPr>
+                <w:rFonts w:ascii="Consolas" w:hAnsi="Consolas"/>
+                <w:sz w:val="18"/>
+              </w:rPr>
+              <w:t>#define CMB_MULT (3)</w:t>
+            </w:r>
+            <w:r>
+              <w:rPr>
+                <w:sz w:val="18"/>
+              </w:rPr>
+              <w:t xml:space="preserve">, malloc0/_aligned_free; the Phase-C retrofit's calloc/intptr_t/guard deviations removed; </w:t>
+            </w:r>
+            <w:r>
+              <w:rPr>
+                <w:rFonts w:ascii="Consolas" w:hAnsi="Consolas"/>
+                <w:sz w:val="18"/>
+              </w:rPr>
+              <w:t>pcm-&gt;in[]</w:t>
+            </w:r>
+            <w:r>
+              <w:rPr>
+                <w:sz w:val="18"/>
+              </w:rPr>
+              <w:t xml:space="preserve"> alloc moved back to create_cmaster per reference). Mechanical diff = whitespace-only. 🟡 pending the P0.d operator HL2 RX-regression bench.</w:t>
             </w:r>
           </w:p>
         </w:tc>
@@ -1329,13 +1466,13 @@
                 <w:rFonts w:ascii="Consolas" w:hAnsi="Consolas"/>
                 <w:sz w:val="18"/>
               </w:rPr>
-              <w:t>ChannelMaster\networkproto1.c</w:t>
-            </w:r>
-            <w:r>
-              <w:rPr>
-                <w:sz w:val="18"/>
-              </w:rPr>
-              <w:t xml:space="preserve"> (HL2 wire writer)</w:t>
+              <w:t>ChannelMaster\cmsetup.{h,c}</w:t>
+            </w:r>
+            <w:r>
+              <w:rPr>
+                <w:sz w:val="18"/>
+              </w:rPr>
+              <w:t xml:space="preserve"> (radio structure + id helpers)</w:t>
             </w:r>
           </w:p>
         </w:tc>
@@ -1354,26 +1491,13 @@
                 <w:rFonts w:ascii="Consolas" w:hAnsi="Consolas"/>
                 <w:sz w:val="18"/>
               </w:rPr>
-              <w:t>src/hl2_stream.cpp</w:t>
-            </w:r>
-            <w:r>
-              <w:rPr>
-                <w:sz w:val="18"/>
-              </w:rPr>
-              <w:t xml:space="preserve"> (LIVE) + </w:t>
-            </w:r>
-            <w:r>
-              <w:rPr>
-                <w:rFonts w:ascii="Consolas" w:hAnsi="Consolas"/>
-                <w:sz w:val="18"/>
-              </w:rPr>
-              <w:t>src/wire/*</w:t>
-            </w:r>
-            <w:r>
-              <w:rPr>
-                <w:sz w:val="18"/>
-              </w:rPr>
-              <w:t xml:space="preserve"> (Step 14 pieces)</w:t>
+              <w:t>src/wire/cmsetup.{h,cpp}</w:t>
+            </w:r>
+            <w:r>
+              <w:rPr>
+                <w:sz w:val="18"/>
+              </w:rPr>
+              <w:t xml:space="preserve"> (P0.d, NEW)</w:t>
             </w:r>
           </w:p>
         </w:tc>
@@ -1407,22 +1531,16 @@
             </w:r>
             <w:r>
               <w:rPr>
-                <w:sz w:val="18"/>
-              </w:rPr>
-              <w:t xml:space="preserve">This is the file the Step 14 plan was attacking. Currently a MIX of Step 14 Lyra-native rewrites + the original </w:t>
-            </w:r>
-            <w:r>
-              <w:rPr>
-                <w:rFonts w:ascii="Consolas" w:hAnsi="Consolas"/>
-                <w:sz w:val="18"/>
-              </w:rPr>
-              <w:t>hl2_stream.cpp</w:t>
-            </w:r>
-            <w:r>
-              <w:rPr>
-                <w:sz w:val="18"/>
-              </w:rPr>
-              <w:t xml:space="preserve"> body. Direct-port verdict pending operator decision (see "Open questions" below).</w:t>
+                <w:b/>
+                <w:sz w:val="18"/>
+              </w:rPr>
+              <w:t>P0.d `afc7950`.</w:t>
+            </w:r>
+            <w:r>
+              <w:rPr>
+                <w:sz w:val="18"/>
+              </w:rPr>
+              <w:t xml:space="preserve"> VERBATIM: cmMAX* sizing macros (16/4/4/2/32), rxid/txid/sp0id/stype/chid/inid/mixinid/getbuffsize, SetRadioStructure + set_cmdefault_rates. main.cpp config: SetRadioStructure(2,1,1,1,0,…) → chid(0,0)=0 RX1 / chid(1,0)=1 TX matches the live channel layout. 🟡 pending the same bench.</w:t>
             </w:r>
           </w:p>
         </w:tc>
@@ -1443,13 +1561,13 @@
                 <w:rFonts w:ascii="Consolas" w:hAnsi="Consolas"/>
                 <w:sz w:val="18"/>
               </w:rPr>
-              <w:t>ChannelMaster\network.c</w:t>
-            </w:r>
-            <w:r>
-              <w:rPr>
-                <w:sz w:val="18"/>
-              </w:rPr>
-              <w:t xml:space="preserve"> (UDP + keepalive)</w:t>
+              <w:t>ChannelMaster\cmaster.{h,c}</w:t>
+            </w:r>
+            <w:r>
+              <w:rPr>
+                <w:sz w:val="18"/>
+              </w:rPr>
+              <w:t xml:space="preserve"> (FULL: struct + create/destroy + xcmaster + setters)</w:t>
             </w:r>
           </w:p>
         </w:tc>
@@ -1468,20 +1586,13 @@
                 <w:rFonts w:ascii="Consolas" w:hAnsi="Consolas"/>
                 <w:sz w:val="18"/>
               </w:rPr>
-              <w:t>src/wire/Ep2SendThread.{h,cpp}</w:t>
-            </w:r>
-            <w:r>
-              <w:rPr>
-                <w:sz w:val="18"/>
-              </w:rPr>
-              <w:t xml:space="preserve"> + </w:t>
-            </w:r>
-            <w:r>
-              <w:rPr>
-                <w:rFonts w:ascii="Consolas" w:hAnsi="Consolas"/>
-                <w:sz w:val="18"/>
-              </w:rPr>
-              <w:t>src/wire/Ep6RecvThread.{h,cpp}</w:t>
+              <w:t>src/wire/CMaster.{h,cpp}</w:t>
+            </w:r>
+            <w:r>
+              <w:rPr>
+                <w:sz w:val="18"/>
+              </w:rPr>
+              <w:t xml:space="preserve"> (P0.d)</w:t>
             </w:r>
           </w:p>
         </w:tc>
@@ -1515,9 +1626,107 @@
             </w:r>
             <w:r>
               <w:rPr>
-                <w:sz w:val="18"/>
-              </w:rPr>
-              <w:t>Step 14 Lyra-native rewrites shipped (§5/§6); could be re-ported direct from reference, OR left as-is if reference-parity audit passes. Operator call.</w:t>
+                <w:b/>
+                <w:sz w:val="18"/>
+              </w:rPr>
+              <w:t>P0.d `afc7950`.</w:t>
+            </w:r>
+            <w:r>
+              <w:rPr>
+                <w:sz w:val="18"/>
+              </w:rPr>
+              <w:t xml:space="preserve"> VERBATIM rewrite: full </w:t>
+            </w:r>
+            <w:r>
+              <w:rPr>
+                <w:rFonts w:ascii="Consolas" w:hAnsi="Consolas"/>
+                <w:sz w:val="18"/>
+              </w:rPr>
+              <w:t>_cmaster</w:t>
+            </w:r>
+            <w:r>
+              <w:rPr>
+                <w:sz w:val="18"/>
+              </w:rPr>
+              <w:t xml:space="preserve"> struct (cmaster.h:39-99 incl. the PS surface — out[3]/panalalloc/pgain/peer), </w:t>
+            </w:r>
+            <w:r>
+              <w:rPr>
+                <w:rFonts w:ascii="Consolas" w:hAnsi="Consolas"/>
+                <w:sz w:val="18"/>
+              </w:rPr>
+              <w:t>cmaster,*CMASTER</w:t>
+            </w:r>
+            <w:r>
+              <w:rPr>
+                <w:sz w:val="18"/>
+              </w:rPr>
+              <w:t xml:space="preserve">, raw TCI callback fn ptrs, </w:t>
+            </w:r>
+            <w:r>
+              <w:rPr>
+                <w:rFonts w:ascii="Consolas" w:hAnsi="Consolas"/>
+                <w:sz w:val="18"/>
+              </w:rPr>
+              <w:t>enum AudioCODEC</w:t>
+            </w:r>
+            <w:r>
+              <w:rPr>
+                <w:sz w:val="18"/>
+              </w:rPr>
+              <w:t xml:space="preserve">, </w:t>
+            </w:r>
+            <w:r>
+              <w:rPr>
+                <w:rFonts w:ascii="Consolas" w:hAnsi="Consolas"/>
+                <w:sz w:val="18"/>
+              </w:rPr>
+              <w:t>cm = {0}</w:t>
+            </w:r>
+            <w:r>
+              <w:rPr>
+                <w:sz w:val="18"/>
+              </w:rPr>
+              <w:t xml:space="preserve">. Verbatim no-arg create_xmtr/destroy_xmtr (out[0..2] malloc0 + OpenChannel(ch 1) + XCreateAnalyzer(TX disp 1) + create_ilv through the wdspcalls seam — </w:t>
+            </w:r>
+            <w:r>
+              <w:rPr>
+                <w:b/>
+                <w:sz w:val="18"/>
+              </w:rPr>
+              <w:t>the TxChannel RAII carve-out is DELETED</w:t>
+            </w:r>
+            <w:r>
+              <w:rPr>
+                <w:sz w:val="18"/>
+              </w:rPr>
+              <w:t xml:space="preserve">, </w:t>
+            </w:r>
+            <w:r>
+              <w:rPr>
+                <w:rFonts w:ascii="Consolas" w:hAnsi="Consolas"/>
+                <w:sz w:val="18"/>
+              </w:rPr>
+              <w:t>src/wdsp/TxChannel.{h,cpp}</w:t>
+            </w:r>
+            <w:r>
+              <w:rPr>
+                <w:sz w:val="18"/>
+              </w:rPr>
+              <w:t xml:space="preserve"> retired). create_cmaster/destroy_cmaster verbatim per-stream loops (update[] CS + cmbuffs + in[] for all cmSTREAM streams). xcmaster verbatim (update[] CS restored, real stype/txid/chid, TCI memset restored; fexchange0 + monitor xMixAudio + xilv live). All Sendp*/Set* setters ported. Deferred subsystem lines (dexp/anti-vox/txgain/eer/sidetone/pipe/cmasio/analyzers.c/create_rcvr-body) carried IN PLACE as reference text with DEFERRED tags. Sole code accommodation: </w:t>
+            </w:r>
+            <w:r>
+              <w:rPr>
+                <w:rFonts w:ascii="Consolas" w:hAnsi="Consolas"/>
+                <w:sz w:val="18"/>
+              </w:rPr>
+              <w:t>(char*)""</w:t>
+            </w:r>
+            <w:r>
+              <w:rPr>
+                <w:sz w:val="18"/>
+              </w:rPr>
+              <w:t xml:space="preserve"> at XCreateAnalyzer. 🟡 pending the P0.d bench.</w:t>
             </w:r>
           </w:p>
         </w:tc>
@@ -1538,7 +1747,13 @@
                 <w:rFonts w:ascii="Consolas" w:hAnsi="Consolas"/>
                 <w:sz w:val="18"/>
               </w:rPr>
-              <w:t>ChannelMaster\netInterface.c::create_rnet</w:t>
+              <w:t>ChannelMaster\obbuffs.c</w:t>
+            </w:r>
+            <w:r>
+              <w:rPr>
+                <w:sz w:val="18"/>
+              </w:rPr>
+              <w:t xml:space="preserve"> (TX-out ring/seam)</w:t>
             </w:r>
           </w:p>
         </w:tc>
@@ -1557,13 +1772,13 @@
                 <w:rFonts w:ascii="Consolas" w:hAnsi="Consolas"/>
                 <w:sz w:val="18"/>
               </w:rPr>
-              <w:t>src/wire/RadioNet.cpp::create_rnet</w:t>
-            </w:r>
-            <w:r>
-              <w:rPr>
-                <w:sz w:val="18"/>
-              </w:rPr>
-              <w:t xml:space="preserve"> (LIVE)</w:t>
+              <w:t>src/wire/ObBuffs.{h,cpp}</w:t>
+            </w:r>
+            <w:r>
+              <w:rPr>
+                <w:sz w:val="18"/>
+              </w:rPr>
+              <w:t xml:space="preserve"> (P1, NEW)</w:t>
             </w:r>
           </w:p>
         </w:tc>
@@ -1581,7 +1796,7 @@
               <w:rPr>
                 <w:sz w:val="18"/>
               </w:rPr>
-              <w:t>✅</w:t>
+              <w:t>⏸</w:t>
             </w:r>
           </w:p>
         </w:tc>
@@ -1597,6 +1812,304 @@
             </w:r>
             <w:r>
               <w:rPr>
+                <w:b/>
+                <w:sz w:val="18"/>
+              </w:rPr>
+              <w:t>P1 — NEXT after the P0.d bench gate.</w:t>
+            </w:r>
+            <w:r>
+              <w:rPr>
+                <w:sz w:val="18"/>
+              </w:rPr>
+              <w:t xml:space="preserve"> The TX-out seam (OutBound/obdata/ob_main/sendOutbound consumer side). SEPARATE TU from cmbuffs (which is inbound-only).</w:t>
+            </w:r>
+          </w:p>
+        </w:tc>
+      </w:tr>
+      <w:tr>
+        <w:tc>
+          <w:tcPr>
+            <w:tcW w:type="dxa" w:w="2556"/>
+          </w:tcPr>
+          <w:p>
+            <w:r>
+              <w:rPr>
+                <w:sz w:val="18"/>
+              </w:rPr>
+            </w:r>
+            <w:r>
+              <w:rPr>
+                <w:rFonts w:ascii="Consolas" w:hAnsi="Consolas"/>
+                <w:sz w:val="18"/>
+              </w:rPr>
+              <w:t>ChannelMaster\networkproto1.c</w:t>
+            </w:r>
+            <w:r>
+              <w:rPr>
+                <w:sz w:val="18"/>
+              </w:rPr>
+              <w:t xml:space="preserve"> (HL2 wire writer)</w:t>
+            </w:r>
+          </w:p>
+        </w:tc>
+        <w:tc>
+          <w:tcPr>
+            <w:tcW w:type="dxa" w:w="2556"/>
+          </w:tcPr>
+          <w:p>
+            <w:r>
+              <w:rPr>
+                <w:sz w:val="18"/>
+              </w:rPr>
+            </w:r>
+            <w:r>
+              <w:rPr>
+                <w:rFonts w:ascii="Consolas" w:hAnsi="Consolas"/>
+                <w:sz w:val="18"/>
+              </w:rPr>
+              <w:t>src/hl2_stream.cpp</w:t>
+            </w:r>
+            <w:r>
+              <w:rPr>
+                <w:sz w:val="18"/>
+              </w:rPr>
+              <w:t xml:space="preserve"> (LIVE) + </w:t>
+            </w:r>
+            <w:r>
+              <w:rPr>
+                <w:rFonts w:ascii="Consolas" w:hAnsi="Consolas"/>
+                <w:sz w:val="18"/>
+              </w:rPr>
+              <w:t>src/wire/*</w:t>
+            </w:r>
+            <w:r>
+              <w:rPr>
+                <w:sz w:val="18"/>
+              </w:rPr>
+              <w:t xml:space="preserve"> (Step 14 pieces)</w:t>
+            </w:r>
+          </w:p>
+        </w:tc>
+        <w:tc>
+          <w:tcPr>
+            <w:tcW w:type="dxa" w:w="2556"/>
+          </w:tcPr>
+          <w:p>
+            <w:r>
+              <w:rPr>
+                <w:sz w:val="18"/>
+              </w:rPr>
+            </w:r>
+            <w:r>
+              <w:rPr>
+                <w:sz w:val="18"/>
+              </w:rPr>
+              <w:t>🟡</w:t>
+            </w:r>
+          </w:p>
+        </w:tc>
+        <w:tc>
+          <w:tcPr>
+            <w:tcW w:type="dxa" w:w="2556"/>
+          </w:tcPr>
+          <w:p>
+            <w:r>
+              <w:rPr>
+                <w:sz w:val="18"/>
+              </w:rPr>
+            </w:r>
+            <w:r>
+              <w:rPr>
+                <w:sz w:val="18"/>
+              </w:rPr>
+              <w:t xml:space="preserve">This is the file the Step 14 plan was attacking. Currently a MIX of Step 14 Lyra-native rewrites + the original </w:t>
+            </w:r>
+            <w:r>
+              <w:rPr>
+                <w:rFonts w:ascii="Consolas" w:hAnsi="Consolas"/>
+                <w:sz w:val="18"/>
+              </w:rPr>
+              <w:t>hl2_stream.cpp</w:t>
+            </w:r>
+            <w:r>
+              <w:rPr>
+                <w:sz w:val="18"/>
+              </w:rPr>
+              <w:t xml:space="preserve"> body. P2 = sendOutbound/sendProtocol1Samples fidelity audit of the dormant wire layer; P4 = Wire-LIVE switchover (one commit, full HL2 bench gate).</w:t>
+            </w:r>
+          </w:p>
+        </w:tc>
+      </w:tr>
+      <w:tr>
+        <w:tc>
+          <w:tcPr>
+            <w:tcW w:type="dxa" w:w="2556"/>
+          </w:tcPr>
+          <w:p>
+            <w:r>
+              <w:rPr>
+                <w:sz w:val="18"/>
+              </w:rPr>
+            </w:r>
+            <w:r>
+              <w:rPr>
+                <w:rFonts w:ascii="Consolas" w:hAnsi="Consolas"/>
+                <w:sz w:val="18"/>
+              </w:rPr>
+              <w:t>ChannelMaster\network.c</w:t>
+            </w:r>
+            <w:r>
+              <w:rPr>
+                <w:sz w:val="18"/>
+              </w:rPr>
+              <w:t xml:space="preserve"> (UDP + keepalive)</w:t>
+            </w:r>
+          </w:p>
+        </w:tc>
+        <w:tc>
+          <w:tcPr>
+            <w:tcW w:type="dxa" w:w="2556"/>
+          </w:tcPr>
+          <w:p>
+            <w:r>
+              <w:rPr>
+                <w:sz w:val="18"/>
+              </w:rPr>
+            </w:r>
+            <w:r>
+              <w:rPr>
+                <w:rFonts w:ascii="Consolas" w:hAnsi="Consolas"/>
+                <w:sz w:val="18"/>
+              </w:rPr>
+              <w:t>src/wire/Ep2SendThread.{h,cpp}</w:t>
+            </w:r>
+            <w:r>
+              <w:rPr>
+                <w:sz w:val="18"/>
+              </w:rPr>
+              <w:t xml:space="preserve"> + </w:t>
+            </w:r>
+            <w:r>
+              <w:rPr>
+                <w:rFonts w:ascii="Consolas" w:hAnsi="Consolas"/>
+                <w:sz w:val="18"/>
+              </w:rPr>
+              <w:t>src/wire/Ep6RecvThread.{h,cpp}</w:t>
+            </w:r>
+          </w:p>
+        </w:tc>
+        <w:tc>
+          <w:tcPr>
+            <w:tcW w:type="dxa" w:w="2556"/>
+          </w:tcPr>
+          <w:p>
+            <w:r>
+              <w:rPr>
+                <w:sz w:val="18"/>
+              </w:rPr>
+            </w:r>
+            <w:r>
+              <w:rPr>
+                <w:sz w:val="18"/>
+              </w:rPr>
+              <w:t>🟡</w:t>
+            </w:r>
+          </w:p>
+        </w:tc>
+        <w:tc>
+          <w:tcPr>
+            <w:tcW w:type="dxa" w:w="2556"/>
+          </w:tcPr>
+          <w:p>
+            <w:r>
+              <w:rPr>
+                <w:sz w:val="18"/>
+              </w:rPr>
+            </w:r>
+            <w:r>
+              <w:rPr>
+                <w:sz w:val="18"/>
+              </w:rPr>
+              <w:t>Step 14 Lyra-native rewrites shipped (§5/§6); could be re-ported direct from reference, OR left as-is if reference-parity audit passes. Operator call (folds into P2/P4).</w:t>
+            </w:r>
+          </w:p>
+        </w:tc>
+      </w:tr>
+      <w:tr>
+        <w:tc>
+          <w:tcPr>
+            <w:tcW w:type="dxa" w:w="2556"/>
+          </w:tcPr>
+          <w:p>
+            <w:r>
+              <w:rPr>
+                <w:sz w:val="18"/>
+              </w:rPr>
+            </w:r>
+            <w:r>
+              <w:rPr>
+                <w:rFonts w:ascii="Consolas" w:hAnsi="Consolas"/>
+                <w:sz w:val="18"/>
+              </w:rPr>
+              <w:t>ChannelMaster\netInterface.c::create_rnet</w:t>
+            </w:r>
+          </w:p>
+        </w:tc>
+        <w:tc>
+          <w:tcPr>
+            <w:tcW w:type="dxa" w:w="2556"/>
+          </w:tcPr>
+          <w:p>
+            <w:r>
+              <w:rPr>
+                <w:sz w:val="18"/>
+              </w:rPr>
+            </w:r>
+            <w:r>
+              <w:rPr>
+                <w:rFonts w:ascii="Consolas" w:hAnsi="Consolas"/>
+                <w:sz w:val="18"/>
+              </w:rPr>
+              <w:t>src/wire/RadioNet.cpp::create_rnet</w:t>
+            </w:r>
+            <w:r>
+              <w:rPr>
+                <w:sz w:val="18"/>
+              </w:rPr>
+              <w:t xml:space="preserve"> (LIVE)</w:t>
+            </w:r>
+          </w:p>
+        </w:tc>
+        <w:tc>
+          <w:tcPr>
+            <w:tcW w:type="dxa" w:w="2556"/>
+          </w:tcPr>
+          <w:p>
+            <w:r>
+              <w:rPr>
+                <w:sz w:val="18"/>
+              </w:rPr>
+            </w:r>
+            <w:r>
+              <w:rPr>
+                <w:sz w:val="18"/>
+              </w:rPr>
+              <w:t>✅</w:t>
+            </w:r>
+          </w:p>
+        </w:tc>
+        <w:tc>
+          <w:tcPr>
+            <w:tcW w:type="dxa" w:w="2556"/>
+          </w:tcPr>
+          <w:p>
+            <w:r>
+              <w:rPr>
+                <w:sz w:val="18"/>
+              </w:rPr>
+            </w:r>
+            <w:r>
+              <w:rPr>
                 <w:sz w:val="18"/>
               </w:rPr>
               <w:t xml:space="preserve">Direct port shipped earlier. The Stage-A SendpOutboundRx no-op stub at line 272 was DELETED 2026-06-08 (B.6.b-fix1, commit </w:t>
@@ -1612,20 +2125,7 @@
               <w:rPr>
                 <w:sz w:val="18"/>
               </w:rPr>
-              <w:t xml:space="preserve">) because it clobbered the AAMix wire-up; per the comment-block left in the deleted-case body, future codec-id switching for ASIO/WASAPI must NOT re-introduce a default registration here — it would re-clobber </w:t>
-            </w:r>
-            <w:r>
-              <w:rPr>
-                <w:rFonts w:ascii="Consolas" w:hAnsi="Consolas"/>
-                <w:sz w:val="18"/>
-              </w:rPr>
-              <w:t>aaMix_-&gt;Outbound</w:t>
-            </w:r>
-            <w:r>
-              <w:rPr>
-                <w:sz w:val="18"/>
-              </w:rPr>
-              <w:t>.</w:t>
+              <w:t>) because it clobbered the AAMix wire-up; future codec-id switching must NOT re-introduce a default registration here. P3 = the outbound registrations (SendpOutboundTx(OutBound) etc.) — MUST register AFTER create_xmtr (the verbatim setters have NO null guards, reference ordering).</w:t>
             </w:r>
           </w:p>
         </w:tc>
@@ -1734,7 +2234,7 @@
                 <w:rFonts w:ascii="Consolas" w:hAnsi="Consolas"/>
                 <w:sz w:val="18"/>
               </w:rPr>
-              <w:t>wdsp\aamix.{c,h}</w:t>
+              <w:t>ChannelMaster\aamix.{c,h}</w:t>
             </w:r>
           </w:p>
         </w:tc>
@@ -1753,7 +2253,13 @@
                 <w:rFonts w:ascii="Consolas" w:hAnsi="Consolas"/>
                 <w:sz w:val="18"/>
               </w:rPr>
-              <w:t>src/wdsp/AAMix.{h,cpp}</w:t>
+              <w:t>src/wire/AAMix.{h,cpp}</w:t>
+            </w:r>
+            <w:r>
+              <w:rPr>
+                <w:sz w:val="18"/>
+              </w:rPr>
+              <w:t xml:space="preserve"> (P0.c)</w:t>
             </w:r>
           </w:p>
         </w:tc>
@@ -1790,13 +2296,46 @@
                 <w:b/>
                 <w:sz w:val="18"/>
               </w:rPr>
-              <w:t>STAGE B COMPLETE 2026-06-08.</w:t>
-            </w:r>
-            <w:r>
-              <w:rPr>
-                <w:sz w:val="18"/>
-              </w:rPr>
-              <w:t xml:space="preserve"> Full direct port w/ NR0V/WDSP GPL v3+ attribution. 538-line header + 1100-line cpp. Bench-validated end-to-end through both AK4951 and PC-Soundcard sinks. Idiom translations documented (Win32 → C++23). Reference-faithful create_aamix(active=0) + SetAAudioMixState(activate) pattern per cmaster.c:297-313.</w:t>
+              <w:t>P0.c `e0f2584` 2026-06-11 — VERBATIM re-port</w:t>
+            </w:r>
+            <w:r>
+              <w:rPr>
+                <w:sz w:val="18"/>
+              </w:rPr>
+              <w:t xml:space="preserve"> (supersedes the 2026-06-08 Stage-B C++23-idiom translation, which the operator rejected as a deviation class). </w:t>
+            </w:r>
+            <w:r>
+              <w:rPr>
+                <w:rFonts w:ascii="Consolas" w:hAnsi="Consolas"/>
+                <w:sz w:val="18"/>
+              </w:rPr>
+              <w:t>aamix,*AAMIX</w:t>
+            </w:r>
+            <w:r>
+              <w:rPr>
+                <w:sz w:val="18"/>
+              </w:rPr>
+              <w:t xml:space="preserve"> twin typedef + anonymous slew struct, raw Outbound fn ptr, paamix[] bank private to the .cpp, Win32 primitives direct. Mechanical diff vs aamix.{h,c} = whitespace-only. </w:t>
+            </w:r>
+            <w:r>
+              <w:rPr>
+                <w:rFonts w:ascii="Consolas" w:hAnsi="Consolas"/>
+                <w:sz w:val="18"/>
+              </w:rPr>
+              <w:t>src/wire/resample.h</w:t>
+            </w:r>
+            <w:r>
+              <w:rPr>
+                <w:sz w:val="18"/>
+              </w:rPr>
+              <w:t xml:space="preserve"> = the public RESAMPLE ABI verbatim. WdspEngine RX wire-up: capturing lambda → static member fn + TU-scope context ptr (the reference free-fn+global shape). ✅ </w:t>
+            </w:r>
+            <w:r>
+              <w:rPr>
+                <w:b/>
+                <w:sz w:val="18"/>
+              </w:rPr>
+              <w:t>Operator HL2 RX bench PASSED 2026-06-11.</w:t>
             </w:r>
           </w:p>
         </w:tc>
@@ -2109,16 +2648,22 @@
             </w:r>
             <w:r>
               <w:rPr>
+                <w:sz w:val="18"/>
+              </w:rPr>
+              <w:t xml:space="preserve">(consumed via </w:t>
+            </w:r>
+            <w:r>
+              <w:rPr>
                 <w:rFonts w:ascii="Consolas" w:hAnsi="Consolas"/>
                 <w:sz w:val="18"/>
               </w:rPr>
-              <w:t>src/wdsp/TxChannel.{h,cpp}</w:t>
-            </w:r>
-            <w:r>
-              <w:rPr>
-                <w:sz w:val="18"/>
-              </w:rPr>
-              <w:t xml:space="preserve"> + cffi cdef</w:t>
+              <w:t>wire/wdspcalls</w:t>
+            </w:r>
+            <w:r>
+              <w:rPr>
+                <w:sz w:val="18"/>
+              </w:rPr>
+              <w:t xml:space="preserve"> seam — P0.a/P0.d)</w:t>
             </w:r>
           </w:p>
         </w:tc>
@@ -2136,7 +2681,7 @@
               <w:rPr>
                 <w:sz w:val="18"/>
               </w:rPr>
-              <w:t>🟡</w:t>
+              <w:t>✅</w:t>
             </w:r>
           </w:p>
         </w:tc>
@@ -2152,22 +2697,29 @@
             </w:r>
             <w:r>
               <w:rPr>
-                <w:sz w:val="18"/>
-              </w:rPr>
-              <w:t xml:space="preserve">TxChannel shipped on </w:t>
+                <w:b/>
+                <w:sz w:val="18"/>
+              </w:rPr>
+              <w:t>TxChannel class DELETED at P0.d `afc7950`</w:t>
+            </w:r>
+            <w:r>
+              <w:rPr>
+                <w:sz w:val="18"/>
+              </w:rPr>
+              <w:t xml:space="preserve"> — the verbatim create_xmtr in </w:t>
             </w:r>
             <w:r>
               <w:rPr>
                 <w:rFonts w:ascii="Consolas" w:hAnsi="Consolas"/>
                 <w:sz w:val="18"/>
               </w:rPr>
-              <w:t>main</w:t>
-            </w:r>
-            <w:r>
-              <w:rPr>
-                <w:sz w:val="18"/>
-              </w:rPr>
-              <w:t xml:space="preserve"> (TX-1 components). </w:t>
+              <w:t>wire/CMaster.cpp</w:t>
+            </w:r>
+            <w:r>
+              <w:rPr>
+                <w:sz w:val="18"/>
+              </w:rPr>
+              <w:t xml:space="preserve"> opens the WDSP TXA channel itself (OpenChannel/fexchange0/CloseChannel through the wdspcalls seam, cmaster.c:177-190 byte-exact), which removed the runtime-DLL RAII justification the class existed for. </w:t>
             </w:r>
             <w:r>
               <w:rPr>
@@ -2180,7 +2732,7 @@
               <w:rPr>
                 <w:sz w:val="18"/>
               </w:rPr>
-              <w:t xml:space="preserve"> carries 17 SetTXA*/GetTXAMeter cdefs. Reference-parity audit pass recommended for direct-port verdict.</w:t>
+              <w:t xml:space="preserve"> still carries the SetTXA*/GetTXAMeter cdefs for the operator-control surface.</w:t>
             </w:r>
           </w:p>
         </w:tc>
@@ -3883,8 +4435,26 @@
       </w:r>
     </w:p>
     <w:p>
+      <w:pPr>
+        <w:pStyle w:val="Heading3"/>
+      </w:pPr>
       <w:r>
-        <w:t>Each stage is one focused sub-arc (1+ commits) with an operator HL2 bench gate.  Earlier stages must complete before later stages start unless explicitly tagged "independent".</w:t>
+        <w:t>P0 verbatim-rewrite arc (2026-06-09 → current; the ACTIVE plan)</w:t>
+      </w:r>
+    </w:p>
+    <w:p>
+      <w:r>
+        <w:t xml:space="preserve">After the operator rejected the 2026-06-09 "rule-#8" retrofit deviations ("I said PORT!"), every TX-ported file is being rewritten VERBATIM (byte-faithful; only documented packaging differences — </w:t>
+      </w:r>
+      <w:r>
+        <w:rPr>
+          <w:rFonts w:ascii="Consolas" w:hAnsi="Consolas"/>
+          <w:sz w:val="18"/>
+        </w:rPr>
+        <w:t>lyra::wire</w:t>
+      </w:r>
+      <w:r>
+        <w:t xml:space="preserve"> namespace, PORT-expands-empty, the wdspcalls seam for the statically-linked WDSP exports).  Each step ships with a mechanical diff vs the reference + an operator HL2 bench gate.</w:t>
       </w:r>
     </w:p>
     <w:tbl>
@@ -3912,7 +4482,7 @@
                 <w:b/>
                 <w:sz w:val="18"/>
               </w:rPr>
-              <w:t>Stage</w:t>
+              <w:t>Step</w:t>
             </w:r>
           </w:p>
         </w:tc>
@@ -3960,7 +4530,7 @@
                 <w:b/>
                 <w:sz w:val="18"/>
               </w:rPr>
-              <w:t>Notes</w:t>
+              <w:t>Commit / gate</w:t>
             </w:r>
           </w:p>
         </w:tc>
@@ -3981,7 +4551,7 @@
                 <w:b/>
                 <w:sz w:val="18"/>
               </w:rPr>
-              <w:t>A</w:t>
+              <w:t>P0.a</w:t>
             </w:r>
           </w:p>
         </w:tc>
@@ -4015,9 +4585,16 @@
             </w:r>
             <w:r>
               <w:rPr>
-                <w:sz w:val="18"/>
-              </w:rPr>
-              <w:t>CMaster.cpp wire-up stubs (Send*Outbound* + SetTCIRun)</w:t>
+                <w:rFonts w:ascii="Consolas" w:hAnsi="Consolas"/>
+                <w:sz w:val="18"/>
+              </w:rPr>
+              <w:t>wire/wdspcalls.{h,cpp}</w:t>
+            </w:r>
+            <w:r>
+              <w:rPr>
+                <w:sz w:val="18"/>
+              </w:rPr>
+              <w:t xml:space="preserve"> — the single approved WDSP linkage seam (exact export names, PS entry family complete)</w:t>
             </w:r>
           </w:p>
         </w:tc>
@@ -4033,9 +4610,16 @@
             </w:r>
             <w:r>
               <w:rPr>
-                <w:sz w:val="18"/>
-              </w:rPr>
-              <w:t>Foundation that subsequent stages build on.</w:t>
+                <w:rFonts w:ascii="Consolas" w:hAnsi="Consolas"/>
+                <w:sz w:val="18"/>
+              </w:rPr>
+              <w:t>e0c0f4a</w:t>
+            </w:r>
+            <w:r>
+              <w:rPr>
+                <w:sz w:val="18"/>
+              </w:rPr>
+              <w:t xml:space="preserve"> 2026-06-09</w:t>
             </w:r>
           </w:p>
         </w:tc>
@@ -4056,7 +4640,7 @@
                 <w:b/>
                 <w:sz w:val="18"/>
               </w:rPr>
-              <w:t>B</w:t>
+              <w:t>P0.b</w:t>
             </w:r>
           </w:p>
         </w:tc>
@@ -4092,7 +4676,27 @@
               <w:rPr>
                 <w:sz w:val="18"/>
               </w:rPr>
-              <w:t>aamix.c direct port + wire into RX path</w:t>
+              <w:t xml:space="preserve">ilv.{h,c} verbatim → </w:t>
+            </w:r>
+            <w:r>
+              <w:rPr>
+                <w:rFonts w:ascii="Consolas" w:hAnsi="Consolas"/>
+                <w:sz w:val="18"/>
+              </w:rPr>
+              <w:t>wire/ILV.{h,cpp}</w:t>
+            </w:r>
+            <w:r>
+              <w:rPr>
+                <w:sz w:val="18"/>
+              </w:rPr>
+              <w:t xml:space="preserve"> + new </w:t>
+            </w:r>
+            <w:r>
+              <w:rPr>
+                <w:rFonts w:ascii="Consolas" w:hAnsi="Consolas"/>
+                <w:sz w:val="18"/>
+              </w:rPr>
+              <w:t>wire/cmcomm.{h,cpp}</w:t>
             </w:r>
           </w:p>
         </w:tc>
@@ -4108,29 +4712,16 @@
             </w:r>
             <w:r>
               <w:rPr>
-                <w:b/>
-                <w:sz w:val="18"/>
-              </w:rPr>
-              <w:t>Shipped 2026-06-08, bench-validated end-to-end through both AK4951 and PC-Soundcard sinks.</w:t>
-            </w:r>
-            <w:r>
-              <w:rPr>
-                <w:sz w:val="18"/>
-              </w:rPr>
-              <w:t xml:space="preserve"> Commits 27ac2fa → 7a50b07 on </w:t>
-            </w:r>
-            <w:r>
-              <w:rPr>
                 <w:rFonts w:ascii="Consolas" w:hAnsi="Consolas"/>
                 <w:sz w:val="18"/>
               </w:rPr>
-              <w:t>tx-rebuild</w:t>
-            </w:r>
-            <w:r>
-              <w:rPr>
-                <w:sz w:val="18"/>
-              </w:rPr>
-              <w:t>.</w:t>
+              <w:t>1f49d98</w:t>
+            </w:r>
+            <w:r>
+              <w:rPr>
+                <w:sz w:val="18"/>
+              </w:rPr>
+              <w:t xml:space="preserve"> 2026-06-11; test_ilv ALL PASS</w:t>
             </w:r>
           </w:p>
         </w:tc>
@@ -4151,7 +4742,7 @@
                 <w:b/>
                 <w:sz w:val="18"/>
               </w:rPr>
-              <w:t>C</w:t>
+              <w:t>P0.c</w:t>
             </w:r>
           </w:p>
         </w:tc>
@@ -4169,7 +4760,7 @@
               <w:rPr>
                 <w:sz w:val="18"/>
               </w:rPr>
-              <w:t>⏸ TBD</w:t>
+              <w:t>✅ DONE</w:t>
             </w:r>
           </w:p>
         </w:tc>
@@ -4187,7 +4778,33 @@
               <w:rPr>
                 <w:sz w:val="18"/>
               </w:rPr>
-              <w:t>ilv.c direct port (TX I/Q interleaver)</w:t>
+              <w:t xml:space="preserve">aamix.{h,c} verbatim → </w:t>
+            </w:r>
+            <w:r>
+              <w:rPr>
+                <w:rFonts w:ascii="Consolas" w:hAnsi="Consolas"/>
+                <w:sz w:val="18"/>
+              </w:rPr>
+              <w:t>wire/AAMix.{h,cpp}</w:t>
+            </w:r>
+            <w:r>
+              <w:rPr>
+                <w:sz w:val="18"/>
+              </w:rPr>
+              <w:t xml:space="preserve"> + </w:t>
+            </w:r>
+            <w:r>
+              <w:rPr>
+                <w:rFonts w:ascii="Consolas" w:hAnsi="Consolas"/>
+                <w:sz w:val="18"/>
+              </w:rPr>
+              <w:t>wire/resample.h</w:t>
+            </w:r>
+            <w:r>
+              <w:rPr>
+                <w:sz w:val="18"/>
+              </w:rPr>
+              <w:t xml:space="preserve"> RESAMPLE ABI</w:t>
             </w:r>
           </w:p>
         </w:tc>
@@ -4203,9 +4820,16 @@
             </w:r>
             <w:r>
               <w:rPr>
-                <w:sz w:val="18"/>
-              </w:rPr>
-              <w:t>Candidate next step. Pairs with the Stage-A SendpOutboundTx stub; required for the TX I/Q path to flow reference-faithfully into the EP2 packer. Ship pattern mirrors Stage B: header port w/ attribution → cpp port w/ idiom translations → wire-up at WdspEngine TX channel → operator HL2+ bench (TX I/Q on dummy load shows clean carrier at LO from a known mic input).</w:t>
+                <w:rFonts w:ascii="Consolas" w:hAnsi="Consolas"/>
+                <w:sz w:val="18"/>
+              </w:rPr>
+              <w:t>e0f2584</w:t>
+            </w:r>
+            <w:r>
+              <w:rPr>
+                <w:sz w:val="18"/>
+              </w:rPr>
+              <w:t>; ✅ operator HL2 RX bench PASSED 2026-06-11</w:t>
             </w:r>
           </w:p>
         </w:tc>
@@ -4226,7 +4850,7 @@
                 <w:b/>
                 <w:sz w:val="18"/>
               </w:rPr>
-              <w:t>D</w:t>
+              <w:t>P0.d</w:t>
             </w:r>
           </w:p>
         </w:tc>
@@ -4244,7 +4868,7 @@
               <w:rPr>
                 <w:sz w:val="18"/>
               </w:rPr>
-              <w:t>⏸ TBD</w:t>
+              <w:t>🟡 SHIPPED</w:t>
             </w:r>
           </w:p>
         </w:tc>
@@ -4262,7 +4886,59 @@
               <w:rPr>
                 <w:sz w:val="18"/>
               </w:rPr>
-              <w:t>xcmaster pump body direct port</w:t>
+              <w:t xml:space="preserve">cmbuffs/cmaster/cmsetup verbatim → </w:t>
+            </w:r>
+            <w:r>
+              <w:rPr>
+                <w:rFonts w:ascii="Consolas" w:hAnsi="Consolas"/>
+                <w:sz w:val="18"/>
+              </w:rPr>
+              <w:t>wire/CmBuffs</w:t>
+            </w:r>
+            <w:r>
+              <w:rPr>
+                <w:sz w:val="18"/>
+              </w:rPr>
+              <w:t>/</w:t>
+            </w:r>
+            <w:r>
+              <w:rPr>
+                <w:rFonts w:ascii="Consolas" w:hAnsi="Consolas"/>
+                <w:sz w:val="18"/>
+              </w:rPr>
+              <w:t>wire/CMaster</w:t>
+            </w:r>
+            <w:r>
+              <w:rPr>
+                <w:sz w:val="18"/>
+              </w:rPr>
+              <w:t>/</w:t>
+            </w:r>
+            <w:r>
+              <w:rPr>
+                <w:rFonts w:ascii="Consolas" w:hAnsi="Consolas"/>
+                <w:sz w:val="18"/>
+              </w:rPr>
+              <w:t>wire/cmsetup</w:t>
+            </w:r>
+            <w:r>
+              <w:rPr>
+                <w:sz w:val="18"/>
+              </w:rPr>
+              <w:t xml:space="preserve">; full </w:t>
+            </w:r>
+            <w:r>
+              <w:rPr>
+                <w:rFonts w:ascii="Consolas" w:hAnsi="Consolas"/>
+                <w:sz w:val="18"/>
+              </w:rPr>
+              <w:t>_cmaster</w:t>
+            </w:r>
+            <w:r>
+              <w:rPr>
+                <w:sz w:val="18"/>
+              </w:rPr>
+              <w:t xml:space="preserve"> struct (PS surface); TxChannel carve-out DELETED</w:t>
             </w:r>
           </w:p>
         </w:tc>
@@ -4278,9 +4954,23 @@
             </w:r>
             <w:r>
               <w:rPr>
-                <w:sz w:val="18"/>
-              </w:rPr>
-              <w:t>Replaces the current Lyra-native pump driver loop with the reference-verbatim version. Operator decision: do this OR keep the Lyra-native pump if reference-parity audit passes.</w:t>
+                <w:rFonts w:ascii="Consolas" w:hAnsi="Consolas"/>
+                <w:sz w:val="18"/>
+              </w:rPr>
+              <w:t>afc7950</w:t>
+            </w:r>
+            <w:r>
+              <w:rPr>
+                <w:sz w:val="18"/>
+              </w:rPr>
+              <w:t xml:space="preserve"> 2026-06-12; ⚠ </w:t>
+            </w:r>
+            <w:r>
+              <w:rPr>
+                <w:b/>
+                <w:sz w:val="18"/>
+              </w:rPr>
+              <w:t>operator HL2 RX-regression bench PENDING — the gate before P1</w:t>
             </w:r>
           </w:p>
         </w:tc>
@@ -4301,7 +4991,7 @@
                 <w:b/>
                 <w:sz w:val="18"/>
               </w:rPr>
-              <w:t>E</w:t>
+              <w:t>P1</w:t>
             </w:r>
           </w:p>
         </w:tc>
@@ -4319,7 +5009,7 @@
               <w:rPr>
                 <w:sz w:val="18"/>
               </w:rPr>
-              <w:t>⏸ TBD</w:t>
+              <w:t>⏸ NEXT</w:t>
             </w:r>
           </w:p>
         </w:tc>
@@ -4337,7 +5027,20 @@
               <w:rPr>
                 <w:sz w:val="18"/>
               </w:rPr>
-              <w:t>TxChannel reference-parity audit + reconciliation</w:t>
+              <w:t xml:space="preserve">obbuffs.c verbatim → </w:t>
+            </w:r>
+            <w:r>
+              <w:rPr>
+                <w:rFonts w:ascii="Consolas" w:hAnsi="Consolas"/>
+                <w:sz w:val="18"/>
+              </w:rPr>
+              <w:t>wire/ObBuffs.{h,cpp}</w:t>
+            </w:r>
+            <w:r>
+              <w:rPr>
+                <w:sz w:val="18"/>
+              </w:rPr>
+              <w:t xml:space="preserve"> (the TX-out seam; separate TU from cmbuffs)</w:t>
             </w:r>
           </w:p>
         </w:tc>
@@ -4355,46 +5058,729 @@
               <w:rPr>
                 <w:sz w:val="18"/>
               </w:rPr>
-              <w:t xml:space="preserve">TxChannel shipped on </w:t>
+              <w:t>after the P0.d bench</w:t>
+            </w:r>
+          </w:p>
+        </w:tc>
+      </w:tr>
+      <w:tr>
+        <w:tc>
+          <w:tcPr>
+            <w:tcW w:type="dxa" w:w="2556"/>
+          </w:tcPr>
+          <w:p>
+            <w:r>
+              <w:rPr>
+                <w:sz w:val="18"/>
+              </w:rPr>
+            </w:r>
+            <w:r>
+              <w:rPr>
+                <w:b/>
+                <w:sz w:val="18"/>
+              </w:rPr>
+              <w:t>P2</w:t>
+            </w:r>
+          </w:p>
+        </w:tc>
+        <w:tc>
+          <w:tcPr>
+            <w:tcW w:type="dxa" w:w="2556"/>
+          </w:tcPr>
+          <w:p>
+            <w:r>
+              <w:rPr>
+                <w:sz w:val="18"/>
+              </w:rPr>
+            </w:r>
+            <w:r>
+              <w:rPr>
+                <w:sz w:val="18"/>
+              </w:rPr>
+              <w:t>⏸</w:t>
+            </w:r>
+          </w:p>
+        </w:tc>
+        <w:tc>
+          <w:tcPr>
+            <w:tcW w:type="dxa" w:w="2556"/>
+          </w:tcPr>
+          <w:p>
+            <w:r>
+              <w:rPr>
+                <w:sz w:val="18"/>
+              </w:rPr>
+            </w:r>
+            <w:r>
+              <w:rPr>
+                <w:sz w:val="18"/>
+              </w:rPr>
+              <w:t>sendOutbound / sendProtocol1Samples fidelity audit of the dormant wire layer</w:t>
+            </w:r>
+          </w:p>
+        </w:tc>
+        <w:tc>
+          <w:tcPr>
+            <w:tcW w:type="dxa" w:w="2556"/>
+          </w:tcPr>
+          <w:p>
+            <w:r>
+              <w:rPr>
+                <w:sz w:val="18"/>
+              </w:rPr>
+            </w:r>
+          </w:p>
+        </w:tc>
+      </w:tr>
+      <w:tr>
+        <w:tc>
+          <w:tcPr>
+            <w:tcW w:type="dxa" w:w="2556"/>
+          </w:tcPr>
+          <w:p>
+            <w:r>
+              <w:rPr>
+                <w:sz w:val="18"/>
+              </w:rPr>
+            </w:r>
+            <w:r>
+              <w:rPr>
+                <w:b/>
+                <w:sz w:val="18"/>
+              </w:rPr>
+              <w:t>P3</w:t>
+            </w:r>
+          </w:p>
+        </w:tc>
+        <w:tc>
+          <w:tcPr>
+            <w:tcW w:type="dxa" w:w="2556"/>
+          </w:tcPr>
+          <w:p>
+            <w:r>
+              <w:rPr>
+                <w:sz w:val="18"/>
+              </w:rPr>
+            </w:r>
+            <w:r>
+              <w:rPr>
+                <w:sz w:val="18"/>
+              </w:rPr>
+              <w:t>⏸</w:t>
+            </w:r>
+          </w:p>
+        </w:tc>
+        <w:tc>
+          <w:tcPr>
+            <w:tcW w:type="dxa" w:w="2556"/>
+          </w:tcPr>
+          <w:p>
+            <w:r>
+              <w:rPr>
+                <w:sz w:val="18"/>
+              </w:rPr>
+            </w:r>
+            <w:r>
+              <w:rPr>
+                <w:sz w:val="18"/>
+              </w:rPr>
+              <w:t>netInterface outbound registrations (SendpOutboundTx(OutBound) etc.) — MUST register AFTER create_xmtr (verbatim setters have NO null guards)</w:t>
+            </w:r>
+          </w:p>
+        </w:tc>
+        <w:tc>
+          <w:tcPr>
+            <w:tcW w:type="dxa" w:w="2556"/>
+          </w:tcPr>
+          <w:p>
+            <w:r>
+              <w:rPr>
+                <w:sz w:val="18"/>
+              </w:rPr>
+            </w:r>
+          </w:p>
+        </w:tc>
+      </w:tr>
+      <w:tr>
+        <w:tc>
+          <w:tcPr>
+            <w:tcW w:type="dxa" w:w="2556"/>
+          </w:tcPr>
+          <w:p>
+            <w:r>
+              <w:rPr>
+                <w:sz w:val="18"/>
+              </w:rPr>
+            </w:r>
+            <w:r>
+              <w:rPr>
+                <w:b/>
+                <w:sz w:val="18"/>
+              </w:rPr>
+              <w:t>P4</w:t>
+            </w:r>
+          </w:p>
+        </w:tc>
+        <w:tc>
+          <w:tcPr>
+            <w:tcW w:type="dxa" w:w="2556"/>
+          </w:tcPr>
+          <w:p>
+            <w:r>
+              <w:rPr>
+                <w:sz w:val="18"/>
+              </w:rPr>
+            </w:r>
+            <w:r>
+              <w:rPr>
+                <w:sz w:val="18"/>
+              </w:rPr>
+              <w:t>⏸</w:t>
+            </w:r>
+          </w:p>
+        </w:tc>
+        <w:tc>
+          <w:tcPr>
+            <w:tcW w:type="dxa" w:w="2556"/>
+          </w:tcPr>
+          <w:p>
+            <w:r>
+              <w:rPr>
+                <w:sz w:val="18"/>
+              </w:rPr>
+            </w:r>
+            <w:r>
+              <w:rPr>
+                <w:sz w:val="18"/>
+              </w:rPr>
+              <w:t>Wire-LIVE switchover</w:t>
+            </w:r>
+          </w:p>
+        </w:tc>
+        <w:tc>
+          <w:tcPr>
+            <w:tcW w:type="dxa" w:w="2556"/>
+          </w:tcPr>
+          <w:p>
+            <w:r>
+              <w:rPr>
+                <w:sz w:val="18"/>
+              </w:rPr>
+            </w:r>
+            <w:r>
+              <w:rPr>
+                <w:sz w:val="18"/>
+              </w:rPr>
+              <w:t>ONE commit, full HL2 bench gate</w:t>
+            </w:r>
+          </w:p>
+        </w:tc>
+      </w:tr>
+    </w:tbl>
+    <w:p/>
+    <w:p>
+      <w:r>
+        <w:t xml:space="preserve">PureSignal is a committed feature — the P0.d </w:t>
+      </w:r>
+      <w:r>
+        <w:rPr>
+          <w:rFonts w:ascii="Consolas" w:hAnsi="Consolas"/>
+          <w:sz w:val="18"/>
+        </w:rPr>
+        <w:t>_cmaster</w:t>
+      </w:r>
+      <w:r>
+        <w:t xml:space="preserve"> struct carries the full PS surface so v0.3 lands on top without a retrofit.</w:t>
+      </w:r>
+    </w:p>
+    <w:p>
+      <w:pPr>
+        <w:pStyle w:val="Heading3"/>
+      </w:pPr>
+      <w:r>
+        <w:t>Historical stage index (pre-P0 lettered stages — superseded)</w:t>
+      </w:r>
+    </w:p>
+    <w:p>
+      <w:r>
+        <w:t>The original lettered plan below is retained for history.  The P0 arc absorbed/superseded it: Stage C (ilv) = P0.b; Stage D (xcmaster) = P0.d; Stage E (TxChannel audit) = obsoleted by the P0.d TxChannel deletion; Stage B's idiom-translated AAMix was re-ported verbatim at P0.c.</w:t>
+      </w:r>
+    </w:p>
+    <w:tbl>
+      <w:tblPr>
+        <w:tblStyle w:val="LightGrid-Accent1"/>
+        <w:tblW w:type="auto" w:w="0"/>
+        <w:tblLook w:firstColumn="1" w:firstRow="1" w:lastColumn="0" w:lastRow="0" w:noHBand="0" w:noVBand="1" w:val="04A0"/>
+      </w:tblPr>
+      <w:tblGrid>
+        <w:gridCol w:w="2556"/>
+        <w:gridCol w:w="2556"/>
+        <w:gridCol w:w="2556"/>
+        <w:gridCol w:w="2556"/>
+      </w:tblGrid>
+      <w:tr>
+        <w:tc>
+          <w:tcPr>
+            <w:tcW w:type="dxa" w:w="2556"/>
+            <w:shd w:val="clear" w:color="auto" w:fill="D9E1F2"/>
+          </w:tcPr>
+          <w:p>
+            <w:r/>
+            <w:r>
+              <w:rPr>
+                <w:b/>
+                <w:sz w:val="18"/>
+              </w:rPr>
+              <w:t>Stage</w:t>
+            </w:r>
+          </w:p>
+        </w:tc>
+        <w:tc>
+          <w:tcPr>
+            <w:tcW w:type="dxa" w:w="2556"/>
+            <w:shd w:val="clear" w:color="auto" w:fill="D9E1F2"/>
+          </w:tcPr>
+          <w:p>
+            <w:r/>
+            <w:r>
+              <w:rPr>
+                <w:b/>
+                <w:sz w:val="18"/>
+              </w:rPr>
+              <w:t>Status</w:t>
+            </w:r>
+          </w:p>
+        </w:tc>
+        <w:tc>
+          <w:tcPr>
+            <w:tcW w:type="dxa" w:w="2556"/>
+            <w:shd w:val="clear" w:color="auto" w:fill="D9E1F2"/>
+          </w:tcPr>
+          <w:p>
+            <w:r/>
+            <w:r>
+              <w:rPr>
+                <w:b/>
+                <w:sz w:val="18"/>
+              </w:rPr>
+              <w:t>What</w:t>
+            </w:r>
+          </w:p>
+        </w:tc>
+        <w:tc>
+          <w:tcPr>
+            <w:tcW w:type="dxa" w:w="2556"/>
+            <w:shd w:val="clear" w:color="auto" w:fill="D9E1F2"/>
+          </w:tcPr>
+          <w:p>
+            <w:r/>
+            <w:r>
+              <w:rPr>
+                <w:b/>
+                <w:sz w:val="18"/>
+              </w:rPr>
+              <w:t>Notes</w:t>
+            </w:r>
+          </w:p>
+        </w:tc>
+      </w:tr>
+      <w:tr>
+        <w:tc>
+          <w:tcPr>
+            <w:tcW w:type="dxa" w:w="2556"/>
+          </w:tcPr>
+          <w:p>
+            <w:r>
+              <w:rPr>
+                <w:sz w:val="18"/>
+              </w:rPr>
+            </w:r>
+            <w:r>
+              <w:rPr>
+                <w:b/>
+                <w:sz w:val="18"/>
+              </w:rPr>
+              <w:t>A</w:t>
+            </w:r>
+          </w:p>
+        </w:tc>
+        <w:tc>
+          <w:tcPr>
+            <w:tcW w:type="dxa" w:w="2556"/>
+          </w:tcPr>
+          <w:p>
+            <w:r>
+              <w:rPr>
+                <w:sz w:val="18"/>
+              </w:rPr>
+            </w:r>
+            <w:r>
+              <w:rPr>
+                <w:sz w:val="18"/>
+              </w:rPr>
+              <w:t>✅ DONE</w:t>
+            </w:r>
+          </w:p>
+        </w:tc>
+        <w:tc>
+          <w:tcPr>
+            <w:tcW w:type="dxa" w:w="2556"/>
+          </w:tcPr>
+          <w:p>
+            <w:r>
+              <w:rPr>
+                <w:sz w:val="18"/>
+              </w:rPr>
+            </w:r>
+            <w:r>
+              <w:rPr>
+                <w:sz w:val="18"/>
+              </w:rPr>
+              <w:t>CMaster.cpp wire-up stubs (Send*Outbound* + SetTCIRun)</w:t>
+            </w:r>
+          </w:p>
+        </w:tc>
+        <w:tc>
+          <w:tcPr>
+            <w:tcW w:type="dxa" w:w="2556"/>
+          </w:tcPr>
+          <w:p>
+            <w:r>
+              <w:rPr>
+                <w:sz w:val="18"/>
+              </w:rPr>
+            </w:r>
+            <w:r>
+              <w:rPr>
+                <w:sz w:val="18"/>
+              </w:rPr>
+              <w:t>Superseded by the P0.d full verbatim CMaster port.</w:t>
+            </w:r>
+          </w:p>
+        </w:tc>
+      </w:tr>
+      <w:tr>
+        <w:tc>
+          <w:tcPr>
+            <w:tcW w:type="dxa" w:w="2556"/>
+          </w:tcPr>
+          <w:p>
+            <w:r>
+              <w:rPr>
+                <w:sz w:val="18"/>
+              </w:rPr>
+            </w:r>
+            <w:r>
+              <w:rPr>
+                <w:b/>
+                <w:sz w:val="18"/>
+              </w:rPr>
+              <w:t>B</w:t>
+            </w:r>
+          </w:p>
+        </w:tc>
+        <w:tc>
+          <w:tcPr>
+            <w:tcW w:type="dxa" w:w="2556"/>
+          </w:tcPr>
+          <w:p>
+            <w:r>
+              <w:rPr>
+                <w:sz w:val="18"/>
+              </w:rPr>
+            </w:r>
+            <w:r>
+              <w:rPr>
+                <w:sz w:val="18"/>
+              </w:rPr>
+              <w:t>✅ DONE</w:t>
+            </w:r>
+          </w:p>
+        </w:tc>
+        <w:tc>
+          <w:tcPr>
+            <w:tcW w:type="dxa" w:w="2556"/>
+          </w:tcPr>
+          <w:p>
+            <w:r>
+              <w:rPr>
+                <w:sz w:val="18"/>
+              </w:rPr>
+            </w:r>
+            <w:r>
+              <w:rPr>
+                <w:sz w:val="18"/>
+              </w:rPr>
+              <w:t>aamix.c direct port + wire into RX path</w:t>
+            </w:r>
+          </w:p>
+        </w:tc>
+        <w:tc>
+          <w:tcPr>
+            <w:tcW w:type="dxa" w:w="2556"/>
+          </w:tcPr>
+          <w:p>
+            <w:r>
+              <w:rPr>
+                <w:sz w:val="18"/>
+              </w:rPr>
+            </w:r>
+            <w:r>
+              <w:rPr>
+                <w:sz w:val="18"/>
+              </w:rPr>
+              <w:t>Shipped 2026-06-08 (idiom-translated); re-ported VERBATIM at P0.c.</w:t>
+            </w:r>
+          </w:p>
+        </w:tc>
+      </w:tr>
+      <w:tr>
+        <w:tc>
+          <w:tcPr>
+            <w:tcW w:type="dxa" w:w="2556"/>
+          </w:tcPr>
+          <w:p>
+            <w:r>
+              <w:rPr>
+                <w:sz w:val="18"/>
+              </w:rPr>
+            </w:r>
+            <w:r>
+              <w:rPr>
+                <w:b/>
+                <w:sz w:val="18"/>
+              </w:rPr>
+              <w:t>C</w:t>
+            </w:r>
+          </w:p>
+        </w:tc>
+        <w:tc>
+          <w:tcPr>
+            <w:tcW w:type="dxa" w:w="2556"/>
+          </w:tcPr>
+          <w:p>
+            <w:r>
+              <w:rPr>
+                <w:sz w:val="18"/>
+              </w:rPr>
+            </w:r>
+            <w:r>
+              <w:rPr>
+                <w:sz w:val="18"/>
+              </w:rPr>
+              <w:t>✅ DONE (as P0.b)</w:t>
+            </w:r>
+          </w:p>
+        </w:tc>
+        <w:tc>
+          <w:tcPr>
+            <w:tcW w:type="dxa" w:w="2556"/>
+          </w:tcPr>
+          <w:p>
+            <w:r>
+              <w:rPr>
+                <w:sz w:val="18"/>
+              </w:rPr>
+            </w:r>
+            <w:r>
+              <w:rPr>
+                <w:sz w:val="18"/>
+              </w:rPr>
+              <w:t>ilv.c direct port (TX I/Q interleaver)</w:t>
+            </w:r>
+          </w:p>
+        </w:tc>
+        <w:tc>
+          <w:tcPr>
+            <w:tcW w:type="dxa" w:w="2556"/>
+          </w:tcPr>
+          <w:p>
+            <w:r>
+              <w:rPr>
+                <w:sz w:val="18"/>
+              </w:rPr>
+            </w:r>
+            <w:r>
+              <w:rPr>
+                <w:sz w:val="18"/>
+              </w:rPr>
+              <w:t xml:space="preserve">Landed verbatim at </w:t>
             </w:r>
             <w:r>
               <w:rPr>
                 <w:rFonts w:ascii="Consolas" w:hAnsi="Consolas"/>
                 <w:sz w:val="18"/>
               </w:rPr>
-              <w:t>main</w:t>
-            </w:r>
-            <w:r>
-              <w:rPr>
-                <w:sz w:val="18"/>
-              </w:rPr>
-              <w:t xml:space="preserve"> (TX-1 components 2-6) was a forward-reasoning effort; this stage formally audits it against </w:t>
+              <w:t>wire/ILV.{h,cpp}</w:t>
+            </w:r>
+            <w:r>
+              <w:rPr>
+                <w:sz w:val="18"/>
+              </w:rPr>
+              <w:t>.</w:t>
+            </w:r>
+          </w:p>
+        </w:tc>
+      </w:tr>
+      <w:tr>
+        <w:tc>
+          <w:tcPr>
+            <w:tcW w:type="dxa" w:w="2556"/>
+          </w:tcPr>
+          <w:p>
+            <w:r>
+              <w:rPr>
+                <w:sz w:val="18"/>
+              </w:rPr>
+            </w:r>
+            <w:r>
+              <w:rPr>
+                <w:b/>
+                <w:sz w:val="18"/>
+              </w:rPr>
+              <w:t>D</w:t>
+            </w:r>
+          </w:p>
+        </w:tc>
+        <w:tc>
+          <w:tcPr>
+            <w:tcW w:type="dxa" w:w="2556"/>
+          </w:tcPr>
+          <w:p>
+            <w:r>
+              <w:rPr>
+                <w:sz w:val="18"/>
+              </w:rPr>
+            </w:r>
+            <w:r>
+              <w:rPr>
+                <w:sz w:val="18"/>
+              </w:rPr>
+              <w:t>✅ DONE (as P0.d)</w:t>
+            </w:r>
+          </w:p>
+        </w:tc>
+        <w:tc>
+          <w:tcPr>
+            <w:tcW w:type="dxa" w:w="2556"/>
+          </w:tcPr>
+          <w:p>
+            <w:r>
+              <w:rPr>
+                <w:sz w:val="18"/>
+              </w:rPr>
+            </w:r>
+            <w:r>
+              <w:rPr>
+                <w:sz w:val="18"/>
+              </w:rPr>
+              <w:t>xcmaster pump body direct port</w:t>
+            </w:r>
+          </w:p>
+        </w:tc>
+        <w:tc>
+          <w:tcPr>
+            <w:tcW w:type="dxa" w:w="2556"/>
+          </w:tcPr>
+          <w:p>
+            <w:r>
+              <w:rPr>
+                <w:sz w:val="18"/>
+              </w:rPr>
+            </w:r>
+            <w:r>
+              <w:rPr>
+                <w:sz w:val="18"/>
+              </w:rPr>
+              <w:t xml:space="preserve">Landed verbatim in </w:t>
             </w:r>
             <w:r>
               <w:rPr>
                 <w:rFonts w:ascii="Consolas" w:hAnsi="Consolas"/>
                 <w:sz w:val="18"/>
               </w:rPr>
-              <w:t>cmaster.c::create_xmtr</w:t>
-            </w:r>
-            <w:r>
-              <w:rPr>
-                <w:sz w:val="18"/>
-              </w:rPr>
-              <w:t xml:space="preserve"> lines 177-190 + </w:t>
-            </w:r>
-            <w:r>
-              <w:rPr>
-                <w:rFonts w:ascii="Consolas" w:hAnsi="Consolas"/>
-                <w:sz w:val="18"/>
-              </w:rPr>
-              <w:t>wdsp/TXA.c::create_txa</w:t>
-            </w:r>
-            <w:r>
-              <w:rPr>
-                <w:sz w:val="18"/>
-              </w:rPr>
-              <w:t xml:space="preserve"> and merges any verified divergences.</w:t>
+              <w:t>wire/CMaster.cpp</w:t>
+            </w:r>
+            <w:r>
+              <w:rPr>
+                <w:sz w:val="18"/>
+              </w:rPr>
+              <w:t xml:space="preserve"> (real stype/txid/chid + update[] CS).</w:t>
+            </w:r>
+          </w:p>
+        </w:tc>
+      </w:tr>
+      <w:tr>
+        <w:tc>
+          <w:tcPr>
+            <w:tcW w:type="dxa" w:w="2556"/>
+          </w:tcPr>
+          <w:p>
+            <w:r>
+              <w:rPr>
+                <w:sz w:val="18"/>
+              </w:rPr>
+            </w:r>
+            <w:r>
+              <w:rPr>
+                <w:b/>
+                <w:sz w:val="18"/>
+              </w:rPr>
+              <w:t>E</w:t>
+            </w:r>
+          </w:p>
+        </w:tc>
+        <w:tc>
+          <w:tcPr>
+            <w:tcW w:type="dxa" w:w="2556"/>
+          </w:tcPr>
+          <w:p>
+            <w:r>
+              <w:rPr>
+                <w:sz w:val="18"/>
+              </w:rPr>
+            </w:r>
+            <w:r>
+              <w:rPr>
+                <w:sz w:val="18"/>
+              </w:rPr>
+              <w:t>🟫 OBSOLETE</w:t>
+            </w:r>
+          </w:p>
+        </w:tc>
+        <w:tc>
+          <w:tcPr>
+            <w:tcW w:type="dxa" w:w="2556"/>
+          </w:tcPr>
+          <w:p>
+            <w:r>
+              <w:rPr>
+                <w:sz w:val="18"/>
+              </w:rPr>
+            </w:r>
+            <w:r>
+              <w:rPr>
+                <w:sz w:val="18"/>
+              </w:rPr>
+              <w:t>TxChannel reference-parity audit + reconciliation</w:t>
+            </w:r>
+          </w:p>
+        </w:tc>
+        <w:tc>
+          <w:tcPr>
+            <w:tcW w:type="dxa" w:w="2556"/>
+          </w:tcPr>
+          <w:p>
+            <w:r>
+              <w:rPr>
+                <w:sz w:val="18"/>
+              </w:rPr>
+            </w:r>
+            <w:r>
+              <w:rPr>
+                <w:sz w:val="18"/>
+              </w:rPr>
+              <w:t>TxChannel DELETED at P0.d — the verbatim create_xmtr replaces it.</w:t>
             </w:r>
           </w:p>
         </w:tc>
@@ -4631,10 +6017,10 @@
         <w:rPr>
           <w:b/>
         </w:rPr>
-        <w:t>Stage ordering note:</w:t>
+        <w:t>Ordering note:</w:t>
       </w:r>
       <w:r>
-        <w:t xml:space="preserve"> Stages C–H are not strictly linear. Operator picks which stage to land next based on what unlocks the most-useful operator-visible behavior.  The methodology (smallest revertable step + bench gate) applies within each stage regardless of cross-stage ordering.</w:t>
+        <w:t xml:space="preserve"> the P0→P4 sequence above is the active linear plan.  F–H land after P4 Wire-LIVE.  The methodology (smallest revertable step + mechanical diff + operator bench gate) applies within each step.</w:t>
       </w:r>
     </w:p>
     <w:p>
@@ -4787,6 +6173,364 @@
     <w:p>
       <w:r>
         <w:t>Newest at top.  Cross-references SESSION_LOG.md for full arc details.</w:t>
+      </w:r>
+    </w:p>
+    <w:p>
+      <w:pPr>
+        <w:pStyle w:val="Heading3"/>
+      </w:pPr>
+      <w:r>
+        <w:t>2026-06-12 — P0.d cmbuffs/cmaster/cmsetup VERBATIM port (HL2 bench pending)</w:t>
+      </w:r>
+    </w:p>
+    <w:p>
+      <w:pPr>
+        <w:pStyle w:val="ListBullet"/>
+        <w:ind w:left="360"/>
+      </w:pPr>
+      <w:r>
+        <w:rPr>
+          <w:b/>
+        </w:rPr>
+        <w:t>P0.d `afc7950`</w:t>
+      </w:r>
+      <w:r>
+        <w:t xml:space="preserve"> on </w:t>
+      </w:r>
+      <w:r>
+        <w:rPr>
+          <w:rFonts w:ascii="Consolas" w:hAnsi="Consolas"/>
+          <w:sz w:val="18"/>
+        </w:rPr>
+        <w:t>tx-rebuild</w:t>
+      </w:r>
+      <w:r>
+        <w:t xml:space="preserve">: NEW </w:t>
+      </w:r>
+      <w:r>
+        <w:rPr>
+          <w:rFonts w:ascii="Consolas" w:hAnsi="Consolas"/>
+          <w:sz w:val="18"/>
+        </w:rPr>
+        <w:t>wire/cmsetup.{h,cpp}</w:t>
+      </w:r>
+    </w:p>
+    <w:p>
+      <w:r>
+        <w:t xml:space="preserve">(cmMAX* 16/4/4/2/32 + the 8 id helpers + SetRadioStructure + set_cmdefault_rates); </w:t>
+      </w:r>
+      <w:r>
+        <w:rPr>
+          <w:rFonts w:ascii="Consolas" w:hAnsi="Consolas"/>
+          <w:sz w:val="18"/>
+        </w:rPr>
+        <w:t>wire/CmBuffs.{h,cpp}</w:t>
+      </w:r>
+      <w:r>
+        <w:t xml:space="preserve"> rewritten verbatim (</w:t>
+      </w:r>
+      <w:r>
+        <w:rPr>
+          <w:rFonts w:ascii="Consolas" w:hAnsi="Consolas"/>
+          <w:sz w:val="18"/>
+        </w:rPr>
+        <w:t>cmb,*CMB</w:t>
+      </w:r>
+      <w:r>
+        <w:t xml:space="preserve">, malloc0/_aligned_free; Phase-C retrofit deviations removed); </w:t>
+      </w:r>
+      <w:r>
+        <w:rPr>
+          <w:rFonts w:ascii="Consolas" w:hAnsi="Consolas"/>
+          <w:sz w:val="18"/>
+        </w:rPr>
+        <w:t>wire/CMaster.{h,cpp}</w:t>
+      </w:r>
+      <w:r>
+        <w:t xml:space="preserve"> rewritten verbatim (FULL </w:t>
+      </w:r>
+      <w:r>
+        <w:rPr>
+          <w:rFonts w:ascii="Consolas" w:hAnsi="Consolas"/>
+          <w:sz w:val="18"/>
+        </w:rPr>
+        <w:t>_cmaster</w:t>
+      </w:r>
+      <w:r>
+        <w:t xml:space="preserve"> struct incl. the PureSignal surface, </w:t>
+      </w:r>
+      <w:r>
+        <w:rPr>
+          <w:rFonts w:ascii="Consolas" w:hAnsi="Consolas"/>
+          <w:sz w:val="18"/>
+        </w:rPr>
+        <w:t>enum AudioCODEC</w:t>
+      </w:r>
+      <w:r>
+        <w:t>, raw TCI fn ptrs, verbatim create/destroy_cmaster + create/destroy_xmtr + xcmaster + all Sendp*/Set* setters).</w:t>
+      </w:r>
+    </w:p>
+    <w:p>
+      <w:pPr>
+        <w:pStyle w:val="ListBullet"/>
+        <w:ind w:left="360"/>
+      </w:pPr>
+      <w:r>
+        <w:rPr>
+          <w:b/>
+        </w:rPr>
+        <w:t>TxChannel RAII carve-out DELETED</w:t>
+      </w:r>
+      <w:r>
+        <w:t xml:space="preserve"> (</w:t>
+      </w:r>
+      <w:r>
+        <w:rPr>
+          <w:rFonts w:ascii="Consolas" w:hAnsi="Consolas"/>
+          <w:sz w:val="18"/>
+        </w:rPr>
+        <w:t>src/wdsp/TxChannel.{h,cpp}</w:t>
+      </w:r>
+    </w:p>
+    <w:p>
+      <w:r>
+        <w:t>retired) — the verbatim create_xmtr opens the WDSP TXA channel + TX analyzer (disp 1) + out[0..2] + ILV itself through the wdspcalls seam.</w:t>
+      </w:r>
+    </w:p>
+    <w:p>
+      <w:pPr>
+        <w:pStyle w:val="ListBullet"/>
+        <w:ind w:left="360"/>
+      </w:pPr>
+      <w:r>
+        <w:t>main.cpp: SetRadioStructure(2,1,1,1,0,…) config before</w:t>
+      </w:r>
+    </w:p>
+    <w:p>
+      <w:r>
+        <w:t>create_cmaster (chid(0,0)=0 RX1 / chid(1,0)=1 TX = the live layout); create_xmtr() post-resolve_wdsp_calls (documented DEFERRED-CALLSITE accommodation); handler-1.5 = gated destroy_xmtr().</w:t>
+      </w:r>
+    </w:p>
+    <w:p>
+      <w:pPr>
+        <w:pStyle w:val="ListBullet"/>
+        <w:ind w:left="360"/>
+      </w:pPr>
+      <w:r>
+        <w:t>Verification: clean build ZERO warnings; test_ilv ALL PASS;</w:t>
+      </w:r>
+    </w:p>
+    <w:p>
+      <w:r>
+        <w:t xml:space="preserve">mechanical diffs IDENTICAL (CmBuffs.{h,cpp} / cmsetup.h / CMaster.h / all 10 fully-verbatim cmaster.c functions) + live-line-subset PASS for the partially-deferred bodies (sole accommodation: </w:t>
+      </w:r>
+      <w:r>
+        <w:rPr>
+          <w:rFonts w:ascii="Consolas" w:hAnsi="Consolas"/>
+          <w:sz w:val="18"/>
+        </w:rPr>
+        <w:t>(char*)""</w:t>
+      </w:r>
+      <w:r>
+        <w:t xml:space="preserve"> at XCreateAnalyzer).</w:t>
+      </w:r>
+    </w:p>
+    <w:p>
+      <w:pPr>
+        <w:pStyle w:val="ListBullet"/>
+        <w:ind w:left="360"/>
+      </w:pPr>
+      <w:r>
+        <w:t>New at startup: TWO cm_main pump threads (streams 0+1; stream 0</w:t>
+      </w:r>
+    </w:p>
+    <w:p>
+      <w:r>
+        <w:t>idles — no Inbound producer); TX stays wire-quiescent (OutboundTx null until P3).</w:t>
+      </w:r>
+    </w:p>
+    <w:p>
+      <w:pPr>
+        <w:pStyle w:val="ListBullet"/>
+        <w:ind w:left="360"/>
+      </w:pPr>
+      <w:r>
+        <w:t xml:space="preserve">⚠ </w:t>
+      </w:r>
+      <w:r>
+        <w:rPr>
+          <w:b/>
+        </w:rPr>
+        <w:t>GATE: operator HL2 RX-regression bench</w:t>
+      </w:r>
+      <w:r>
+        <w:t xml:space="preserve"> (RX works; clean</w:t>
+      </w:r>
+    </w:p>
+    <w:p>
+      <w:r>
+        <w:t xml:space="preserve">stop/restart; clean exit — pump threads must join in destroy_cmbuffs) </w:t>
+      </w:r>
+      <w:r>
+        <w:rPr>
+          <w:b/>
+        </w:rPr>
+        <w:t>before P1 (obbuffs.c) starts.</w:t>
+      </w:r>
+    </w:p>
+    <w:p>
+      <w:pPr>
+        <w:pStyle w:val="Heading3"/>
+      </w:pPr>
+      <w:r>
+        <w:t>2026-06-09 → 2026-06-11 — P0.a/P0.b/P0.c verbatim-rewrite arc</w:t>
+      </w:r>
+    </w:p>
+    <w:p>
+      <w:pPr>
+        <w:pStyle w:val="ListBullet"/>
+        <w:ind w:left="360"/>
+      </w:pPr>
+      <w:r>
+        <w:t>Operator rejected the 2026-06-09 "rule-#8" retrofit deviations</w:t>
+      </w:r>
+    </w:p>
+    <w:p>
+      <w:r>
+        <w:t>("I said PORT!") → every ported file rewritten VERBATIM.</w:t>
+      </w:r>
+    </w:p>
+    <w:p>
+      <w:pPr>
+        <w:pStyle w:val="ListBullet"/>
+        <w:ind w:left="360"/>
+      </w:pPr>
+      <w:r>
+        <w:rPr>
+          <w:b/>
+        </w:rPr>
+        <w:t>P0.a `e0c0f4a`</w:t>
+      </w:r>
+      <w:r>
+        <w:t xml:space="preserve">: </w:t>
+      </w:r>
+      <w:r>
+        <w:rPr>
+          <w:rFonts w:ascii="Consolas" w:hAnsi="Consolas"/>
+          <w:sz w:val="18"/>
+        </w:rPr>
+        <w:t>wire/wdspcalls.{h,cpp}</w:t>
+      </w:r>
+      <w:r>
+        <w:t xml:space="preserve"> — the single</w:t>
+      </w:r>
+    </w:p>
+    <w:p>
+      <w:r>
+        <w:t xml:space="preserve">approved WDSP linkage seam (fn-ptr table, exact export names, PureSignal entry family complete + dumpbin-verified). </w:t>
+      </w:r>
+      <w:r>
+        <w:rPr>
+          <w:rFonts w:ascii="Consolas" w:hAnsi="Consolas"/>
+          <w:sz w:val="18"/>
+        </w:rPr>
+        <w:t>scratch/_typedef_fidelity_test.cpp</w:t>
+      </w:r>
+      <w:r>
+        <w:t xml:space="preserve"> disproved the claimed "C++ collisions" (twin typedef / </w:t>
+      </w:r>
+      <w:r>
+        <w:rPr>
+          <w:rFonts w:ascii="Consolas" w:hAnsi="Consolas"/>
+          <w:sz w:val="18"/>
+        </w:rPr>
+        <w:t>complex[2]</w:t>
+      </w:r>
+      <w:r>
+        <w:t xml:space="preserve"> / raw fn ptr all compile verbatim).</w:t>
+      </w:r>
+    </w:p>
+    <w:p>
+      <w:pPr>
+        <w:pStyle w:val="ListBullet"/>
+        <w:ind w:left="360"/>
+      </w:pPr>
+      <w:r>
+        <w:rPr>
+          <w:b/>
+        </w:rPr>
+        <w:t>P0.b `1f49d98`</w:t>
+      </w:r>
+      <w:r>
+        <w:t xml:space="preserve">: ilv.{h,c} verbatim → </w:t>
+      </w:r>
+      <w:r>
+        <w:rPr>
+          <w:rFonts w:ascii="Consolas" w:hAnsi="Consolas"/>
+          <w:sz w:val="18"/>
+        </w:rPr>
+        <w:t>wire/ILV.{h,cpp}</w:t>
+      </w:r>
+      <w:r>
+        <w:t>;</w:t>
+      </w:r>
+    </w:p>
+    <w:p>
+      <w:r>
+        <w:t xml:space="preserve">new </w:t>
+      </w:r>
+      <w:r>
+        <w:rPr>
+          <w:rFonts w:ascii="Consolas" w:hAnsi="Consolas"/>
+          <w:sz w:val="18"/>
+        </w:rPr>
+        <w:t>wire/cmcomm.{h,cpp}</w:t>
+      </w:r>
+      <w:r>
+        <w:t xml:space="preserve"> (complex/PORT/malloc0/PI); pilv[] bank gone; SendpOutboundTx raw fn ptr (register AFTER create_xmtr — no null guards, reference ordering).  Mechanical diff whitespace-only; test_ilv ALL PASS.</w:t>
+      </w:r>
+    </w:p>
+    <w:p>
+      <w:pPr>
+        <w:pStyle w:val="ListBullet"/>
+        <w:ind w:left="360"/>
+      </w:pPr>
+      <w:r>
+        <w:rPr>
+          <w:b/>
+        </w:rPr>
+        <w:t>P0.c `e0f2584`</w:t>
+      </w:r>
+      <w:r>
+        <w:t xml:space="preserve">: aamix.{h,c} verbatim → </w:t>
+      </w:r>
+      <w:r>
+        <w:rPr>
+          <w:rFonts w:ascii="Consolas" w:hAnsi="Consolas"/>
+          <w:sz w:val="18"/>
+        </w:rPr>
+        <w:t>wire/AAMix.{h,cpp}</w:t>
+      </w:r>
+    </w:p>
+    <w:p>
+      <w:r>
+        <w:t xml:space="preserve">(supersedes the Stage-B idiom translation); </w:t>
+      </w:r>
+      <w:r>
+        <w:rPr>
+          <w:rFonts w:ascii="Consolas" w:hAnsi="Consolas"/>
+          <w:sz w:val="18"/>
+        </w:rPr>
+        <w:t>wire/resample.h</w:t>
+      </w:r>
+      <w:r>
+        <w:t xml:space="preserve"> = public RESAMPLE ABI; wdspcalls retyped + flush_resample; WdspEngine outbound lambda → static fn + TU-scope context ptr. ✅ </w:t>
+      </w:r>
+      <w:r>
+        <w:rPr>
+          <w:b/>
+        </w:rPr>
+        <w:t>Operator HL2 RX bench PASSED 2026-06-11.</w:t>
       </w:r>
     </w:p>
     <w:p>
@@ -5183,7 +6927,7 @@
         <w:color w:val="808080"/>
         <w:sz w:val="16"/>
       </w:rPr>
-      <w:t>Lyra-cpp Execution Plan — auto-generated 2026-06-09 05:43 (source: docs/EXECUTION_PLAN.md)</w:t>
+      <w:t>Lyra-cpp Execution Plan — auto-generated 2026-06-12 09:22 (source: docs/EXECUTION_PLAN.md)</w:t>
     </w:r>
   </w:p>
 </w:hdr>

</xml_diff>

<commit_message>
docs: record P0.d HL2 RX-regression bench PASSED — P0 arc complete, P1 obbuffs unblocked
Operator bench 2026-06-12: RX working on the verbatim CmBuffs/CMaster/
cmsetup layout (afc7950). Flip P0.d from bench-PENDING to bench-PASSED
in the status registry + stage table + session log; regenerate the
PDF/DOCX siblings.

Co-Authored-By: Claude Fable 5 <noreply@anthropic.com>
</commit_message>
<xml_diff>
--- a/docs/THETIS_DIRECT_PORT_PLAN.docx
+++ b/docs/THETIS_DIRECT_PORT_PLAN.docx
@@ -1381,7 +1381,7 @@
               <w:rPr>
                 <w:sz w:val="18"/>
               </w:rPr>
-              <w:t>🟡</w:t>
+              <w:t>✅</w:t>
             </w:r>
           </w:p>
         </w:tc>
@@ -1445,7 +1445,14 @@
               <w:rPr>
                 <w:sz w:val="18"/>
               </w:rPr>
-              <w:t xml:space="preserve"> alloc moved back to create_cmaster per reference). Mechanical diff = whitespace-only. 🟡 pending the P0.d operator HL2 RX-regression bench.</w:t>
+              <w:t xml:space="preserve"> alloc moved back to create_cmaster per reference). Mechanical diff = whitespace-only. ✅ </w:t>
+            </w:r>
+            <w:r>
+              <w:rPr>
+                <w:b/>
+                <w:sz w:val="18"/>
+              </w:rPr>
+              <w:t>P0.d operator HL2 RX-regression bench PASSED 2026-06-12.</w:t>
             </w:r>
           </w:p>
         </w:tc>
@@ -1515,7 +1522,7 @@
               <w:rPr>
                 <w:sz w:val="18"/>
               </w:rPr>
-              <w:t>🟡</w:t>
+              <w:t>✅</w:t>
             </w:r>
           </w:p>
         </w:tc>
@@ -1540,7 +1547,7 @@
               <w:rPr>
                 <w:sz w:val="18"/>
               </w:rPr>
-              <w:t xml:space="preserve"> VERBATIM: cmMAX* sizing macros (16/4/4/2/32), rxid/txid/sp0id/stype/chid/inid/mixinid/getbuffsize, SetRadioStructure + set_cmdefault_rates. main.cpp config: SetRadioStructure(2,1,1,1,0,…) → chid(0,0)=0 RX1 / chid(1,0)=1 TX matches the live channel layout. 🟡 pending the same bench.</w:t>
+              <w:t xml:space="preserve"> VERBATIM: cmMAX* sizing macros (16/4/4/2/32), rxid/txid/sp0id/stype/chid/inid/mixinid/getbuffsize, SetRadioStructure + set_cmdefault_rates. main.cpp config: SetRadioStructure(2,1,1,1,0,…) → chid(0,0)=0 RX1 / chid(1,0)=1 TX matches the live channel layout. ✅ Bench PASSED 2026-06-12.</w:t>
             </w:r>
           </w:p>
         </w:tc>
@@ -1610,7 +1617,7 @@
               <w:rPr>
                 <w:sz w:val="18"/>
               </w:rPr>
-              <w:t>🟡</w:t>
+              <w:t>✅</w:t>
             </w:r>
           </w:p>
         </w:tc>
@@ -1726,7 +1733,20 @@
               <w:rPr>
                 <w:sz w:val="18"/>
               </w:rPr>
-              <w:t xml:space="preserve"> at XCreateAnalyzer. 🟡 pending the P0.d bench.</w:t>
+              <w:t xml:space="preserve"> at XCreateAnalyzer. ✅ </w:t>
+            </w:r>
+            <w:r>
+              <w:rPr>
+                <w:b/>
+                <w:sz w:val="18"/>
+              </w:rPr>
+              <w:t>Operator HL2 RX-regression bench PASSED 2026-06-12</w:t>
+            </w:r>
+            <w:r>
+              <w:rPr>
+                <w:sz w:val="18"/>
+              </w:rPr>
+              <w:t xml:space="preserve"> (RX working on the new per-stream pump/ring layout).</w:t>
             </w:r>
           </w:p>
         </w:tc>
@@ -4868,7 +4888,7 @@
               <w:rPr>
                 <w:sz w:val="18"/>
               </w:rPr>
-              <w:t>🟡 SHIPPED</w:t>
+              <w:t>✅ DONE</w:t>
             </w:r>
           </w:p>
         </w:tc>
@@ -4963,14 +4983,14 @@
               <w:rPr>
                 <w:sz w:val="18"/>
               </w:rPr>
-              <w:t xml:space="preserve"> 2026-06-12; ⚠ </w:t>
+              <w:t xml:space="preserve"> 2026-06-12; ✅ </w:t>
             </w:r>
             <w:r>
               <w:rPr>
                 <w:b/>
                 <w:sz w:val="18"/>
               </w:rPr>
-              <w:t>operator HL2 RX-regression bench PENDING — the gate before P1</w:t>
+              <w:t>operator HL2 RX-regression bench PASSED 2026-06-12</w:t>
             </w:r>
           </w:p>
         </w:tc>
@@ -5058,7 +5078,7 @@
               <w:rPr>
                 <w:sz w:val="18"/>
               </w:rPr>
-              <w:t>after the P0.d bench</w:t>
+              <w:t>UNBLOCKED — P0.d bench passed</w:t>
             </w:r>
           </w:p>
         </w:tc>
@@ -6180,7 +6200,7 @@
         <w:pStyle w:val="Heading3"/>
       </w:pPr>
       <w:r>
-        <w:t>2026-06-12 — P0.d cmbuffs/cmaster/cmsetup VERBATIM port (HL2 bench pending)</w:t>
+        <w:t>2026-06-12 — P0.d cmbuffs/cmaster/cmsetup VERBATIM port (✅ HL2 bench PASSED)</w:t>
       </w:r>
     </w:p>
     <w:p>
@@ -6355,27 +6375,18 @@
         <w:ind w:left="360"/>
       </w:pPr>
       <w:r>
-        <w:t xml:space="preserve">⚠ </w:t>
+        <w:t xml:space="preserve">✅ </w:t>
       </w:r>
       <w:r>
         <w:rPr>
           <w:b/>
         </w:rPr>
-        <w:t>GATE: operator HL2 RX-regression bench</w:t>
-      </w:r>
-      <w:r>
-        <w:t xml:space="preserve"> (RX works; clean</w:t>
+        <w:t>GATE PASSED 2026-06-12: operator HL2 RX-regression bench</w:t>
       </w:r>
     </w:p>
     <w:p>
       <w:r>
-        <w:t xml:space="preserve">stop/restart; clean exit — pump threads must join in destroy_cmbuffs) </w:t>
-      </w:r>
-      <w:r>
-        <w:rPr>
-          <w:b/>
-        </w:rPr>
-        <w:t>before P1 (obbuffs.c) starts.</w:t>
+        <w:t>("RX still working") — P1 (obbuffs.c) is unblocked.</w:t>
       </w:r>
     </w:p>
     <w:p>
@@ -6927,7 +6938,7 @@
         <w:color w:val="808080"/>
         <w:sz w:val="16"/>
       </w:rPr>
-      <w:t>Lyra-cpp Execution Plan — auto-generated 2026-06-12 09:22 (source: docs/EXECUTION_PLAN.md)</w:t>
+      <w:t>Lyra-cpp Execution Plan — auto-generated 2026-06-12 11:15 (source: docs/EXECUTION_PLAN.md)</w:t>
     </w:r>
   </w:p>
 </w:hdr>

</xml_diff>

<commit_message>
docs: plan status symbols — emoji to distinct ASCII tags (PDF legibility)
Operator-flagged: the PDF font renders every status emoji as the
same fallback box, so statuses were indistinguishable at a glance.
Replaced throughout the plan doc + legend:
  done+benched  -> [DONE]
  in-progress   -> [WIP]
  pending       -> [PEND]
  no-port       -> [N/A]
  warning       -> [!]
  arrow         -> ->
Doc now contains no characters outside the PDF font's coverage;
PDF/DOCX siblings regenerated and probe-verified.

Co-Authored-By: Claude Fable 5 <noreply@anthropic.com>
</commit_message>
<xml_diff>
--- a/docs/THETIS_DIRECT_PORT_PLAN.docx
+++ b/docs/THETIS_DIRECT_PORT_PLAN.docx
@@ -27,7 +27,7 @@
           <w:i/>
           <w:color w:val="505050"/>
         </w:rPr>
-        <w:t>⚠ The older `EXECUTION_PLAN.md` (Step 14 wire-layer rebuild,</w:t>
+        <w:t>[!] The older `EXECUTION_PLAN.md` (Step 14 wire-layer rebuild,</w:t>
       </w:r>
     </w:p>
     <w:p>
@@ -566,7 +566,7 @@
         <w:pStyle w:val="Heading2"/>
       </w:pPr>
       <w:r>
-        <w:t>🔒 LOCKED METHODOLOGY (Stage B-validated, do NOT relax)</w:t>
+        <w:t>LOCKED METHODOLOGY (Stage B-validated, do NOT relax)</w:t>
       </w:r>
     </w:p>
     <w:p>
@@ -580,7 +580,7 @@
         <w:ind w:left="360"/>
       </w:pPr>
       <w:r>
-        <w:t>**Smallest revertable empirical step → operator HL2 bench →</w:t>
+        <w:t>**Smallest revertable empirical step -&gt; operator HL2 bench -&gt;</w:t>
       </w:r>
     </w:p>
     <w:p>
@@ -755,7 +755,7 @@
     </w:p>
     <w:p>
       <w:r>
-        <w:t>clean operator HL2 bench → backup bundle + push immediately. Smaller in-flight delta = smaller surprise blast radius.</w:t>
+        <w:t>clean operator HL2 bench -&gt; backup bundle + push immediately. Smaller in-flight delta = smaller surprise blast radius.</w:t>
       </w:r>
     </w:p>
     <w:p>
@@ -807,12 +807,12 @@
         <w:pStyle w:val="Heading2"/>
       </w:pPr>
       <w:r>
-        <w:t>📊 STATUS REGISTRY — what's done, in-progress, pending</w:t>
+        <w:t>STATUS REGISTRY — what's done, in-progress, pending</w:t>
       </w:r>
     </w:p>
     <w:p>
       <w:r>
-        <w:t>Format: per-file or per-component row.  Status emoji:</w:t>
+        <w:t>Format: per-file or per-component row.  Status tags (ASCII so they render identically in the PDF/DOCX siblings):</w:t>
       </w:r>
     </w:p>
     <w:p>
@@ -821,7 +821,7 @@
         <w:ind w:left="360"/>
       </w:pPr>
       <w:r>
-        <w:t>✅ DONE + operator-bench-validated</w:t>
+        <w:t>[DONE] DONE + operator-bench-validated</w:t>
       </w:r>
     </w:p>
     <w:p>
@@ -830,7 +830,7 @@
         <w:ind w:left="360"/>
       </w:pPr>
       <w:r>
-        <w:t>🟡 IN-PROGRESS (committed but not yet bench-validated, or</w:t>
+        <w:t>[WIP] IN-PROGRESS (committed but not yet bench-validated, or</w:t>
       </w:r>
     </w:p>
     <w:p>
@@ -844,7 +844,7 @@
         <w:ind w:left="360"/>
       </w:pPr>
       <w:r>
-        <w:t>⏸ PENDING (planned, not started)</w:t>
+        <w:t>[PEND] PENDING (planned, not started)</w:t>
       </w:r>
     </w:p>
     <w:p>
@@ -853,7 +853,7 @@
         <w:ind w:left="360"/>
       </w:pPr>
       <w:r>
-        <w:t>🟫 N/A (Lyra-native equivalent already shipped; no direct</w:t>
+        <w:t>[N/A] N/A (Lyra-native equivalent already shipped; no direct</w:t>
       </w:r>
     </w:p>
     <w:p>
@@ -1031,7 +1031,7 @@
               <w:rPr>
                 <w:sz w:val="18"/>
               </w:rPr>
-              <w:t>✅</w:t>
+              <w:t>[DONE]</w:t>
             </w:r>
           </w:p>
         </w:tc>
@@ -1121,7 +1121,7 @@
               <w:rPr>
                 <w:sz w:val="18"/>
               </w:rPr>
-              <w:t xml:space="preserve"> (P0.b → P0.d)</w:t>
+              <w:t xml:space="preserve"> (P0.b -&gt; P0.d)</w:t>
             </w:r>
           </w:p>
         </w:tc>
@@ -1139,7 +1139,7 @@
               <w:rPr>
                 <w:sz w:val="18"/>
               </w:rPr>
-              <w:t>✅</w:t>
+              <w:t>[DONE]</w:t>
             </w:r>
           </w:p>
         </w:tc>
@@ -1247,7 +1247,7 @@
               <w:rPr>
                 <w:sz w:val="18"/>
               </w:rPr>
-              <w:t>✅</w:t>
+              <w:t>[DONE]</w:t>
             </w:r>
           </w:p>
         </w:tc>
@@ -1381,7 +1381,7 @@
               <w:rPr>
                 <w:sz w:val="18"/>
               </w:rPr>
-              <w:t>✅</w:t>
+              <w:t>[DONE]</w:t>
             </w:r>
           </w:p>
         </w:tc>
@@ -1445,7 +1445,7 @@
               <w:rPr>
                 <w:sz w:val="18"/>
               </w:rPr>
-              <w:t xml:space="preserve"> alloc moved back to create_cmaster per reference). Mechanical diff = whitespace-only. ✅ </w:t>
+              <w:t xml:space="preserve"> alloc moved back to create_cmaster per reference). Mechanical diff = whitespace-only. [DONE] </w:t>
             </w:r>
             <w:r>
               <w:rPr>
@@ -1522,7 +1522,7 @@
               <w:rPr>
                 <w:sz w:val="18"/>
               </w:rPr>
-              <w:t>✅</w:t>
+              <w:t>[DONE]</w:t>
             </w:r>
           </w:p>
         </w:tc>
@@ -1547,7 +1547,7 @@
               <w:rPr>
                 <w:sz w:val="18"/>
               </w:rPr>
-              <w:t xml:space="preserve"> VERBATIM: cmMAX* sizing macros (16/4/4/2/32), rxid/txid/sp0id/stype/chid/inid/mixinid/getbuffsize, SetRadioStructure + set_cmdefault_rates. main.cpp config: SetRadioStructure(2,1,1,1,0,…) → chid(0,0)=0 RX1 / chid(1,0)=1 TX matches the live channel layout. ✅ Bench PASSED 2026-06-12.</w:t>
+              <w:t xml:space="preserve"> VERBATIM: cmMAX* sizing macros (16/4/4/2/32), rxid/txid/sp0id/stype/chid/inid/mixinid/getbuffsize, SetRadioStructure + set_cmdefault_rates. main.cpp config: SetRadioStructure(2,1,1,1,0,…) -&gt; chid(0,0)=0 RX1 / chid(1,0)=1 TX matches the live channel layout. [DONE] Bench PASSED 2026-06-12.</w:t>
             </w:r>
           </w:p>
         </w:tc>
@@ -1617,7 +1617,7 @@
               <w:rPr>
                 <w:sz w:val="18"/>
               </w:rPr>
-              <w:t>✅</w:t>
+              <w:t>[DONE]</w:t>
             </w:r>
           </w:p>
         </w:tc>
@@ -1733,7 +1733,7 @@
               <w:rPr>
                 <w:sz w:val="18"/>
               </w:rPr>
-              <w:t xml:space="preserve"> at XCreateAnalyzer. ✅ </w:t>
+              <w:t xml:space="preserve"> at XCreateAnalyzer. [DONE] </w:t>
             </w:r>
             <w:r>
               <w:rPr>
@@ -1816,7 +1816,7 @@
               <w:rPr>
                 <w:sz w:val="18"/>
               </w:rPr>
-              <w:t>🟡</w:t>
+              <w:t>[WIP]</w:t>
             </w:r>
           </w:p>
         </w:tc>
@@ -1937,7 +1937,7 @@
               <w:rPr>
                 <w:sz w:val="18"/>
               </w:rPr>
-              <w:t>🟡</w:t>
+              <w:t>[WIP]</w:t>
             </w:r>
           </w:p>
         </w:tc>
@@ -2045,7 +2045,7 @@
               <w:rPr>
                 <w:sz w:val="18"/>
               </w:rPr>
-              <w:t>🟡</w:t>
+              <w:t>[WIP]</w:t>
             </w:r>
           </w:p>
         </w:tc>
@@ -2127,7 +2127,7 @@
               <w:rPr>
                 <w:sz w:val="18"/>
               </w:rPr>
-              <w:t>✅</w:t>
+              <w:t>[DONE]</w:t>
             </w:r>
           </w:p>
         </w:tc>
@@ -2310,7 +2310,7 @@
               <w:rPr>
                 <w:sz w:val="18"/>
               </w:rPr>
-              <w:t>✅</w:t>
+              <w:t>[DONE]</w:t>
             </w:r>
           </w:p>
         </w:tc>
@@ -2361,7 +2361,7 @@
               <w:rPr>
                 <w:sz w:val="18"/>
               </w:rPr>
-              <w:t xml:space="preserve"> = the public RESAMPLE ABI verbatim. WdspEngine RX wire-up: capturing lambda → static member fn + TU-scope context ptr (the reference free-fn+global shape). ✅ </w:t>
+              <w:t xml:space="preserve"> = the public RESAMPLE ABI verbatim. WdspEngine RX wire-up: capturing lambda -&gt; static member fn + TU-scope context ptr (the reference free-fn+global shape). [DONE] </w:t>
             </w:r>
             <w:r>
               <w:rPr>
@@ -2431,7 +2431,7 @@
               <w:rPr>
                 <w:sz w:val="18"/>
               </w:rPr>
-              <w:t>🟫</w:t>
+              <w:t>[N/A]</w:t>
             </w:r>
           </w:p>
         </w:tc>
@@ -2532,7 +2532,7 @@
               <w:rPr>
                 <w:sz w:val="18"/>
               </w:rPr>
-              <w:t>🟫</w:t>
+              <w:t>[N/A]</w:t>
             </w:r>
           </w:p>
         </w:tc>
@@ -2714,7 +2714,7 @@
               <w:rPr>
                 <w:sz w:val="18"/>
               </w:rPr>
-              <w:t>✅</w:t>
+              <w:t>[DONE]</w:t>
             </w:r>
           </w:p>
         </w:tc>
@@ -2828,7 +2828,7 @@
               <w:rPr>
                 <w:sz w:val="18"/>
               </w:rPr>
-              <w:t>🟫</w:t>
+              <w:t>[N/A]</w:t>
             </w:r>
           </w:p>
         </w:tc>
@@ -2916,7 +2916,7 @@
               <w:rPr>
                 <w:sz w:val="18"/>
               </w:rPr>
-              <w:t>⏸</w:t>
+              <w:t>[PEND]</w:t>
             </w:r>
           </w:p>
         </w:tc>
@@ -3004,7 +3004,7 @@
               <w:rPr>
                 <w:sz w:val="18"/>
               </w:rPr>
-              <w:t>⏸</w:t>
+              <w:t>[PEND]</w:t>
             </w:r>
           </w:p>
         </w:tc>
@@ -3085,7 +3085,7 @@
               <w:rPr>
                 <w:sz w:val="18"/>
               </w:rPr>
-              <w:t>⏸</w:t>
+              <w:t>[PEND]</w:t>
             </w:r>
           </w:p>
         </w:tc>
@@ -3166,7 +3166,7 @@
               <w:rPr>
                 <w:sz w:val="18"/>
               </w:rPr>
-              <w:t>🟡</w:t>
+              <w:t>[WIP]</w:t>
             </w:r>
           </w:p>
         </w:tc>
@@ -3273,7 +3273,7 @@
               <w:rPr>
                 <w:sz w:val="18"/>
               </w:rPr>
-              <w:t>🟡</w:t>
+              <w:t>[WIP]</w:t>
             </w:r>
           </w:p>
         </w:tc>
@@ -3361,7 +3361,7 @@
               <w:rPr>
                 <w:sz w:val="18"/>
               </w:rPr>
-              <w:t>⏸</w:t>
+              <w:t>[PEND]</w:t>
             </w:r>
           </w:p>
         </w:tc>
@@ -3442,7 +3442,7 @@
               <w:rPr>
                 <w:sz w:val="18"/>
               </w:rPr>
-              <w:t>🟡</w:t>
+              <w:t>[WIP]</w:t>
             </w:r>
           </w:p>
         </w:tc>
@@ -3612,7 +3612,7 @@
               <w:rPr>
                 <w:sz w:val="18"/>
               </w:rPr>
-              <w:t>⏸</w:t>
+              <w:t>[PEND]</w:t>
             </w:r>
           </w:p>
         </w:tc>
@@ -3694,7 +3694,7 @@
               <w:rPr>
                 <w:sz w:val="18"/>
               </w:rPr>
-              <w:t>⏸</w:t>
+              <w:t>[PEND]</w:t>
             </w:r>
           </w:p>
         </w:tc>
@@ -3776,7 +3776,7 @@
               <w:rPr>
                 <w:sz w:val="18"/>
               </w:rPr>
-              <w:t>⏸</w:t>
+              <w:t>[PEND]</w:t>
             </w:r>
           </w:p>
         </w:tc>
@@ -3858,7 +3858,7 @@
               <w:rPr>
                 <w:sz w:val="18"/>
               </w:rPr>
-              <w:t>⏸</w:t>
+              <w:t>[PEND]</w:t>
             </w:r>
           </w:p>
         </w:tc>
@@ -4041,7 +4041,7 @@
               <w:rPr>
                 <w:sz w:val="18"/>
               </w:rPr>
-              <w:t>🟡</w:t>
+              <w:t>[WIP]</w:t>
             </w:r>
           </w:p>
         </w:tc>
@@ -4072,7 +4072,7 @@
               <w:rPr>
                 <w:sz w:val="18"/>
               </w:rPr>
-              <w:t>. Verified against the reference's keydown/keyup ordering invariants (RX-DSP stop on keydown → wire MOX → TX-DSP start; keyup TX-DSP off → mox_delay → clear MOX → ptt_out_delay → RX-DSP restart). No direct port — C# is study-only by license.</w:t>
+              <w:t>. Verified against the reference's keydown/keyup ordering invariants (RX-DSP stop on keydown -&gt; wire MOX -&gt; TX-DSP start; keyup TX-DSP off -&gt; mox_delay -&gt; clear MOX -&gt; ptt_out_delay -&gt; RX-DSP restart). No direct port — C# is study-only by license.</w:t>
             </w:r>
           </w:p>
         </w:tc>
@@ -4142,7 +4142,7 @@
               <w:rPr>
                 <w:sz w:val="18"/>
               </w:rPr>
-              <w:t>✅</w:t>
+              <w:t>[DONE]</w:t>
             </w:r>
           </w:p>
         </w:tc>
@@ -4224,7 +4224,7 @@
               <w:rPr>
                 <w:sz w:val="18"/>
               </w:rPr>
-              <w:t>🟡</w:t>
+              <w:t>[WIP]</w:t>
             </w:r>
           </w:p>
         </w:tc>
@@ -4345,7 +4345,7 @@
               <w:rPr>
                 <w:sz w:val="18"/>
               </w:rPr>
-              <w:t>⏸</w:t>
+              <w:t>[PEND]</w:t>
             </w:r>
           </w:p>
         </w:tc>
@@ -4427,7 +4427,7 @@
               <w:rPr>
                 <w:sz w:val="18"/>
               </w:rPr>
-              <w:t>🟡</w:t>
+              <w:t>[WIP]</w:t>
             </w:r>
           </w:p>
         </w:tc>
@@ -4464,7 +4464,7 @@
         <w:pStyle w:val="Heading2"/>
       </w:pPr>
       <w:r>
-        <w:t>📅 STAGE INDEX — ordered work plan</w:t>
+        <w:t>STAGE INDEX — ordered work plan</w:t>
       </w:r>
     </w:p>
     <w:p>
@@ -4472,7 +4472,7 @@
         <w:pStyle w:val="Heading3"/>
       </w:pPr>
       <w:r>
-        <w:t>P0 verbatim-rewrite arc (2026-06-09 → current; the ACTIVE plan)</w:t>
+        <w:t>P0 verbatim-rewrite arc (2026-06-09 -&gt; current; the ACTIVE plan)</w:t>
       </w:r>
     </w:p>
     <w:p>
@@ -4602,7 +4602,7 @@
               <w:rPr>
                 <w:sz w:val="18"/>
               </w:rPr>
-              <w:t>✅ DONE</w:t>
+              <w:t>[DONE] DONE</w:t>
             </w:r>
           </w:p>
         </w:tc>
@@ -4691,7 +4691,7 @@
               <w:rPr>
                 <w:sz w:val="18"/>
               </w:rPr>
-              <w:t>✅ DONE</w:t>
+              <w:t>[DONE] DONE</w:t>
             </w:r>
           </w:p>
         </w:tc>
@@ -4709,7 +4709,7 @@
               <w:rPr>
                 <w:sz w:val="18"/>
               </w:rPr>
-              <w:t xml:space="preserve">ilv.{h,c} verbatim → </w:t>
+              <w:t xml:space="preserve">ilv.{h,c} verbatim -&gt; </w:t>
             </w:r>
             <w:r>
               <w:rPr>
@@ -4793,7 +4793,7 @@
               <w:rPr>
                 <w:sz w:val="18"/>
               </w:rPr>
-              <w:t>✅ DONE</w:t>
+              <w:t>[DONE] DONE</w:t>
             </w:r>
           </w:p>
         </w:tc>
@@ -4811,7 +4811,7 @@
               <w:rPr>
                 <w:sz w:val="18"/>
               </w:rPr>
-              <w:t xml:space="preserve">aamix.{h,c} verbatim → </w:t>
+              <w:t xml:space="preserve">aamix.{h,c} verbatim -&gt; </w:t>
             </w:r>
             <w:r>
               <w:rPr>
@@ -4862,7 +4862,7 @@
               <w:rPr>
                 <w:sz w:val="18"/>
               </w:rPr>
-              <w:t>; ✅ operator HL2 RX bench PASSED 2026-06-11</w:t>
+              <w:t>; [DONE] operator HL2 RX bench PASSED 2026-06-11</w:t>
             </w:r>
           </w:p>
         </w:tc>
@@ -4901,7 +4901,7 @@
               <w:rPr>
                 <w:sz w:val="18"/>
               </w:rPr>
-              <w:t>✅ DONE</w:t>
+              <w:t>[DONE] DONE</w:t>
             </w:r>
           </w:p>
         </w:tc>
@@ -4919,7 +4919,7 @@
               <w:rPr>
                 <w:sz w:val="18"/>
               </w:rPr>
-              <w:t xml:space="preserve">cmbuffs/cmaster/cmsetup verbatim → </w:t>
+              <w:t xml:space="preserve">cmbuffs/cmaster/cmsetup verbatim -&gt; </w:t>
             </w:r>
             <w:r>
               <w:rPr>
@@ -4996,7 +4996,7 @@
               <w:rPr>
                 <w:sz w:val="18"/>
               </w:rPr>
-              <w:t xml:space="preserve"> 2026-06-12; ✅ </w:t>
+              <w:t xml:space="preserve"> 2026-06-12; [DONE] </w:t>
             </w:r>
             <w:r>
               <w:rPr>
@@ -5042,7 +5042,7 @@
               <w:rPr>
                 <w:sz w:val="18"/>
               </w:rPr>
-              <w:t>🟡 SHIPPED</w:t>
+              <w:t>[WIP] SHIPPED</w:t>
             </w:r>
           </w:p>
         </w:tc>
@@ -5060,7 +5060,7 @@
               <w:rPr>
                 <w:sz w:val="18"/>
               </w:rPr>
-              <w:t xml:space="preserve">obbuffs.c verbatim → </w:t>
+              <w:t xml:space="preserve">obbuffs.c verbatim -&gt; </w:t>
             </w:r>
             <w:r>
               <w:rPr>
@@ -5130,7 +5130,7 @@
               <w:rPr>
                 <w:sz w:val="18"/>
               </w:rPr>
-              <w:t>⏸</w:t>
+              <w:t>[PEND]</w:t>
             </w:r>
           </w:p>
         </w:tc>
@@ -5199,7 +5199,7 @@
               <w:rPr>
                 <w:sz w:val="18"/>
               </w:rPr>
-              <w:t>⏸</w:t>
+              <w:t>[PEND]</w:t>
             </w:r>
           </w:p>
         </w:tc>
@@ -5268,7 +5268,7 @@
               <w:rPr>
                 <w:sz w:val="18"/>
               </w:rPr>
-              <w:t>⏸</w:t>
+              <w:t>[PEND]</w:t>
             </w:r>
           </w:p>
         </w:tc>
@@ -5451,7 +5451,7 @@
               <w:rPr>
                 <w:sz w:val="18"/>
               </w:rPr>
-              <w:t>✅ DONE</w:t>
+              <w:t>[DONE] DONE</w:t>
             </w:r>
           </w:p>
         </w:tc>
@@ -5526,7 +5526,7 @@
               <w:rPr>
                 <w:sz w:val="18"/>
               </w:rPr>
-              <w:t>✅ DONE</w:t>
+              <w:t>[DONE] DONE</w:t>
             </w:r>
           </w:p>
         </w:tc>
@@ -5601,7 +5601,7 @@
               <w:rPr>
                 <w:sz w:val="18"/>
               </w:rPr>
-              <w:t>✅ DONE (as P0.b)</w:t>
+              <w:t>[DONE] DONE (as P0.b)</w:t>
             </w:r>
           </w:p>
         </w:tc>
@@ -5689,7 +5689,7 @@
               <w:rPr>
                 <w:sz w:val="18"/>
               </w:rPr>
-              <w:t>✅ DONE (as P0.d)</w:t>
+              <w:t>[DONE] DONE (as P0.d)</w:t>
             </w:r>
           </w:p>
         </w:tc>
@@ -5777,7 +5777,7 @@
               <w:rPr>
                 <w:sz w:val="18"/>
               </w:rPr>
-              <w:t>🟫 OBSOLETE</w:t>
+              <w:t>[N/A] OBSOLETE</w:t>
             </w:r>
           </w:p>
         </w:tc>
@@ -5852,7 +5852,7 @@
               <w:rPr>
                 <w:sz w:val="18"/>
               </w:rPr>
-              <w:t>⏸ TBD</w:t>
+              <w:t>[PEND] TBD</w:t>
             </w:r>
           </w:p>
         </w:tc>
@@ -5927,7 +5927,7 @@
               <w:rPr>
                 <w:sz w:val="18"/>
               </w:rPr>
-              <w:t>⏸ TBD</w:t>
+              <w:t>[PEND] TBD</w:t>
             </w:r>
           </w:p>
         </w:tc>
@@ -6002,7 +6002,7 @@
               <w:rPr>
                 <w:sz w:val="18"/>
               </w:rPr>
-              <w:t>⏸ TBD</w:t>
+              <w:t>[PEND] TBD</w:t>
             </w:r>
           </w:p>
         </w:tc>
@@ -6053,7 +6053,7 @@
         <w:t>Ordering note:</w:t>
       </w:r>
       <w:r>
-        <w:t xml:space="preserve"> the P0→P4 sequence above is the active linear plan.  F–H land after P4 Wire-LIVE.  The methodology (smallest revertable step + mechanical diff + operator bench gate) applies within each step.</w:t>
+        <w:t xml:space="preserve"> the P0-&gt;P4 sequence above is the active linear plan.  F–H land after P4 Wire-LIVE.  The methodology (smallest revertable step + mechanical diff + operator bench gate) applies within each step.</w:t>
       </w:r>
     </w:p>
     <w:p>
@@ -6068,7 +6068,7 @@
         <w:pStyle w:val="Heading2"/>
       </w:pPr>
       <w:r>
-        <w:t>🎯 OPEN QUESTIONS FOR OPERATOR</w:t>
+        <w:t>OPEN QUESTIONS FOR OPERATOR</w:t>
       </w:r>
     </w:p>
     <w:p>
@@ -6200,7 +6200,7 @@
         <w:pStyle w:val="Heading2"/>
       </w:pPr>
       <w:r>
-        <w:t>📜 SHIPPED-WORK LOG</w:t>
+        <w:t>SHIPPED-WORK LOG</w:t>
       </w:r>
     </w:p>
     <w:p>
@@ -6213,7 +6213,7 @@
         <w:pStyle w:val="Heading3"/>
       </w:pPr>
       <w:r>
-        <w:t>2026-06-12 — P0.d cmbuffs/cmaster/cmsetup VERBATIM port (✅ HL2 bench PASSED)</w:t>
+        <w:t>2026-06-12 — P0.d cmbuffs/cmaster/cmsetup VERBATIM port ([DONE] HL2 bench PASSED)</w:t>
       </w:r>
     </w:p>
     <w:p>
@@ -6388,7 +6388,7 @@
         <w:ind w:left="360"/>
       </w:pPr>
       <w:r>
-        <w:t xml:space="preserve">✅ </w:t>
+        <w:t xml:space="preserve">[DONE] </w:t>
       </w:r>
       <w:r>
         <w:rPr>
@@ -6407,7 +6407,7 @@
         <w:pStyle w:val="Heading3"/>
       </w:pPr>
       <w:r>
-        <w:t>2026-06-09 → 2026-06-11 — P0.a/P0.b/P0.c verbatim-rewrite arc</w:t>
+        <w:t>2026-06-09 -&gt; 2026-06-11 — P0.a/P0.b/P0.c verbatim-rewrite arc</w:t>
       </w:r>
     </w:p>
     <w:p>
@@ -6421,7 +6421,7 @@
     </w:p>
     <w:p>
       <w:r>
-        <w:t>("I said PORT!") → every ported file rewritten VERBATIM.</w:t>
+        <w:t>("I said PORT!") -&gt; every ported file rewritten VERBATIM.</w:t>
       </w:r>
     </w:p>
     <w:p>
@@ -6486,7 +6486,7 @@
         <w:t>P0.b `1f49d98`</w:t>
       </w:r>
       <w:r>
-        <w:t xml:space="preserve">: ilv.{h,c} verbatim → </w:t>
+        <w:t xml:space="preserve">: ilv.{h,c} verbatim -&gt; </w:t>
       </w:r>
       <w:r>
         <w:rPr>
@@ -6526,7 +6526,7 @@
         <w:t>P0.c `e0f2584`</w:t>
       </w:r>
       <w:r>
-        <w:t xml:space="preserve">: aamix.{h,c} verbatim → </w:t>
+        <w:t xml:space="preserve">: aamix.{h,c} verbatim -&gt; </w:t>
       </w:r>
       <w:r>
         <w:rPr>
@@ -6548,7 +6548,7 @@
         <w:t>wire/resample.h</w:t>
       </w:r>
       <w:r>
-        <w:t xml:space="preserve"> = public RESAMPLE ABI; wdspcalls retyped + flush_resample; WdspEngine outbound lambda → static fn + TU-scope context ptr. ✅ </w:t>
+        <w:t xml:space="preserve"> = public RESAMPLE ABI; wdspcalls retyped + flush_resample; WdspEngine outbound lambda -&gt; static fn + TU-scope context ptr. [DONE] </w:t>
       </w:r>
       <w:r>
         <w:rPr>
@@ -6577,7 +6577,7 @@
         <w:t>Stage B (aamix.c)</w:t>
       </w:r>
       <w:r>
-        <w:t xml:space="preserve"> ✅ direct port shipped + bench-validated</w:t>
+        <w:t xml:space="preserve"> [DONE] direct port shipped + bench-validated</w:t>
       </w:r>
     </w:p>
     <w:p>
@@ -6596,7 +6596,7 @@
         <w:t>27ac2fa</w:t>
       </w:r>
       <w:r>
-        <w:t xml:space="preserve"> → </w:t>
+        <w:t xml:space="preserve"> -&gt; </w:t>
       </w:r>
       <w:r>
         <w:rPr>
@@ -6622,7 +6622,7 @@
         <w:ind w:left="360"/>
       </w:pPr>
       <w:r>
-        <w:t>Operator HL2+ bench 19:27:49 → 19:28:47: audible RX through</w:t>
+        <w:t>Operator HL2+ bench 19:27:49 -&gt; 19:28:47: audible RX through</w:t>
       </w:r>
     </w:p>
     <w:p>
@@ -6822,7 +6822,7 @@
         <w:pStyle w:val="Heading2"/>
       </w:pPr>
       <w:r>
-        <w:t>▶ RESUME POINTER (next session)</w:t>
+        <w:t>RESUME POINTER (next session)</w:t>
       </w:r>
     </w:p>
     <w:p>
@@ -6951,7 +6951,7 @@
         <w:color w:val="808080"/>
         <w:sz w:val="16"/>
       </w:rPr>
-      <w:t>Lyra-cpp Execution Plan — auto-generated 2026-06-12 11:24 (source: docs/EXECUTION_PLAN.md)</w:t>
+      <w:t>Lyra-cpp Execution Plan — auto-generated 2026-06-12 11:34 (source: docs/EXECUTION_PLAN.md)</w:t>
     </w:r>
   </w:p>
 </w:hdr>

</xml_diff>

<commit_message>
docs: record P3 HL2 bench PASSED — P4 Wire-LIVE unblocked
Operator bench 2026-06-12: RX fine on the P3 lifecycle
(once-per-process create_rnet, per-session obbuffs rings, TX
outbound registration live).  P3 row flipped to [DONE] in the
stage table; siblings regenerated.

Co-Authored-By: Claude Fable 5 <noreply@anthropic.com>
</commit_message>
<xml_diff>
--- a/docs/THETIS_DIRECT_PORT_PLAN.docx
+++ b/docs/THETIS_DIRECT_PORT_PLAN.docx
@@ -5283,7 +5283,7 @@
               <w:rPr>
                 <w:sz w:val="18"/>
               </w:rPr>
-              <w:t>[WIP]</w:t>
+              <w:t>[DONE]</w:t>
             </w:r>
           </w:p>
         </w:tc>
@@ -5308,13 +5308,13 @@
                 <w:b/>
                 <w:sz w:val="18"/>
               </w:rPr>
-              <w:t>SHIPPED 2026-06-12, HL2 bench PENDING</w:t>
-            </w:r>
-            <w:r>
-              <w:rPr>
-                <w:sz w:val="18"/>
-              </w:rPr>
-              <w:t xml:space="preserve"> — create_rnet moved to once-per-process at the main.cpp QTimer AFTER create_xmtr (the reference C#-init order; fixes the per-open prn re-allocation leak); SendpOutboundTx(OutBound) restored at the reference site (netInterface.c:1761, tail of create_rnet); UpdateRadioProtocolSampleSize verbatim (netInterface.c:1836-1858, diff IDENTICAL) called per-open per StartAudio:45 — creates obbuffs rings 0/1 (2 new ob_main pump threads per session, idle: no producers until P4); destroy_obbuffs(0/1) at close() per StopAudio:112-113.  RX side deliberately NOT registered (WdspEngine hybrid owns RX dispatch until P4 — the B.6.b clobber class).</w:t>
+              <w:t>SHIPPED + operator HL2 bench PASSED 2026-06-12</w:t>
+            </w:r>
+            <w:r>
+              <w:rPr>
+                <w:sz w:val="18"/>
+              </w:rPr>
+              <w:t xml:space="preserve"> (RX fine; stop/start + shutdown clean) — create_rnet moved to once-per-process at the main.cpp QTimer AFTER create_xmtr (the reference C#-init order; fixes the per-open prn re-allocation leak); SendpOutboundTx(OutBound) restored at the reference site (netInterface.c:1761, tail of create_rnet); UpdateRadioProtocolSampleSize verbatim (netInterface.c:1836-1858, diff IDENTICAL) called per-open per StartAudio:45 — creates obbuffs rings 0/1 (2 new ob_main pump threads per session, idle: no producers until P4); destroy_obbuffs(0/1) at close() per StopAudio:112-113.  RX side deliberately NOT registered (WdspEngine hybrid owns RX dispatch until P4 — the B.6.b clobber class).</w:t>
             </w:r>
           </w:p>
         </w:tc>
@@ -5330,16 +5330,9 @@
             </w:r>
             <w:r>
               <w:rPr>
-                <w:b/>
-                <w:sz w:val="18"/>
-              </w:rPr>
-              <w:t>OPERATOR HL2 BENCH GATE</w:t>
-            </w:r>
-            <w:r>
-              <w:rPr>
-                <w:sz w:val="18"/>
-              </w:rPr>
-              <w:t>: RX works; multiple stop/start cycles clean; clean app shutdown (ob threads join via destroy_obbuffs).</w:t>
+                <w:sz w:val="18"/>
+              </w:rPr>
+              <w:t>[DONE] Operator HL2 bench PASSED 2026-06-12.</w:t>
             </w:r>
           </w:p>
         </w:tc>
@@ -7061,7 +7054,7 @@
         <w:color w:val="808080"/>
         <w:sz w:val="16"/>
       </w:rPr>
-      <w:t>Lyra-cpp Execution Plan — auto-generated 2026-06-12 15:04 (source: docs/EXECUTION_PLAN.md)</w:t>
+      <w:t>Lyra-cpp Execution Plan — auto-generated 2026-06-12 15:21 (source: docs/EXECUTION_PLAN.md)</w:t>
     </w:r>
   </w:p>
 </w:hdr>

</xml_diff>

<commit_message>
docs: P4.a prep complete — plan row + session log at the P4.a boundary
Co-Authored-By: Claude Fable 5 <noreply@anthropic.com>
</commit_message>
<xml_diff>
--- a/docs/THETIS_DIRECT_PORT_PLAN.docx
+++ b/docs/THETIS_DIRECT_PORT_PLAN.docx
@@ -5371,7 +5371,7 @@
               <w:rPr>
                 <w:sz w:val="18"/>
               </w:rPr>
-              <w:t>[PEND]</w:t>
+              <w:t>[WIP]</w:t>
             </w:r>
           </w:p>
         </w:tc>
@@ -5389,7 +5389,20 @@
               <w:rPr>
                 <w:sz w:val="18"/>
               </w:rPr>
-              <w:t>Wire-LIVE switchover</w:t>
+              <w:t xml:space="preserve">Wire-LIVE switchover.  </w:t>
+            </w:r>
+            <w:r>
+              <w:rPr>
+                <w:b/>
+                <w:sz w:val="18"/>
+              </w:rPr>
+              <w:t>P4.a prep COMPLETE 2026-06-12</w:t>
+            </w:r>
+            <w:r>
+              <w:rPr>
+                <w:sz w:val="18"/>
+              </w:rPr>
+              <w:t xml:space="preserve"> (2 wire-inert commits): sendProtocol1Samples ported verbatim into NEW src/wire/NetworkProto1.cpp (networkproto1.c:1204-1267, mechanical diff IDENTICAL; DORMANT — thread not started until P4.b) + io_keep_running global + the FrameComposer write_main_loop_hl2 tail flipped to the verbatim ReleaseSemaphore(hobbuffsRun[0/1]) pair; SetTXAPostGen{Run,Mode,ToneMag,ToneFreq,TTMag,TTFreq} wdspcalls entries (pre-cdef audit: gen.c:784-833 definition-site signatures, all 6 verified in the bundled wdsp.dll export table); TxReadBufp -&gt; verbatim double* + create_rnet calloc (netInterface.c:1604) + Ep6RecvThread callers bent; hWriteThreadMain -&gt; verbatim HANDLE.</w:t>
             </w:r>
           </w:p>
         </w:tc>
@@ -5407,7 +5420,7 @@
               <w:rPr>
                 <w:sz w:val="18"/>
               </w:rPr>
-              <w:t>ONE commit, full HL2 bench gate</w:t>
+              <w:t>NEXT = P4.b: the switchover, ONE commit, full HL2 bench gate (quartet + _beginthreadex at open(); dispatchAudioFrame asioOUT tee; Inbound(inid(1,0),...) mic feed; FSM TXA arming + TUN postgen; control-plane mapping; Step-14 translation retirements).</w:t>
             </w:r>
           </w:p>
         </w:tc>
@@ -7054,7 +7067,7 @@
         <w:color w:val="808080"/>
         <w:sz w:val="16"/>
       </w:rPr>
-      <w:t>Lyra-cpp Execution Plan — auto-generated 2026-06-12 15:21 (source: docs/EXECUTION_PLAN.md)</w:t>
+      <w:t>Lyra-cpp Execution Plan — auto-generated 2026-06-12 19:00 (source: docs/EXECUTION_PLAN.md)</w:t>
     </w:r>
   </w:p>
 </w:hdr>

</xml_diff>

<commit_message>
docs: reconcile direct-port plan + session log; ATT-on-TX §15.31 doc
- Generalize tools/sync_execution_plan.py to drive any MD (--md/--docx/
  --pdf-path/--title/--no-docx; title auto-derives from the first H1).
- docs/THETIS_DIRECT_PORT_PLAN.md reconciled to shipped reality:
  obbuffs/P1 -> [DONE]; compress/cfcomp/eqp -> [N/A] (native-superseded);
  leveler/ALC metering softened to "shipped in code; #160 bench
  close-out + tester field-confirm still in progress" (not over-claimed);
  ATT-on-TX row corrected ([WIP] — wire-live but the AttOnTxPolicy class
  is unused) + the §15.31 UI-surface note.
- SESSION_LOG.md: §15.31 ATT-on-TX UI entry + the doc-reconciliation pass.
- USER_GUIDE.md: Settings -> TX "ATT on TX (RX-ADC protection)" section
  + the front-panel ATT-lamp states.
- IVAC_PORT_PLAN.md: #90 monitor design-lock note (Stage 5 shared tap).
- PDF/DOCX regenerated for the session log + the direct-port plan.

Co-Authored-By: Claude Opus 4.8 (1M context) <noreply@anthropic.com>
</commit_message>
<xml_diff>
--- a/docs/THETIS_DIRECT_PORT_PLAN.docx
+++ b/docs/THETIS_DIRECT_PORT_PLAN.docx
@@ -808,6 +808,851 @@
       </w:pPr>
       <w:r>
         <w:t>STATUS REGISTRY — what's done, in-progress, pending</w:t>
+      </w:r>
+    </w:p>
+    <w:p>
+      <w:pPr>
+        <w:ind w:left="432"/>
+      </w:pPr>
+      <w:r>
+        <w:rPr>
+          <w:i/>
+          <w:color w:val="505050"/>
+        </w:rPr>
+        <w:t>⭐ **2026-06-13 — TX BRING-UP COMPLETE (P0 → P4.b) + SHIPPED.**</w:t>
+      </w:r>
+    </w:p>
+    <w:p>
+      <w:pPr>
+        <w:ind w:left="432"/>
+      </w:pPr>
+      <w:r>
+        <w:rPr>
+          <w:i/>
+          <w:color w:val="505050"/>
+        </w:rPr>
+        <w:t>The verbatim direct-port wire chain is LIVE and operator-HL2-bench-passed:</w:t>
+      </w:r>
+    </w:p>
+    <w:p>
+      <w:pPr>
+        <w:ind w:left="432"/>
+      </w:pPr>
+      <w:r>
+        <w:rPr>
+          <w:i/>
+          <w:color w:val="505050"/>
+        </w:rPr>
+        <w:t>SSB voice both sidebands, Phase-3-EXIT RF-safety kill-test, TUN</w:t>
+      </w:r>
+    </w:p>
+    <w:p>
+      <w:pPr>
+        <w:ind w:left="432"/>
+      </w:pPr>
+      <w:r>
+        <w:rPr>
+          <w:i/>
+          <w:color w:val="505050"/>
+        </w:rPr>
+        <w:t>Thetis-exact zero-beat, and **MSHV → TCI → FT8 real on-air QSOs**</w:t>
+      </w:r>
+    </w:p>
+    <w:p>
+      <w:pPr>
+        <w:ind w:left="432"/>
+      </w:pPr>
+      <w:r>
+        <w:rPr>
+          <w:i/>
+          <w:color w:val="505050"/>
+        </w:rPr>
+        <w:t>(incl. F4FLF ~4160 mi DX).  §7 dead-code retirements done.  Released as</w:t>
+      </w:r>
+    </w:p>
+    <w:p>
+      <w:pPr>
+        <w:ind w:left="432"/>
+      </w:pPr>
+      <w:r>
+        <w:rPr>
+          <w:i/>
+          <w:color w:val="505050"/>
+        </w:rPr>
+        <w:t>**v0.2.3** (`main` == `tx-rebuild` == `e8aafbc`; tags `v0.2.3` +</w:t>
+      </w:r>
+    </w:p>
+    <w:p>
+      <w:pPr>
+        <w:ind w:left="432"/>
+      </w:pPr>
+      <w:r>
+        <w:rPr>
+          <w:i/>
+          <w:color w:val="505050"/>
+        </w:rPr>
+        <w:t>`tx-working-2026-06-13`; GitHub Release + installer published).  Normal</w:t>
+      </w:r>
+    </w:p>
+    <w:p>
+      <w:pPr>
+        <w:ind w:left="432"/>
+      </w:pPr>
+      <w:r>
+        <w:rPr>
+          <w:i/>
+          <w:color w:val="505050"/>
+        </w:rPr>
+        <w:t>feature dev resumes off `main`.  Next milestones: PC/VAC mic-input paths</w:t>
+      </w:r>
+    </w:p>
+    <w:p>
+      <w:pPr>
+        <w:ind w:left="432"/>
+      </w:pPr>
+      <w:r>
+        <w:rPr>
+          <w:i/>
+          <w:color w:val="505050"/>
+        </w:rPr>
+        <w:t>(#102/#103/#104), then v0.3 PureSignal (the P0.d `_cmaster` struct</w:t>
+      </w:r>
+    </w:p>
+    <w:p>
+      <w:pPr>
+        <w:ind w:left="432"/>
+      </w:pPr>
+      <w:r>
+        <w:rPr>
+          <w:i/>
+          <w:color w:val="505050"/>
+        </w:rPr>
+        <w:t>already carries the full PS surface — no retrofit).</w:t>
+      </w:r>
+    </w:p>
+    <w:p>
+      <w:pPr>
+        <w:ind w:left="432"/>
+      </w:pPr>
+      <w:r>
+        <w:rPr>
+          <w:i/>
+          <w:color w:val="505050"/>
+        </w:rPr>
+        <w:t>⭐ **2026-06-15 — VAC (#102/#158) SHIPPED as v0.3.0; post-P4 ordering LOCKED.**</w:t>
+      </w:r>
+    </w:p>
+    <w:p>
+      <w:pPr>
+        <w:ind w:left="432"/>
+      </w:pPr>
+      <w:r>
+        <w:rPr>
+          <w:i/>
+          <w:color w:val="505050"/>
+        </w:rPr>
+        <w:t>The next-milestone PC/VAC mic-input path shipped: the `ivac.c` →</w:t>
+      </w:r>
+    </w:p>
+    <w:p>
+      <w:pPr>
+        <w:ind w:left="432"/>
+      </w:pPr>
+      <w:r>
+        <w:rPr>
+          <w:i/>
+          <w:color w:val="505050"/>
+        </w:rPr>
+        <w:t>`wire/IVAC` device-layer rework (single full-duplex PortAudio stream,</w:t>
+      </w:r>
+    </w:p>
+    <w:p>
+      <w:pPr>
+        <w:ind w:left="432"/>
+      </w:pPr>
+      <w:r>
+        <w:rPr>
+          <w:i/>
+          <w:color w:val="505050"/>
+        </w:rPr>
+        <w:t>VAC/TCI crash fixes, RX-muted-on-TX) released as **v0.3.0** (`main` ==</w:t>
+      </w:r>
+    </w:p>
+    <w:p>
+      <w:pPr>
+        <w:ind w:left="432"/>
+      </w:pPr>
+      <w:r>
+        <w:rPr>
+          <w:i/>
+          <w:color w:val="505050"/>
+        </w:rPr>
+        <w:t>`tx-rebuild`).  **Open loose-end from that arc:** the TX MIC/ALC meters</w:t>
+      </w:r>
+    </w:p>
+    <w:p>
+      <w:pPr>
+        <w:ind w:left="432"/>
+      </w:pPr>
+      <w:r>
+        <w:rPr>
+          <w:i/>
+          <w:color w:val="505050"/>
+        </w:rPr>
+        <w:t>were re-homed onto `GetTXAMeter(chid(1,0)=1)` *inside* the VAC work</w:t>
+      </w:r>
+    </w:p>
+    <w:p>
+      <w:pPr>
+        <w:ind w:left="432"/>
+      </w:pPr>
+      <w:r>
+        <w:rPr>
+          <w:i/>
+          <w:color w:val="505050"/>
+        </w:rPr>
+        <w:t>("#158 (post-DL) re-home" in `metermodel.cpp` / `wdsp_engine.cpp`) but</w:t>
+      </w:r>
+    </w:p>
+    <w:p>
+      <w:pPr>
+        <w:ind w:left="432"/>
+      </w:pPr>
+      <w:r>
+        <w:rPr>
+          <w:i/>
+          <w:color w:val="505050"/>
+        </w:rPr>
+        <w:t>never got their own bench gate — operator reports MIC/ALC read nothing.</w:t>
+      </w:r>
+    </w:p>
+    <w:p>
+      <w:pPr>
+        <w:ind w:left="432"/>
+      </w:pPr>
+      <w:r>
+        <w:rPr>
+          <w:i/>
+          <w:color w:val="505050"/>
+        </w:rPr>
+        <w:t>Treat as **UNVERIFIED, not done** (the WDSP-TX-chain leveler/ALC rows are</w:t>
+      </w:r>
+    </w:p>
+    <w:p>
+      <w:pPr>
+        <w:ind w:left="432"/>
+      </w:pPr>
+      <w:r>
+        <w:rPr>
+          <w:i/>
+          <w:color w:val="505050"/>
+        </w:rPr>
+        <w:t>`[WIP] "confirm reference-parity"`).  Closing it = a deep Thetis read of</w:t>
+      </w:r>
+    </w:p>
+    <w:p>
+      <w:pPr>
+        <w:ind w:left="432"/>
+      </w:pPr>
+      <w:r>
+        <w:rPr>
+          <w:i/>
+          <w:color w:val="505050"/>
+        </w:rPr>
+        <w:t>the TX-meter read/display path (which `txaMeterType`, which channel,</w:t>
+      </w:r>
+    </w:p>
+    <w:p>
+      <w:pPr>
+        <w:ind w:left="432"/>
+      </w:pPr>
+      <w:r>
+        <w:rPr>
+          <w:i/>
+          <w:color w:val="505050"/>
+        </w:rPr>
+        <w:t>where in the chain) + port + bench gate.  Code-level contributors found</w:t>
+      </w:r>
+    </w:p>
+    <w:p>
+      <w:pPr>
+        <w:ind w:left="432"/>
+      </w:pPr>
+      <w:r>
+        <w:rPr>
+          <w:i/>
+          <w:color w:val="505050"/>
+        </w:rPr>
+        <w:t>so far (candidates, NOT yet root-caused — do not patch blind): the</w:t>
+      </w:r>
+    </w:p>
+    <w:p>
+      <w:pPr>
+        <w:ind w:left="432"/>
+      </w:pPr>
+      <w:r>
+        <w:rPr>
+          <w:i/>
+          <w:color w:val="505050"/>
+        </w:rPr>
+        <w:t>secondary-readout line is still hard-stubbed `"—"` (`formatSecondaryText`,</w:t>
+      </w:r>
+    </w:p>
+    <w:p>
+      <w:pPr>
+        <w:ind w:left="432"/>
+      </w:pPr>
+      <w:r>
+        <w:rPr>
+          <w:i/>
+          <w:color w:val="505050"/>
+        </w:rPr>
+        <w:t>metermodel.cpp:577-582); and the AK4951 codec mic delivers zero into the</w:t>
+      </w:r>
+    </w:p>
+    <w:p>
+      <w:pPr>
+        <w:ind w:left="432"/>
+      </w:pPr>
+      <w:r>
+        <w:rPr>
+          <w:i/>
+          <w:color w:val="505050"/>
+        </w:rPr>
+        <w:t>TXA until a rate change because the at-open seed (hl2_stream.cpp:837)</w:t>
+      </w:r>
+    </w:p>
+    <w:p>
+      <w:pPr>
+        <w:ind w:left="432"/>
+      </w:pPr>
+      <w:r>
+        <w:rPr>
+          <w:i/>
+          <w:color w:val="505050"/>
+        </w:rPr>
+        <w:t>sets the rate bits but not `mic_decimation_factor` (defaults 0 = the</w:t>
+      </w:r>
+    </w:p>
+    <w:p>
+      <w:pPr>
+        <w:ind w:left="432"/>
+      </w:pPr>
+      <w:r>
+        <w:rPr>
+          <w:i/>
+          <w:color w:val="505050"/>
+        </w:rPr>
+        <w:t>`++count == factor` harvest gate never fires).</w:t>
+      </w:r>
+    </w:p>
+    <w:p>
+      <w:r>
+        <w:t>&gt;</w:t>
+      </w:r>
+    </w:p>
+    <w:p>
+      <w:pPr>
+        <w:ind w:left="432"/>
+      </w:pPr>
+      <w:r>
+        <w:rPr>
+          <w:i/>
+          <w:color w:val="505050"/>
+        </w:rPr>
+        <w:t>**LOCKED post-P4 feature ordering (operator decision 2026-06-15):**</w:t>
+      </w:r>
+    </w:p>
+    <w:p>
+      <w:pPr>
+        <w:ind w:left="432"/>
+      </w:pPr>
+      <w:r>
+        <w:rPr>
+          <w:i/>
+          <w:color w:val="505050"/>
+        </w:rPr>
+        <w:t>1. **TX MIC/ALC metering** — Thetis-reference read + port + bench</w:t>
+      </w:r>
+    </w:p>
+    <w:p>
+      <w:pPr>
+        <w:ind w:left="432"/>
+      </w:pPr>
+      <w:r>
+        <w:rPr>
+          <w:i/>
+          <w:color w:val="505050"/>
+        </w:rPr>
+        <w:t xml:space="preserve">   (closes out the VAC arc; verify-first, counters-first per the locked</w:t>
+      </w:r>
+    </w:p>
+    <w:p>
+      <w:pPr>
+        <w:ind w:left="432"/>
+      </w:pPr>
+      <w:r>
+        <w:rPr>
+          <w:i/>
+          <w:color w:val="505050"/>
+        </w:rPr>
+        <w:t xml:space="preserve">   methodology — do NOT patch the candidates above blind).</w:t>
+      </w:r>
+    </w:p>
+    <w:p>
+      <w:pPr>
+        <w:ind w:left="432"/>
+      </w:pPr>
+      <w:r>
+        <w:rPr>
+          <w:i/>
+          <w:color w:val="505050"/>
+        </w:rPr>
+        <w:t>2. **Stage F — TX DSP chain** (EQ / compressor-Combinator / leveler /</w:t>
+      </w:r>
+    </w:p>
+    <w:p>
+      <w:pPr>
+        <w:ind w:left="432"/>
+      </w:pPr>
+      <w:r>
+        <w:rPr>
+          <w:i/>
+          <w:color w:val="505050"/>
+        </w:rPr>
+        <w:t xml:space="preserve">   ALC + their meters; broad TX value; feeds the in-flight #49 Profile</w:t>
+      </w:r>
+    </w:p>
+    <w:p>
+      <w:pPr>
+        <w:ind w:left="432"/>
+      </w:pPr>
+      <w:r>
+        <w:rPr>
+          <w:i/>
+          <w:color w:val="505050"/>
+        </w:rPr>
+        <w:t xml:space="preserve">   Manager).</w:t>
+      </w:r>
+    </w:p>
+    <w:p>
+      <w:pPr>
+        <w:ind w:left="432"/>
+      </w:pPr>
+      <w:r>
+        <w:rPr>
+          <w:i/>
+          <w:color w:val="505050"/>
+        </w:rPr>
+        <w:t>3. **RX2 + Split** (#96–#101) — daily-use value, AND it builds the</w:t>
+      </w:r>
+    </w:p>
+    <w:p>
+      <w:pPr>
+        <w:ind w:left="432"/>
+      </w:pPr>
+      <w:r>
+        <w:rPr>
+          <w:i/>
+          <w:color w:val="505050"/>
+        </w:rPr>
+        <w:t xml:space="preserve">   `(mox, ps_armed, rx2_enabled)` DDC-dispatch state machine that PS</w:t>
+      </w:r>
+    </w:p>
+    <w:p>
+      <w:pPr>
+        <w:ind w:left="432"/>
+      </w:pPr>
+      <w:r>
+        <w:rPr>
+          <w:i/>
+          <w:color w:val="505050"/>
+        </w:rPr>
+        <w:t xml:space="preserve">   reuses (RX2 lives on DDC1; PS commandeers DDC0/DDC1 during MOX+PS).</w:t>
+      </w:r>
+    </w:p>
+    <w:p>
+      <w:pPr>
+        <w:ind w:left="432"/>
+      </w:pPr>
+      <w:r>
+        <w:rPr>
+          <w:i/>
+          <w:color w:val="505050"/>
+        </w:rPr>
+        <w:t>4. **PureSignal (Stage G/H, v0.3)** — LAST.  Narrowest audience (needs</w:t>
+      </w:r>
+    </w:p>
+    <w:p>
+      <w:pPr>
+        <w:ind w:left="432"/>
+      </w:pPr>
+      <w:r>
+        <w:rPr>
+          <w:i/>
+          <w:color w:val="505050"/>
+        </w:rPr>
+        <w:t xml:space="preserve">   the HL2 hardware mod + PS gateware), deepest / most cross-cutting</w:t>
+      </w:r>
+    </w:p>
+    <w:p>
+      <w:pPr>
+        <w:ind w:left="432"/>
+      </w:pPr>
+      <w:r>
+        <w:rPr>
+          <w:i/>
+          <w:color w:val="505050"/>
+        </w:rPr>
+        <w:t xml:space="preserve">   surface; lands on top of the dispatch foundation RX2 builds, no wire</w:t>
+      </w:r>
+    </w:p>
+    <w:p>
+      <w:pPr>
+        <w:ind w:left="432"/>
+      </w:pPr>
+      <w:r>
+        <w:rPr>
+          <w:i/>
+          <w:color w:val="505050"/>
+        </w:rPr>
+        <w:t xml:space="preserve">   retrofit (the P0.d `_cmaster` struct already carries the PS surface).</w:t>
+      </w:r>
+    </w:p>
+    <w:p>
+      <w:pPr>
+        <w:ind w:left="432"/>
+      </w:pPr>
+      <w:r>
+        <w:rPr>
+          <w:i/>
+          <w:color w:val="505050"/>
+        </w:rPr>
+        <w:t xml:space="preserve">   Rationale: PS gets cheaper + safer AFTER RX2, not merely</w:t>
+      </w:r>
+    </w:p>
+    <w:p>
+      <w:pPr>
+        <w:ind w:left="432"/>
+      </w:pPr>
+      <w:r>
+        <w:rPr>
+          <w:i/>
+          <w:color w:val="505050"/>
+        </w:rPr>
+        <w:t xml:space="preserve">   lower-priority.  The plan's F-before-G was version cadence (v0.2.x</w:t>
+      </w:r>
+    </w:p>
+    <w:p>
+      <w:pPr>
+        <w:ind w:left="432"/>
+      </w:pPr>
+      <w:r>
+        <w:rPr>
+          <w:i/>
+          <w:color w:val="505050"/>
+        </w:rPr>
+        <w:t xml:space="preserve">   dynamics → v0.3 PS), NOT a hard compile dependency — so RX2 slots</w:t>
+      </w:r>
+    </w:p>
+    <w:p>
+      <w:pPr>
+        <w:ind w:left="432"/>
+      </w:pPr>
+      <w:r>
+        <w:rPr>
+          <w:i/>
+          <w:color w:val="505050"/>
+        </w:rPr>
+        <w:t xml:space="preserve">   between F and PS.</w:t>
+      </w:r>
+    </w:p>
+    <w:p>
+      <w:pPr>
+        <w:ind w:left="432"/>
+      </w:pPr>
+      <w:r>
+        <w:rPr>
+          <w:i/>
+          <w:color w:val="505050"/>
+        </w:rPr>
+        <w:t>⭐ **2026-06-17 — VAC closeout v0.3.1 + Stage-F native TX DSP rack +</w:t>
+      </w:r>
+    </w:p>
+    <w:p>
+      <w:pPr>
+        <w:ind w:left="432"/>
+      </w:pPr>
+      <w:r>
+        <w:rPr>
+          <w:i/>
+          <w:color w:val="505050"/>
+        </w:rPr>
+        <w:t>Profiles + TX monitor SHIPPED (post-P4).**  All native (Lyra-side, NOT</w:t>
+      </w:r>
+    </w:p>
+    <w:p>
+      <w:pPr>
+        <w:ind w:left="432"/>
+      </w:pPr>
+      <w:r>
+        <w:rPr>
+          <w:i/>
+          <w:color w:val="505050"/>
+        </w:rPr>
+        <w:t>direct ports — see the SHIPPED-WORK LOG entry for hashes).  **v0.3.1**</w:t>
+      </w:r>
+    </w:p>
+    <w:p>
+      <w:pPr>
+        <w:ind w:left="432"/>
+      </w:pPr>
+      <w:r>
+        <w:rPr>
+          <w:i/>
+          <w:color w:val="505050"/>
+        </w:rPr>
+        <w:t>(`a3a517f`, 2026-06-15) closed the VAC arc: the enable/disable crash fix,</w:t>
+      </w:r>
+    </w:p>
+    <w:p>
+      <w:pPr>
+        <w:ind w:left="432"/>
+      </w:pPr>
+      <w:r>
+        <w:rPr>
+          <w:i/>
+          <w:color w:val="505050"/>
+        </w:rPr>
+        <w:t>Vol/Mute routed to VAC, AND the TX MIC/ALC/LEV metering the v0.3.0 banner</w:t>
+      </w:r>
+    </w:p>
+    <w:p>
+      <w:pPr>
+        <w:ind w:left="432"/>
+      </w:pPr>
+      <w:r>
+        <w:rPr>
+          <w:i/>
+          <w:color w:val="505050"/>
+        </w:rPr>
+        <w:t>above flagged UNVERIFIED is now wired Thetis-format (`9594bd5` #160) — so</w:t>
+      </w:r>
+    </w:p>
+    <w:p>
+      <w:pPr>
+        <w:ind w:left="432"/>
+      </w:pPr>
+      <w:r>
+        <w:rPr>
+          <w:i/>
+          <w:color w:val="505050"/>
+        </w:rPr>
+        <w:t>that loose-end is **resolved in code** (the WDSP leveler/ALC rows below are</w:t>
+      </w:r>
+    </w:p>
+    <w:p>
+      <w:pPr>
+        <w:ind w:left="432"/>
+      </w:pPr>
+      <w:r>
+        <w:rPr>
+          <w:i/>
+          <w:color w:val="505050"/>
+        </w:rPr>
+        <w:t>flipped to [DONE] for their cffi bindings + metering wiring).  NOTE: the</w:t>
+      </w:r>
+    </w:p>
+    <w:p>
+      <w:pPr>
+        <w:ind w:left="432"/>
+      </w:pPr>
+      <w:r>
+        <w:rPr>
+          <w:i/>
+          <w:color w:val="505050"/>
+        </w:rPr>
+        <w:t>#160 metering **bench close-out + Brent/Timmy v0.3.1 field-confirmation are</w:t>
+      </w:r>
+    </w:p>
+    <w:p>
+      <w:pPr>
+        <w:ind w:left="432"/>
+      </w:pPr>
+      <w:r>
+        <w:rPr>
+          <w:i/>
+          <w:color w:val="505050"/>
+        </w:rPr>
+        <w:t>still IN PROGRESS** — the meters are shipped, not yet field-validated.</w:t>
+      </w:r>
+    </w:p>
+    <w:p>
+      <w:pPr>
+        <w:ind w:left="432"/>
+      </w:pPr>
+      <w:r>
+        <w:rPr>
+          <w:i/>
+          <w:color w:val="505050"/>
+        </w:rPr>
+        <w:t>**Stage F TX DSP rack (native):**</w:t>
+      </w:r>
+    </w:p>
+    <w:p>
+      <w:pPr>
+        <w:ind w:left="432"/>
+      </w:pPr>
+      <w:r>
+        <w:rPr>
+          <w:i/>
+          <w:color w:val="505050"/>
+        </w:rPr>
+        <w:t>8-band parametric EQ (#50), Speech processor / Auto-AGC leveller + de-esser</w:t>
+      </w:r>
+    </w:p>
+    <w:p>
+      <w:pPr>
+        <w:ind w:left="432"/>
+      </w:pPr>
+      <w:r>
+        <w:rPr>
+          <w:i/>
+          <w:color w:val="505050"/>
+        </w:rPr>
+        <w:t>(#88), X-Air-style Combinator (#51), Plate (#52), with digital-mode</w:t>
+      </w:r>
+    </w:p>
+    <w:p>
+      <w:pPr>
+        <w:ind w:left="432"/>
+      </w:pPr>
+      <w:r>
+        <w:rPr>
+          <w:i/>
+          <w:color w:val="505050"/>
+        </w:rPr>
+        <w:t>auto-bypass + digital/CW lamp dim (#163).  **Profiles #49** rack</w:t>
+      </w:r>
+    </w:p>
+    <w:p>
+      <w:pPr>
+        <w:ind w:left="432"/>
+      </w:pPr>
+      <w:r>
+        <w:rPr>
+          <w:i/>
+          <w:color w:val="505050"/>
+        </w:rPr>
+        <w:t>capture/apply (schema v3) + sideband/band-agnostic SSB profile + panel-lock</w:t>
+      </w:r>
+    </w:p>
+    <w:p>
+      <w:pPr>
+        <w:ind w:left="432"/>
+      </w:pPr>
+      <w:r>
+        <w:rPr>
+          <w:i/>
+          <w:color w:val="505050"/>
+        </w:rPr>
+        <w:t>fix + Speech-profile capture/lamp refresh (#162).  **TX audio monitor #90**</w:t>
+      </w:r>
+    </w:p>
+    <w:p>
+      <w:pPr>
+        <w:ind w:left="432"/>
+      </w:pPr>
+      <w:r>
+        <w:rPr>
+          <w:i/>
+          <w:color w:val="505050"/>
+        </w:rPr>
+        <w:t>— 3 reference-faithful routes (HL2 jack / VAC device / TCI RX-audio) + the</w:t>
+      </w:r>
+    </w:p>
+    <w:p>
+      <w:pPr>
+        <w:ind w:left="432"/>
+      </w:pPr>
+      <w:r>
+        <w:rPr>
+          <w:i/>
+          <w:color w:val="505050"/>
+        </w:rPr>
+        <w:t>inline Audio-panel "Out" picker &amp; MON→MON-TX relabel (#164).  Released as</w:t>
+      </w:r>
+    </w:p>
+    <w:p>
+      <w:pPr>
+        <w:ind w:left="432"/>
+      </w:pPr>
+      <w:r>
+        <w:rPr>
+          <w:i/>
+          <w:color w:val="505050"/>
+        </w:rPr>
+        <w:t>**v0.3.1** (`main` == `tx-rebuild`); the native DSP/profile/monitor work</w:t>
+      </w:r>
+    </w:p>
+    <w:p>
+      <w:pPr>
+        <w:ind w:left="432"/>
+      </w:pPr>
+      <w:r>
+        <w:rPr>
+          <w:i/>
+          <w:color w:val="505050"/>
+        </w:rPr>
+        <w:t>rides on top (HEAD `dc45485`).  **NEXT (current open queue — one task):** an</w:t>
+      </w:r>
+    </w:p>
+    <w:p>
+      <w:pPr>
+        <w:ind w:left="432"/>
+      </w:pPr>
+      <w:r>
+        <w:rPr>
+          <w:i/>
+          <w:color w:val="505050"/>
+        </w:rPr>
+        <w:t>AM/DSB RX-DSP bug — AM and DSB produce only the upper sideband (lower</w:t>
+      </w:r>
+    </w:p>
+    <w:p>
+      <w:pPr>
+        <w:ind w:left="432"/>
+      </w:pPr>
+      <w:r>
+        <w:rPr>
+          <w:i/>
+          <w:color w:val="505050"/>
+        </w:rPr>
+        <w:t>missing); the WDSP passband for AM/DSB is likely set one-sided instead of</w:t>
+      </w:r>
+    </w:p>
+    <w:p>
+      <w:pPr>
+        <w:ind w:left="432"/>
+      </w:pPr>
+      <w:r>
+        <w:rPr>
+          <w:i/>
+          <w:color w:val="505050"/>
+        </w:rPr>
+        <w:t>symmetric -W..+W.  (GitHub / main-branch posture questions pending operator</w:t>
+      </w:r>
+    </w:p>
+    <w:p>
+      <w:pPr>
+        <w:ind w:left="432"/>
+      </w:pPr>
+      <w:r>
+        <w:rPr>
+          <w:i/>
+          <w:color w:val="505050"/>
+        </w:rPr>
+        <w:t>discussion.)</w:t>
       </w:r>
     </w:p>
     <w:p>
@@ -1855,7 +2700,7 @@
               <w:rPr>
                 <w:sz w:val="18"/>
               </w:rPr>
-              <w:t>[WIP]</w:t>
+              <w:t>[DONE]</w:t>
             </w:r>
           </w:p>
         </w:tc>
@@ -1874,13 +2719,13 @@
                 <w:b/>
                 <w:sz w:val="18"/>
               </w:rPr>
-              <w:t>P1 SHIPPED 2026-06-12</w:t>
-            </w:r>
-            <w:r>
-              <w:rPr>
-                <w:sz w:val="18"/>
-              </w:rPr>
-              <w:t xml:space="preserve"> — obbuffs.{h,c} verbatim (obb/*OBB twin typedef, file-scope obp four-alias bank, the reference's own calloc/free 2014-era idioms kept). Mechanical diff: .cpp IDENTICAL; .h sole delta = the include-guard define replaced by #pragma once (documented packaging). Sole deferred line: </w:t>
+              <w:t>P1 `75754c2` 2026-06-12</w:t>
+            </w:r>
+            <w:r>
+              <w:rPr>
+                <w:sz w:val="18"/>
+              </w:rPr>
+              <w:t xml:space="preserve"> — obbuffs.{h,c} verbatim (obb/*OBB twin typedef, file-scope obp four-alias bank, the reference's own calloc/free 2014-era idioms kept). Mechanical diff: .cpp IDENTICAL; .h sole delta = the include-guard define replaced by #pragma once (documented packaging). The </w:t>
             </w:r>
             <w:r>
               <w:rPr>
@@ -1893,7 +2738,20 @@
               <w:rPr>
                 <w:sz w:val="18"/>
               </w:rPr>
-              <w:t xml:space="preserve"> in ob_main (network.c:1237 = P2 scope), carried as reference text. TU is DORMANT — no Lyra caller of create_obbuffs until P3/P4; wire bytes unchanged.</w:t>
+              <w:t xml:space="preserve"> ob_main hand-off was restored at P2.c (no longer deferred). </w:t>
+            </w:r>
+            <w:r>
+              <w:rPr>
+                <w:b/>
+                <w:sz w:val="18"/>
+              </w:rPr>
+              <w:t>Wire-LIVE since P4.b 2026-06-13</w:t>
+            </w:r>
+            <w:r>
+              <w:rPr>
+                <w:sz w:val="18"/>
+              </w:rPr>
+              <w:t xml:space="preserve"> — create_obbuffs/ob_main are live in the direct-port TX chain (TU no longer dormant); was [WIP] SHIPPED while dormant, now DONE in the live chain.</w:t>
             </w:r>
           </w:p>
         </w:tc>
@@ -1939,26 +2797,13 @@
                 <w:rFonts w:ascii="Consolas" w:hAnsi="Consolas"/>
                 <w:sz w:val="18"/>
               </w:rPr>
-              <w:t>src/hl2_stream.cpp</w:t>
-            </w:r>
-            <w:r>
-              <w:rPr>
-                <w:sz w:val="18"/>
-              </w:rPr>
-              <w:t xml:space="preserve"> (LIVE) + </w:t>
-            </w:r>
-            <w:r>
-              <w:rPr>
-                <w:rFonts w:ascii="Consolas" w:hAnsi="Consolas"/>
-                <w:sz w:val="18"/>
-              </w:rPr>
-              <w:t>src/wire/*</w:t>
-            </w:r>
-            <w:r>
-              <w:rPr>
-                <w:sz w:val="18"/>
-              </w:rPr>
-              <w:t xml:space="preserve"> (Step 14 pieces)</w:t>
+              <w:t>src/wire/NetworkProto1.cpp</w:t>
+            </w:r>
+            <w:r>
+              <w:rPr>
+                <w:sz w:val="18"/>
+              </w:rPr>
+              <w:t xml:space="preserve"> (sendProtocol1Samples) + FrameComposer write_main_loop_hl2 (LIVE)</w:t>
             </w:r>
           </w:p>
         </w:tc>
@@ -1976,7 +2821,7 @@
               <w:rPr>
                 <w:sz w:val="18"/>
               </w:rPr>
-              <w:t>[WIP]</w:t>
+              <w:t>[DONE]</w:t>
             </w:r>
           </w:p>
         </w:tc>
@@ -1992,9 +2837,16 @@
             </w:r>
             <w:r>
               <w:rPr>
-                <w:sz w:val="18"/>
-              </w:rPr>
-              <w:t xml:space="preserve">This is the file the Step 14 plan was attacking. Currently a MIX of Step 14 Lyra-native rewrites + the original </w:t>
+                <w:b/>
+                <w:sz w:val="18"/>
+              </w:rPr>
+              <w:t>Wire-LIVE at P4.b 2026-06-13.</w:t>
+            </w:r>
+            <w:r>
+              <w:rPr>
+                <w:sz w:val="18"/>
+              </w:rPr>
+              <w:t xml:space="preserve"> sendProtocol1Samples verbatim drives the EP2 writer thread; FrameComposer monolithic write_main_loop_hl2 is the WriteMainLoop_HL2 equivalent (#121/#122 fold). The old </w:t>
             </w:r>
             <w:r>
               <w:rPr>
@@ -2007,7 +2859,7 @@
               <w:rPr>
                 <w:sz w:val="18"/>
               </w:rPr>
-              <w:t xml:space="preserve"> body. P2 = sendOutbound/sendProtocol1Samples fidelity audit of the dormant wire layer; P4 = Wire-LIVE switchover (one commit, full HL2 bench gate).</w:t>
+              <w:t xml:space="preserve"> Step-14 mix retired at §7.</w:t>
             </w:r>
           </w:p>
         </w:tc>
@@ -2053,20 +2905,13 @@
                 <w:rFonts w:ascii="Consolas" w:hAnsi="Consolas"/>
                 <w:sz w:val="18"/>
               </w:rPr>
-              <w:t>src/wire/Ep2SendThread.{h,cpp}</w:t>
-            </w:r>
-            <w:r>
-              <w:rPr>
-                <w:sz w:val="18"/>
-              </w:rPr>
-              <w:t xml:space="preserve"> + </w:t>
-            </w:r>
-            <w:r>
-              <w:rPr>
-                <w:rFonts w:ascii="Consolas" w:hAnsi="Consolas"/>
-                <w:sz w:val="18"/>
-              </w:rPr>
-              <w:t>src/wire/Ep6RecvThread.{h,cpp}</w:t>
+              <w:t>src/wire/ObBuffs.{h,cpp}</w:t>
+            </w:r>
+            <w:r>
+              <w:rPr>
+                <w:sz w:val="18"/>
+              </w:rPr>
+              <w:t xml:space="preserve"> ob_main + sendOutbound (LIVE)</w:t>
             </w:r>
           </w:p>
         </w:tc>
@@ -2084,7 +2929,7 @@
               <w:rPr>
                 <w:sz w:val="18"/>
               </w:rPr>
-              <w:t>[WIP]</w:t>
+              <w:t>[DONE]</w:t>
             </w:r>
           </w:p>
         </w:tc>
@@ -2100,9 +2945,29 @@
             </w:r>
             <w:r>
               <w:rPr>
-                <w:sz w:val="18"/>
-              </w:rPr>
-              <w:t>Step 14 Lyra-native rewrites shipped (§5/§6); could be re-ported direct from reference, OR left as-is if reference-parity audit passes. Operator call (folds into P2/P4).</w:t>
+                <w:b/>
+                <w:sz w:val="18"/>
+              </w:rPr>
+              <w:t>Wire-LIVE at P4.b.</w:t>
+            </w:r>
+            <w:r>
+              <w:rPr>
+                <w:sz w:val="18"/>
+              </w:rPr>
+              <w:t xml:space="preserve"> sendOutbound verbatim (P2.c); the Step-14 Lyra-native OutboundRing + Ep2SendThread translations RETIRED at §7 (</w:t>
+            </w:r>
+            <w:r>
+              <w:rPr>
+                <w:rFonts w:ascii="Consolas" w:hAnsi="Consolas"/>
+                <w:sz w:val="18"/>
+              </w:rPr>
+              <w:t>fe6a438</w:t>
+            </w:r>
+            <w:r>
+              <w:rPr>
+                <w:sz w:val="18"/>
+              </w:rPr>
+              <w:t>).</w:t>
             </w:r>
           </w:p>
         </w:tc>
@@ -2955,7 +3820,7 @@
               <w:rPr>
                 <w:sz w:val="18"/>
               </w:rPr>
-              <w:t>[PEND]</w:t>
+              <w:t>[N/A]</w:t>
             </w:r>
           </w:p>
         </w:tc>
@@ -2971,9 +3836,42 @@
             </w:r>
             <w:r>
               <w:rPr>
-                <w:sz w:val="18"/>
-              </w:rPr>
-              <w:t>Operator choice: direct port (~150 LOC) for v0.2.1 EQ + dynamics ship, OR cffi-only binding if WDSP DLL exports are sufficient. Direct port recommended for parity with Lyra's existing UI control surface.</w:t>
+                <w:b/>
+                <w:sz w:val="18"/>
+              </w:rPr>
+              <w:t>Superseded by the native TX DSP rack (post-P4).</w:t>
+            </w:r>
+            <w:r>
+              <w:rPr>
+                <w:sz w:val="18"/>
+              </w:rPr>
+              <w:t xml:space="preserve"> Operator chose the Lyra-native path: the Speech processor (#88, </w:t>
+            </w:r>
+            <w:r>
+              <w:rPr>
+                <w:rFonts w:ascii="Consolas" w:hAnsi="Consolas"/>
+                <w:sz w:val="18"/>
+              </w:rPr>
+              <w:t>902b814</w:t>
+            </w:r>
+            <w:r>
+              <w:rPr>
+                <w:sz w:val="18"/>
+              </w:rPr>
+              <w:t>/</w:t>
+            </w:r>
+            <w:r>
+              <w:rPr>
+                <w:rFonts w:ascii="Consolas" w:hAnsi="Consolas"/>
+                <w:sz w:val="18"/>
+              </w:rPr>
+              <w:t>93adb39</w:t>
+            </w:r>
+            <w:r>
+              <w:rPr>
+                <w:sz w:val="18"/>
+              </w:rPr>
+              <w:t>) + Combinator (#51) cover speech dynamics natively, pre-WDSP-TXA. No WDSP compress.c port/cffi binding shipped.</w:t>
             </w:r>
           </w:p>
         </w:tc>
@@ -3043,7 +3941,7 @@
               <w:rPr>
                 <w:sz w:val="18"/>
               </w:rPr>
-              <w:t>[PEND]</w:t>
+              <w:t>[N/A]</w:t>
             </w:r>
           </w:p>
         </w:tc>
@@ -3059,9 +3957,55 @@
             </w:r>
             <w:r>
               <w:rPr>
-                <w:sz w:val="18"/>
-              </w:rPr>
-              <w:t>Same operator-choice. ~600 LOC; one of the heavier ports. Replaced in Python Lyra plan by a Lyra-native Combinator per §15.19; cpp may take the same path (custom Combinator instead of WDSP CFC) — operator design call.</w:t>
+                <w:b/>
+                <w:sz w:val="18"/>
+              </w:rPr>
+              <w:t>Superseded by the native Combinator #51</w:t>
+            </w:r>
+            <w:r>
+              <w:rPr>
+                <w:sz w:val="18"/>
+              </w:rPr>
+              <w:t xml:space="preserve"> (</w:t>
+            </w:r>
+            <w:r>
+              <w:rPr>
+                <w:rFonts w:ascii="Consolas" w:hAnsi="Consolas"/>
+                <w:sz w:val="18"/>
+              </w:rPr>
+              <w:t>013bf12</w:t>
+            </w:r>
+            <w:r>
+              <w:rPr>
+                <w:sz w:val="18"/>
+              </w:rPr>
+              <w:t>/</w:t>
+            </w:r>
+            <w:r>
+              <w:rPr>
+                <w:rFonts w:ascii="Consolas" w:hAnsi="Consolas"/>
+                <w:sz w:val="18"/>
+              </w:rPr>
+              <w:t>61e16c4</w:t>
+            </w:r>
+            <w:r>
+              <w:rPr>
+                <w:sz w:val="18"/>
+              </w:rPr>
+              <w:t>/</w:t>
+            </w:r>
+            <w:r>
+              <w:rPr>
+                <w:rFonts w:ascii="Consolas" w:hAnsi="Consolas"/>
+                <w:sz w:val="18"/>
+              </w:rPr>
+              <w:t>b53ae35</w:t>
+            </w:r>
+            <w:r>
+              <w:rPr>
+                <w:sz w:val="18"/>
+              </w:rPr>
+              <w:t>) per the §15.19 plan — Lyra-native multiband compressor replaces the WDSP CFC. No CFC port shipped.</w:t>
             </w:r>
           </w:p>
         </w:tc>
@@ -3205,7 +4149,7 @@
               <w:rPr>
                 <w:sz w:val="18"/>
               </w:rPr>
-              <w:t>[WIP]</w:t>
+              <w:t>[DONE]</w:t>
             </w:r>
           </w:p>
         </w:tc>
@@ -3223,33 +4167,20 @@
               <w:rPr>
                 <w:sz w:val="18"/>
               </w:rPr>
-              <w:t xml:space="preserve">cdef already present in </w:t>
-            </w:r>
-            <w:r>
-              <w:rPr>
-                <w:rFonts w:ascii="Consolas" w:hAnsi="Consolas"/>
-                <w:sz w:val="18"/>
-              </w:rPr>
-              <w:t>wdsp_native.cpp</w:t>
-            </w:r>
-            <w:r>
-              <w:rPr>
-                <w:sz w:val="18"/>
-              </w:rPr>
-              <w:t xml:space="preserve">. UI surface exists in TX-1 components on </w:t>
-            </w:r>
-            <w:r>
-              <w:rPr>
-                <w:rFonts w:ascii="Consolas" w:hAnsi="Consolas"/>
-                <w:sz w:val="18"/>
-              </w:rPr>
-              <w:t>main</w:t>
-            </w:r>
-            <w:r>
-              <w:rPr>
-                <w:sz w:val="18"/>
-              </w:rPr>
-              <w:t>. Confirm reference-parity at the call-site setter sequence.</w:t>
+              <w:t xml:space="preserve">cffi binding live in the wire-LIVE TXA chain. </w:t>
+            </w:r>
+            <w:r>
+              <w:rPr>
+                <w:b/>
+                <w:sz w:val="18"/>
+              </w:rPr>
+              <w:t>TX LEV metering wired Thetis-format at #160 `9594bd5` (v0.3.1)</w:t>
+            </w:r>
+            <w:r>
+              <w:rPr>
+                <w:sz w:val="18"/>
+              </w:rPr>
+              <w:t xml:space="preserve"> + #49 profile Leveler fields — addresses the v0.3.0 "UNVERIFIED" metering loose-end (shipped in code; #160 bench close-out / tester confirm still IN PROGRESS).</w:t>
             </w:r>
           </w:p>
         </w:tc>
@@ -3312,7 +4243,7 @@
               <w:rPr>
                 <w:sz w:val="18"/>
               </w:rPr>
-              <w:t>[WIP]</w:t>
+              <w:t>[DONE]</w:t>
             </w:r>
           </w:p>
         </w:tc>
@@ -3330,7 +4261,20 @@
               <w:rPr>
                 <w:sz w:val="18"/>
               </w:rPr>
-              <w:t>cdef present; SetTXAALCThresh does NOT exist (§15.23-class trap — only MaxGain governs ALC ceiling).</w:t>
+              <w:t xml:space="preserve">cffi present; SetTXAALCThresh does NOT exist (§15.23-class trap — only MaxGain governs ALC ceiling). </w:t>
+            </w:r>
+            <w:r>
+              <w:rPr>
+                <w:b/>
+                <w:sz w:val="18"/>
+              </w:rPr>
+              <w:t>TX ALC metering wired Thetis-format at #160 `9594bd5` (v0.3.1)</w:t>
+            </w:r>
+            <w:r>
+              <w:rPr>
+                <w:sz w:val="18"/>
+              </w:rPr>
+              <w:t xml:space="preserve"> — addresses the v0.3.0 "UNVERIFIED" flag (shipped in code; #160 bench close-out / tester confirm still IN PROGRESS).</w:t>
             </w:r>
           </w:p>
         </w:tc>
@@ -3400,7 +4344,7 @@
               <w:rPr>
                 <w:sz w:val="18"/>
               </w:rPr>
-              <w:t>[PEND]</w:t>
+              <w:t>[N/A]</w:t>
             </w:r>
           </w:p>
         </w:tc>
@@ -3416,9 +4360,55 @@
             </w:r>
             <w:r>
               <w:rPr>
-                <w:sz w:val="18"/>
-              </w:rPr>
-              <w:t>Per CLAUDE.md §4.1 v0.2.1; ~300 LOC. Lyra-native parametric EQ likely (§15.19 lists 3-or-5-band parametric replacing the WDSP 10-band graphic).</w:t>
+                <w:b/>
+                <w:sz w:val="18"/>
+              </w:rPr>
+              <w:t>Superseded by the native EQ #50</w:t>
+            </w:r>
+            <w:r>
+              <w:rPr>
+                <w:sz w:val="18"/>
+              </w:rPr>
+              <w:t xml:space="preserve"> (</w:t>
+            </w:r>
+            <w:r>
+              <w:rPr>
+                <w:rFonts w:ascii="Consolas" w:hAnsi="Consolas"/>
+                <w:sz w:val="18"/>
+              </w:rPr>
+              <w:t>edbaa52</w:t>
+            </w:r>
+            <w:r>
+              <w:rPr>
+                <w:sz w:val="18"/>
+              </w:rPr>
+              <w:t>/</w:t>
+            </w:r>
+            <w:r>
+              <w:rPr>
+                <w:rFonts w:ascii="Consolas" w:hAnsi="Consolas"/>
+                <w:sz w:val="18"/>
+              </w:rPr>
+              <w:t>17a28b7</w:t>
+            </w:r>
+            <w:r>
+              <w:rPr>
+                <w:sz w:val="18"/>
+              </w:rPr>
+              <w:t>/</w:t>
+            </w:r>
+            <w:r>
+              <w:rPr>
+                <w:rFonts w:ascii="Consolas" w:hAnsi="Consolas"/>
+                <w:sz w:val="18"/>
+              </w:rPr>
+              <w:t>eb92231</w:t>
+            </w:r>
+            <w:r>
+              <w:rPr>
+                <w:sz w:val="18"/>
+              </w:rPr>
+              <w:t>) — native RBJ-biquad 8-band parametric EQ (ParamEq engine + EESDR3-style panel), wired pre-WDSP-TXA. No WDSP eqp.c port shipped.</w:t>
             </w:r>
           </w:p>
         </w:tc>
@@ -3499,7 +4489,7 @@
               <w:rPr>
                 <w:sz w:val="18"/>
               </w:rPr>
-              <w:t>gen1 (postgen) used today for TUN tone. gen0 (pregen) cdefs deferred per §15.23 (bench-tooling nicety, not on the signal path).</w:t>
+              <w:t>gen1 (postgen) live for TUN tone — wire-LIVE + bench-passed since P4.b 2026-06-13 (Thetis-exact zero-beat). gen0 (pregen) cdefs still deferred per §15.23 (bench-tooling nicety, not on the signal path) — hence row stays [WIP].</w:t>
             </w:r>
           </w:p>
         </w:tc>
@@ -4080,7 +5070,7 @@
               <w:rPr>
                 <w:sz w:val="18"/>
               </w:rPr>
-              <w:t>[WIP]</w:t>
+              <w:t>[DONE]</w:t>
             </w:r>
           </w:p>
         </w:tc>
@@ -4098,20 +5088,20 @@
               <w:rPr>
                 <w:sz w:val="18"/>
               </w:rPr>
-              <w:t xml:space="preserve">Lyra-native FSM shipped on </w:t>
-            </w:r>
-            <w:r>
-              <w:rPr>
-                <w:rFonts w:ascii="Consolas" w:hAnsi="Consolas"/>
-                <w:sz w:val="18"/>
-              </w:rPr>
-              <w:t>main</w:t>
-            </w:r>
-            <w:r>
-              <w:rPr>
-                <w:sz w:val="18"/>
-              </w:rPr>
-              <w:t>. Verified against the reference's keydown/keyup ordering invariants (RX-DSP stop on keydown -&gt; wire MOX -&gt; TX-DSP start; keyup TX-DSP off -&gt; mox_delay -&gt; clear MOX -&gt; ptt_out_delay -&gt; RX-DSP restart). No direct port — C# is study-only by license.</w:t>
+              <w:t xml:space="preserve">Lyra-native FSM. Verified against the reference's keydown/keyup ordering invariants (RX-DSP stop on keydown -&gt; wire MOX -&gt; TX-DSP start; keyup TX-DSP off -&gt; mox_delay -&gt; clear MOX -&gt; ptt_out_delay -&gt; RX-DSP restart). </w:t>
+            </w:r>
+            <w:r>
+              <w:rPr>
+                <w:b/>
+                <w:sz w:val="18"/>
+              </w:rPr>
+              <w:t>Live + operator-HL2-bench-passed at P4.b 2026-06-13</w:t>
+            </w:r>
+            <w:r>
+              <w:rPr>
+                <w:sz w:val="18"/>
+              </w:rPr>
+              <w:t xml:space="preserve"> (SSB voice both sidebands + RF-safety kill-test exercise the FSM end-to-end). No direct port — C# is study-only by license.</w:t>
             </w:r>
           </w:p>
         </w:tc>
@@ -4239,13 +5229,39 @@
                 <w:rFonts w:ascii="Consolas" w:hAnsi="Consolas"/>
                 <w:sz w:val="18"/>
               </w:rPr>
-              <w:t>src/tx/AttOnTxPolicy.{h,cpp}</w:t>
-            </w:r>
-            <w:r>
-              <w:rPr>
-                <w:sz w:val="18"/>
-              </w:rPr>
-              <w:t xml:space="preserve"> (LIVE)</w:t>
+              <w:t>src/hl2_stream.cpp</w:t>
+            </w:r>
+            <w:r>
+              <w:rPr>
+                <w:sz w:val="18"/>
+              </w:rPr>
+              <w:t xml:space="preserve"> </w:t>
+            </w:r>
+            <w:r>
+              <w:rPr>
+                <w:rFonts w:ascii="Consolas" w:hAnsi="Consolas"/>
+                <w:sz w:val="18"/>
+              </w:rPr>
+              <w:t>fsmAdvance</w:t>
+            </w:r>
+            <w:r>
+              <w:rPr>
+                <w:sz w:val="18"/>
+              </w:rPr>
+              <w:t xml:space="preserve"> + </w:t>
+            </w:r>
+            <w:r>
+              <w:rPr>
+                <w:rFonts w:ascii="Consolas" w:hAnsi="Consolas"/>
+                <w:sz w:val="18"/>
+              </w:rPr>
+              <w:t>compose_case_11</w:t>
+            </w:r>
+            <w:r>
+              <w:rPr>
+                <w:sz w:val="18"/>
+              </w:rPr>
+              <w:t xml:space="preserve"> (LIVE wire)</w:t>
             </w:r>
           </w:p>
         </w:tc>
@@ -4281,46 +5297,267 @@
               <w:rPr>
                 <w:sz w:val="18"/>
               </w:rPr>
-              <w:t xml:space="preserve">Lyra-native shipped on </w:t>
+              <w:t xml:space="preserve">Lyra-native. Reference posture: keydown force step-att 31 (PS-A off OR CW); keyup restore. </w:t>
+            </w:r>
+            <w:r>
+              <w:rPr>
+                <w:b/>
+                <w:sz w:val="18"/>
+              </w:rPr>
+              <w:t>WIRE path traced live + functional 2026-06-17:</w:t>
+            </w:r>
+            <w:r>
+              <w:rPr>
+                <w:sz w:val="18"/>
+              </w:rPr>
+              <w:t xml:space="preserve"> </w:t>
             </w:r>
             <w:r>
               <w:rPr>
                 <w:rFonts w:ascii="Consolas" w:hAnsi="Consolas"/>
                 <w:sz w:val="18"/>
               </w:rPr>
-              <w:t>main</w:t>
-            </w:r>
-            <w:r>
-              <w:rPr>
-                <w:sz w:val="18"/>
-              </w:rPr>
-              <w:t xml:space="preserve">. Reference posture: keydown save per-band step-att + force-31 (when PS-A off OR CW); keyup restore. Implementation verified against </w:t>
+              <w:t>fsmAdvance</w:t>
+            </w:r>
+            <w:r>
+              <w:rPr>
+                <w:sz w:val="18"/>
+              </w:rPr>
+              <w:t xml:space="preserve"> raises </w:t>
             </w:r>
             <w:r>
               <w:rPr>
                 <w:rFonts w:ascii="Consolas" w:hAnsi="Consolas"/>
                 <w:sz w:val="18"/>
               </w:rPr>
-              <w:t>console.cs:30293-30327</w:t>
-            </w:r>
-            <w:r>
-              <w:rPr>
-                <w:sz w:val="18"/>
-              </w:rPr>
-              <w:t xml:space="preserve"> + </w:t>
+              <w:t>setTxStepAttnDb(31)</w:t>
+            </w:r>
+            <w:r>
+              <w:rPr>
+                <w:sz w:val="18"/>
+              </w:rPr>
+              <w:t xml:space="preserve"> on keydown (</w:t>
             </w:r>
             <w:r>
               <w:rPr>
                 <w:rFonts w:ascii="Consolas" w:hAnsi="Consolas"/>
                 <w:sz w:val="18"/>
               </w:rPr>
-              <w:t>:30391-30410</w:t>
-            </w:r>
-            <w:r>
-              <w:rPr>
-                <w:sz w:val="18"/>
-              </w:rPr>
-              <w:t>.</w:t>
+              <w:t>hl2_stream.cpp:1651</w:t>
+            </w:r>
+            <w:r>
+              <w:rPr>
+                <w:sz w:val="18"/>
+              </w:rPr>
+              <w:t xml:space="preserve">) → </w:t>
+            </w:r>
+            <w:r>
+              <w:rPr>
+                <w:rFonts w:ascii="Consolas" w:hAnsi="Consolas"/>
+                <w:sz w:val="18"/>
+              </w:rPr>
+              <w:t>tx_step_attn = 31−31 = 0</w:t>
+            </w:r>
+            <w:r>
+              <w:rPr>
+                <w:sz w:val="18"/>
+              </w:rPr>
+              <w:t xml:space="preserve"> → XmitBit-gated </w:t>
+            </w:r>
+            <w:r>
+              <w:rPr>
+                <w:rFonts w:ascii="Consolas" w:hAnsi="Consolas"/>
+                <w:sz w:val="18"/>
+              </w:rPr>
+              <w:t>compose_case_11</w:t>
+            </w:r>
+            <w:r>
+              <w:rPr>
+                <w:sz w:val="18"/>
+              </w:rPr>
+              <w:t xml:space="preserve"> C4 = </w:t>
+            </w:r>
+            <w:r>
+              <w:rPr>
+                <w:rFonts w:ascii="Consolas" w:hAnsi="Consolas"/>
+                <w:sz w:val="18"/>
+              </w:rPr>
+              <w:t>0x40</w:t>
+            </w:r>
+            <w:r>
+              <w:rPr>
+                <w:sz w:val="18"/>
+              </w:rPr>
+              <w:t xml:space="preserve"> → ak4951v4 cmd_addr 0x0a rx_gain = 0 = min LNA during TX. </w:t>
+            </w:r>
+            <w:r>
+              <w:rPr>
+                <w:b/>
+                <w:sz w:val="18"/>
+              </w:rPr>
+              <w:t>BUT NOT [DONE]:</w:t>
+            </w:r>
+            <w:r>
+              <w:rPr>
+                <w:sz w:val="18"/>
+              </w:rPr>
+              <w:t xml:space="preserve"> (a) the </w:t>
+            </w:r>
+            <w:r>
+              <w:rPr>
+                <w:rFonts w:ascii="Consolas" w:hAnsi="Consolas"/>
+                <w:sz w:val="18"/>
+              </w:rPr>
+              <w:t>src/tx/AttOnTxPolicy.{h,cpp}</w:t>
+            </w:r>
+            <w:r>
+              <w:rPr>
+                <w:sz w:val="18"/>
+              </w:rPr>
+              <w:t xml:space="preserve"> class is </w:t>
+            </w:r>
+            <w:r>
+              <w:rPr>
+                <w:b/>
+                <w:sz w:val="18"/>
+              </w:rPr>
+              <w:t>unused / wire-inert</w:t>
+            </w:r>
+            <w:r>
+              <w:rPr>
+                <w:sz w:val="18"/>
+              </w:rPr>
+              <w:t xml:space="preserve"> (its own header says so) — the live mechanism is inline in hl2_stream.cpp, the earlier doc citation was wrong; (b) ~~operator-reported 2026-06-17: NO UI surface~~ → </w:t>
+            </w:r>
+            <w:r>
+              <w:rPr>
+                <w:b/>
+                <w:sz w:val="18"/>
+              </w:rPr>
+              <w:t>UI surface BUILT 2026-06-17 (§15.31):</w:t>
+            </w:r>
+            <w:r>
+              <w:rPr>
+                <w:sz w:val="18"/>
+              </w:rPr>
+              <w:t xml:space="preserve"> TxPanel "ATT" lamp in the Mic↔Tune gap (gray </w:t>
+            </w:r>
+            <w:r>
+              <w:rPr>
+                <w:rFonts w:ascii="Consolas" w:hAnsi="Consolas"/>
+                <w:sz w:val="18"/>
+              </w:rPr>
+              <w:t>ATT off</w:t>
+            </w:r>
+            <w:r>
+              <w:rPr>
+                <w:sz w:val="18"/>
+              </w:rPr>
+              <w:t xml:space="preserve"> / orange </w:t>
+            </w:r>
+            <w:r>
+              <w:rPr>
+                <w:rFonts w:ascii="Consolas" w:hAnsi="Consolas"/>
+                <w:sz w:val="18"/>
+              </w:rPr>
+              <w:t>ATT 31</w:t>
+            </w:r>
+            <w:r>
+              <w:rPr>
+                <w:sz w:val="18"/>
+              </w:rPr>
+              <w:t xml:space="preserve"> armed-RX / solid-red </w:t>
+            </w:r>
+            <w:r>
+              <w:rPr>
+                <w:rFonts w:ascii="Consolas" w:hAnsi="Consolas"/>
+                <w:sz w:val="18"/>
+              </w:rPr>
+              <w:t>ATT -31</w:t>
+            </w:r>
+            <w:r>
+              <w:rPr>
+                <w:sz w:val="18"/>
+              </w:rPr>
+              <w:t xml:space="preserve"> engaged-TX, AUTO/TUN/MOX idiom) + Settings → TX → "ATT on TX (RX-ADC protection)" group (Enable + dB 0..31 spin); operator-gated, default ON/31, QSettings </w:t>
+            </w:r>
+            <w:r>
+              <w:rPr>
+                <w:rFonts w:ascii="Consolas" w:hAnsi="Consolas"/>
+                <w:sz w:val="18"/>
+              </w:rPr>
+              <w:t>tx/attOnTx*</w:t>
+            </w:r>
+            <w:r>
+              <w:rPr>
+                <w:sz w:val="18"/>
+              </w:rPr>
+              <w:t xml:space="preserve">; </w:t>
+            </w:r>
+            <w:r>
+              <w:rPr>
+                <w:rFonts w:ascii="Consolas" w:hAnsi="Consolas"/>
+                <w:sz w:val="18"/>
+              </w:rPr>
+              <w:t>fsmAdvance</w:t>
+            </w:r>
+            <w:r>
+              <w:rPr>
+                <w:sz w:val="18"/>
+              </w:rPr>
+              <w:t xml:space="preserve"> now gates on the toggle + uses the value (replaces the hardcoded </w:t>
+            </w:r>
+            <w:r>
+              <w:rPr>
+                <w:rFonts w:ascii="Consolas" w:hAnsi="Consolas"/>
+                <w:sz w:val="18"/>
+              </w:rPr>
+              <w:t>kAttOnTxDb</w:t>
+            </w:r>
+            <w:r>
+              <w:rPr>
+                <w:sz w:val="18"/>
+              </w:rPr>
+              <w:t xml:space="preserve">). Operator-approved in review; </w:t>
+            </w:r>
+            <w:r>
+              <w:rPr>
+                <w:b/>
+                <w:sz w:val="18"/>
+              </w:rPr>
+              <w:t>awaiting on-air bench confirm to flip [DONE].</w:t>
+            </w:r>
+            <w:r>
+              <w:rPr>
+                <w:sz w:val="18"/>
+              </w:rPr>
+              <w:t xml:space="preserve"> The </w:t>
+            </w:r>
+            <w:r>
+              <w:rPr>
+                <w:rFonts w:ascii="Consolas" w:hAnsi="Consolas"/>
+                <w:sz w:val="18"/>
+              </w:rPr>
+              <w:t>AttOnTxPolicy</w:t>
+            </w:r>
+            <w:r>
+              <w:rPr>
+                <w:sz w:val="18"/>
+              </w:rPr>
+              <w:t xml:space="preserve"> class stays unused (flag: delete-or-wire-up later). Broader </w:t>
+            </w:r>
+            <w:r>
+              <w:rPr>
+                <w:b/>
+                <w:sz w:val="18"/>
+              </w:rPr>
+              <w:t>Task #114 still PENDING</w:t>
+            </w:r>
+            <w:r>
+              <w:rPr>
+                <w:sz w:val="18"/>
+              </w:rPr>
+              <w:t xml:space="preserve"> (panadapter TX offset + PA-enable safety).</w:t>
             </w:r>
           </w:p>
         </w:tc>
@@ -4466,7 +5703,7 @@
               <w:rPr>
                 <w:sz w:val="18"/>
               </w:rPr>
-              <w:t>[WIP]</w:t>
+              <w:t>[DONE]</w:t>
             </w:r>
           </w:p>
         </w:tc>
@@ -4484,7 +5721,7 @@
               <w:rPr>
                 <w:sz w:val="18"/>
               </w:rPr>
-              <w:t>HL2 I/O quirks already implemented Lyra-native via the protocol-byte verification + gateware-RTL ground-truth pass (CLAUDE.md §15.26).</w:t>
+              <w:t>HL2 I/O quirks implemented Lyra-native via the protocol-byte verification + gateware-RTL ground-truth pass (CLAUDE.md §15.26). Live + bench-passed across the RX + P4.b TX chain (incl. on-air FT8).</w:t>
             </w:r>
           </w:p>
         </w:tc>
@@ -5081,7 +6318,7 @@
               <w:rPr>
                 <w:sz w:val="18"/>
               </w:rPr>
-              <w:t>[WIP] SHIPPED</w:t>
+              <w:t>[DONE]</w:t>
             </w:r>
           </w:p>
         </w:tc>
@@ -5112,7 +6349,7 @@
               <w:rPr>
                 <w:sz w:val="18"/>
               </w:rPr>
-              <w:t xml:space="preserve"> (the TX-out seam; separate TU from cmbuffs; sendOutbound call DEFERRED to P2)</w:t>
+              <w:t xml:space="preserve"> (the TX-out seam; separate TU from cmbuffs; sendOutbound call restored at P2.c)</w:t>
             </w:r>
           </w:p>
         </w:tc>
@@ -5128,9 +6365,29 @@
             </w:r>
             <w:r>
               <w:rPr>
-                <w:sz w:val="18"/>
-              </w:rPr>
-              <w:t>2026-06-12; dormant/wire-inert — optional operator RX smoke; clean build 0 warnings; mechanical diff IDENTICAL</w:t>
+                <w:rFonts w:ascii="Consolas" w:hAnsi="Consolas"/>
+                <w:sz w:val="18"/>
+              </w:rPr>
+              <w:t>75754c2</w:t>
+            </w:r>
+            <w:r>
+              <w:rPr>
+                <w:sz w:val="18"/>
+              </w:rPr>
+              <w:t xml:space="preserve"> 2026-06-12; shipped dormant, then </w:t>
+            </w:r>
+            <w:r>
+              <w:rPr>
+                <w:b/>
+                <w:sz w:val="18"/>
+              </w:rPr>
+              <w:t>wire-LIVE at P4.b 2026-06-13</w:t>
+            </w:r>
+            <w:r>
+              <w:rPr>
+                <w:sz w:val="18"/>
+              </w:rPr>
+              <w:t xml:space="preserve"> (create_obbuffs/ob_main live in the direct-port TX chain); clean build 0 warnings; mechanical diff IDENTICAL</w:t>
             </w:r>
           </w:p>
         </w:tc>
@@ -5371,7 +6628,7 @@
               <w:rPr>
                 <w:sz w:val="18"/>
               </w:rPr>
-              <w:t>[WIP]</w:t>
+              <w:t>[DONE]</w:t>
             </w:r>
           </w:p>
         </w:tc>
@@ -5389,20 +6646,163 @@
               <w:rPr>
                 <w:sz w:val="18"/>
               </w:rPr>
-              <w:t xml:space="preserve">Wire-LIVE switchover.  </w:t>
+              <w:t xml:space="preserve">Wire-LIVE switchover — </w:t>
             </w:r>
             <w:r>
               <w:rPr>
                 <w:b/>
                 <w:sz w:val="18"/>
               </w:rPr>
-              <w:t>P4.a prep COMPLETE 2026-06-12</w:t>
-            </w:r>
-            <w:r>
-              <w:rPr>
-                <w:sz w:val="18"/>
-              </w:rPr>
-              <w:t xml:space="preserve"> (2 wire-inert commits): sendProtocol1Samples ported verbatim into NEW src/wire/NetworkProto1.cpp (networkproto1.c:1204-1267, mechanical diff IDENTICAL; DORMANT — thread not started until P4.b) + io_keep_running global + the FrameComposer write_main_loop_hl2 tail flipped to the verbatim ReleaseSemaphore(hobbuffsRun[0/1]) pair; SetTXAPostGen{Run,Mode,ToneMag,ToneFreq,TTMag,TTFreq} wdspcalls entries (pre-cdef audit: gen.c:784-833 definition-site signatures, all 6 verified in the bundled wdsp.dll export table); TxReadBufp -&gt; verbatim double* + create_rnet calloc (netInterface.c:1604) + Ep6RecvThread callers bent; hWriteThreadMain -&gt; verbatim HANDLE.</w:t>
+              <w:t>COMPLETE + operator HL2 bench PASSED 2026-06-13.</w:t>
+            </w:r>
+            <w:r>
+              <w:rPr>
+                <w:sz w:val="18"/>
+              </w:rPr>
+              <w:t xml:space="preserve">  P4.a prep (2 wire-inert commits): sendProtocol1Samples verbatim in src/wire/NetworkProto1.cpp + io_keep_running + FrameComposer tail flipped to ReleaseSemaphore(hobbuffsRun) + SetTXAPostGen wdspcalls + TxReadBufp double* / hWriteThreadMain HANDLE.  </w:t>
+            </w:r>
+            <w:r>
+              <w:rPr>
+                <w:b/>
+                <w:sz w:val="18"/>
+              </w:rPr>
+              <w:t>P4.b SHIPPED</w:t>
+            </w:r>
+            <w:r>
+              <w:rPr>
+                <w:sz w:val="18"/>
+              </w:rPr>
+              <w:t xml:space="preserve"> in 3 commits: </w:t>
+            </w:r>
+            <w:r>
+              <w:rPr>
+                <w:rFonts w:ascii="Consolas" w:hAnsi="Consolas"/>
+                <w:sz w:val="18"/>
+              </w:rPr>
+              <w:t>fb9ec41</w:t>
+            </w:r>
+            <w:r>
+              <w:rPr>
+                <w:sz w:val="18"/>
+              </w:rPr>
+              <w:t xml:space="preserve"> Wire-LIVE RX-out gate, </w:t>
+            </w:r>
+            <w:r>
+              <w:rPr>
+                <w:rFonts w:ascii="Consolas" w:hAnsi="Consolas"/>
+                <w:sz w:val="18"/>
+              </w:rPr>
+              <w:t>0b551b4</w:t>
+            </w:r>
+            <w:r>
+              <w:rPr>
+                <w:sz w:val="18"/>
+              </w:rPr>
+              <w:t xml:space="preserve"> first modulated RF through the direct-port chain, </w:t>
+            </w:r>
+            <w:r>
+              <w:rPr>
+                <w:rFonts w:ascii="Consolas" w:hAnsi="Consolas"/>
+                <w:sz w:val="18"/>
+              </w:rPr>
+              <w:t>9db2c50</w:t>
+            </w:r>
+            <w:r>
+              <w:rPr>
+                <w:sz w:val="18"/>
+              </w:rPr>
+              <w:t xml:space="preserve"> SSB sideband fix (USB transmits USB, 9100-verified).  Plus </w:t>
+            </w:r>
+            <w:r>
+              <w:rPr>
+                <w:rFonts w:ascii="Consolas" w:hAnsi="Consolas"/>
+                <w:sz w:val="18"/>
+              </w:rPr>
+              <w:t>84dbb12</w:t>
+            </w:r>
+            <w:r>
+              <w:rPr>
+                <w:sz w:val="18"/>
+              </w:rPr>
+              <w:t xml:space="preserve"> TUN panadapter-spike fix (Thetis-exact zero-beat confirmed, display-only bug).  </w:t>
+            </w:r>
+            <w:r>
+              <w:rPr>
+                <w:b/>
+                <w:sz w:val="18"/>
+              </w:rPr>
+              <w:t>§7 retirements DONE</w:t>
+            </w:r>
+            <w:r>
+              <w:rPr>
+                <w:sz w:val="18"/>
+              </w:rPr>
+              <w:t xml:space="preserve"> (</w:t>
+            </w:r>
+            <w:r>
+              <w:rPr>
+                <w:rFonts w:ascii="Consolas" w:hAnsi="Consolas"/>
+                <w:sz w:val="18"/>
+              </w:rPr>
+              <w:t>fe6a438</w:t>
+            </w:r>
+            <w:r>
+              <w:rPr>
+                <w:sz w:val="18"/>
+              </w:rPr>
+              <w:t xml:space="preserve"> OutboundRing+Ep2SendThread, </w:t>
+            </w:r>
+            <w:r>
+              <w:rPr>
+                <w:rFonts w:ascii="Consolas" w:hAnsi="Consolas"/>
+                <w:sz w:val="18"/>
+              </w:rPr>
+              <w:t>99fd24a</w:t>
+            </w:r>
+            <w:r>
+              <w:rPr>
+                <w:sz w:val="18"/>
+              </w:rPr>
+              <w:t xml:space="preserve"> txWorkerLoop+composeCC+keepalive, </w:t>
+            </w:r>
+            <w:r>
+              <w:rPr>
+                <w:rFonts w:ascii="Consolas" w:hAnsi="Consolas"/>
+                <w:sz w:val="18"/>
+              </w:rPr>
+              <w:t>e711256</w:t>
+            </w:r>
+            <w:r>
+              <w:rPr>
+                <w:sz w:val="18"/>
+              </w:rPr>
+              <w:t xml:space="preserve"> old HL2-jack EP2 ring).  </w:t>
+            </w:r>
+            <w:r>
+              <w:rPr>
+                <w:b/>
+                <w:sz w:val="18"/>
+              </w:rPr>
+              <w:t>TCI digital TX re-home</w:t>
+            </w:r>
+            <w:r>
+              <w:rPr>
+                <w:sz w:val="18"/>
+              </w:rPr>
+              <w:t xml:space="preserve"> </w:t>
+            </w:r>
+            <w:r>
+              <w:rPr>
+                <w:rFonts w:ascii="Consolas" w:hAnsi="Consolas"/>
+                <w:sz w:val="18"/>
+              </w:rPr>
+              <w:t>bd61d07</w:t>
+            </w:r>
+            <w:r>
+              <w:rPr>
+                <w:sz w:val="18"/>
+              </w:rPr>
+              <w:t xml:space="preserve"> (TciTxBridge fills the §10.3 skeleton; on-air FT8 QSOs).  Released v0.2.3.</w:t>
             </w:r>
           </w:p>
         </w:tc>
@@ -5420,7 +6820,7 @@
               <w:rPr>
                 <w:sz w:val="18"/>
               </w:rPr>
-              <w:t>NEXT = P4.b: the switchover, ONE commit, full HL2 bench gate (quartet + _beginthreadex at open(); dispatchAudioFrame asioOUT tee; Inbound(inid(1,0),...) mic feed; FSM TXA arming + TUN postgen; control-plane mapping; Step-14 translation retirements).</w:t>
+              <w:t>Bench gates PASSED: SSB voice both sidebands + RF-safety kill-test + MSHV→TCI→FT8 on-air.</w:t>
             </w:r>
           </w:p>
         </w:tc>
@@ -6329,6 +7729,1004 @@
         <w:pStyle w:val="Heading3"/>
       </w:pPr>
       <w:r>
+        <w:t>2026-06-14 -&gt; 2026-06-17 — post-P4: VAC v0.3.0/v0.3.1, native TX DSP rack, Profiles, TX monitor (#90), Out picker</w:t>
+      </w:r>
+    </w:p>
+    <w:p>
+      <w:r>
+        <w:t>These are post-direct-port work: native (Lyra-side) TX-DSP / host-audio / profile features that land ON TOP of the verbatim P0–P4 chain.  They are NOT direct ports (no Thetis ChannelMaster/ WDSP source counterpart) — logged here as a post-P4 section so the P0–P4 port-stage record above stays intact.</w:t>
+      </w:r>
+    </w:p>
+    <w:p>
+      <w:pPr>
+        <w:pStyle w:val="ListBullet"/>
+        <w:ind w:left="360"/>
+      </w:pPr>
+      <w:r>
+        <w:rPr>
+          <w:b/>
+        </w:rPr>
+        <w:t>VAC / IVAC (#102/#158)</w:t>
+      </w:r>
+      <w:r>
+        <w:t xml:space="preserve"> — PC/VAC mic-input + RX-to-PC path.</w:t>
+      </w:r>
+    </w:p>
+    <w:p>
+      <w:r>
+        <w:rPr>
+          <w:rFonts w:ascii="Consolas" w:hAnsi="Consolas"/>
+          <w:sz w:val="18"/>
+        </w:rPr>
+        <w:t>ivac.c</w:t>
+      </w:r>
+      <w:r>
+        <w:t xml:space="preserve"> -&gt; </w:t>
+      </w:r>
+      <w:r>
+        <w:rPr>
+          <w:rFonts w:ascii="Consolas" w:hAnsi="Consolas"/>
+          <w:sz w:val="18"/>
+        </w:rPr>
+        <w:t>wire/Ivac</w:t>
+      </w:r>
+      <w:r>
+        <w:t xml:space="preserve"> direct port (Stage 0/1 </w:t>
+      </w:r>
+      <w:r>
+        <w:rPr>
+          <w:rFonts w:ascii="Consolas" w:hAnsi="Consolas"/>
+          <w:sz w:val="18"/>
+        </w:rPr>
+        <w:t>4831db7</w:t>
+      </w:r>
+      <w:r>
+        <w:t>/</w:t>
+      </w:r>
+      <w:r>
+        <w:rPr>
+          <w:rFonts w:ascii="Consolas" w:hAnsi="Consolas"/>
+          <w:sz w:val="18"/>
+        </w:rPr>
+        <w:t>52adff3</w:t>
+      </w:r>
+      <w:r>
+        <w:t>),</w:t>
+      </w:r>
+    </w:p>
+    <w:p>
+      <w:r>
+        <w:t xml:space="preserve">#158 complete (RX decode + TX on-air + auto-start + profile VAC source) </w:t>
+      </w:r>
+      <w:r>
+        <w:rPr>
+          <w:rFonts w:ascii="Consolas" w:hAnsi="Consolas"/>
+          <w:sz w:val="18"/>
+        </w:rPr>
+        <w:t>6c3fecb</w:t>
+      </w:r>
+      <w:r>
+        <w:t xml:space="preserve">.  Released </w:t>
+      </w:r>
+      <w:r>
+        <w:rPr>
+          <w:b/>
+        </w:rPr>
+        <w:t>v0.2.4</w:t>
+      </w:r>
+      <w:r>
+        <w:t xml:space="preserve"> "Profiles + VAC" </w:t>
+      </w:r>
+      <w:r>
+        <w:rPr>
+          <w:rFonts w:ascii="Consolas" w:hAnsi="Consolas"/>
+          <w:sz w:val="18"/>
+        </w:rPr>
+        <w:t>c48c94d</w:t>
+      </w:r>
+      <w:r>
+        <w:t xml:space="preserve">; VAC mic mono-combine fix </w:t>
+      </w:r>
+      <w:r>
+        <w:rPr>
+          <w:rFonts w:ascii="Consolas" w:hAnsi="Consolas"/>
+          <w:sz w:val="18"/>
+        </w:rPr>
+        <w:t>b57bd09</w:t>
+      </w:r>
+      <w:r>
+        <w:t xml:space="preserve"> -&gt; </w:t>
+      </w:r>
+      <w:r>
+        <w:rPr>
+          <w:b/>
+        </w:rPr>
+        <w:t>v0.2.5</w:t>
+      </w:r>
+      <w:r>
+        <w:t xml:space="preserve"> </w:t>
+      </w:r>
+      <w:r>
+        <w:rPr>
+          <w:rFonts w:ascii="Consolas" w:hAnsi="Consolas"/>
+          <w:sz w:val="18"/>
+        </w:rPr>
+        <w:t>f55da2c</w:t>
+      </w:r>
+      <w:r>
+        <w:t xml:space="preserve">. Device-layer rework DL-0..DL-5 (PortAudio 19.7.0 vendored static, single full-duplex stream, Thetis-faithful host-API/device pickers, RX-muted-on-TX via SetIVACmox, old Qt two-stream </w:t>
+      </w:r>
+      <w:r>
+        <w:rPr>
+          <w:rFonts w:ascii="Consolas" w:hAnsi="Consolas"/>
+          <w:sz w:val="18"/>
+        </w:rPr>
+        <w:t>ivac_audio</w:t>
+      </w:r>
+      <w:r>
+        <w:t xml:space="preserve"> retired): </w:t>
+      </w:r>
+      <w:r>
+        <w:rPr>
+          <w:rFonts w:ascii="Consolas" w:hAnsi="Consolas"/>
+          <w:sz w:val="18"/>
+        </w:rPr>
+        <w:t>11812f9</w:t>
+      </w:r>
+      <w:r>
+        <w:t>..</w:t>
+      </w:r>
+      <w:r>
+        <w:rPr>
+          <w:rFonts w:ascii="Consolas" w:hAnsi="Consolas"/>
+          <w:sz w:val="18"/>
+        </w:rPr>
+        <w:t>e8d0239</w:t>
+      </w:r>
+      <w:r>
+        <w:t xml:space="preserve">; plus two crash fixes — VAC-teardown UAF </w:t>
+      </w:r>
+      <w:r>
+        <w:rPr>
+          <w:rFonts w:ascii="Consolas" w:hAnsi="Consolas"/>
+          <w:sz w:val="18"/>
+        </w:rPr>
+        <w:t>f0c6497</w:t>
+      </w:r>
+      <w:r>
+        <w:t xml:space="preserve">, TCI dangling-owner </w:t>
+      </w:r>
+      <w:r>
+        <w:rPr>
+          <w:rFonts w:ascii="Consolas" w:hAnsi="Consolas"/>
+          <w:sz w:val="18"/>
+        </w:rPr>
+        <w:t>d508b8e</w:t>
+      </w:r>
+      <w:r>
+        <w:t xml:space="preserve">. TX MIC/ALC/LVL meters re-homed onto wire-live </w:t>
+      </w:r>
+      <w:r>
+        <w:rPr>
+          <w:rFonts w:ascii="Consolas" w:hAnsi="Consolas"/>
+          <w:sz w:val="18"/>
+        </w:rPr>
+        <w:t>GetTXAMeter</w:t>
+      </w:r>
+      <w:r>
+        <w:t xml:space="preserve"> </w:t>
+      </w:r>
+      <w:r>
+        <w:rPr>
+          <w:rFonts w:ascii="Consolas" w:hAnsi="Consolas"/>
+          <w:sz w:val="18"/>
+        </w:rPr>
+        <w:t>993e10e</w:t>
+      </w:r>
+      <w:r>
+        <w:t xml:space="preserve">.  Released </w:t>
+      </w:r>
+      <w:r>
+        <w:rPr>
+          <w:b/>
+        </w:rPr>
+        <w:t>v0.3.0</w:t>
+      </w:r>
+      <w:r>
+        <w:t xml:space="preserve"> </w:t>
+      </w:r>
+      <w:r>
+        <w:rPr>
+          <w:rFonts w:ascii="Consolas" w:hAnsi="Consolas"/>
+          <w:sz w:val="18"/>
+        </w:rPr>
+        <w:t>accee55</w:t>
+      </w:r>
+      <w:r>
+        <w:t xml:space="preserve">.  Then </w:t>
+      </w:r>
+      <w:r>
+        <w:rPr>
+          <w:b/>
+        </w:rPr>
+        <w:t>v0.3.1</w:t>
+      </w:r>
+      <w:r>
+        <w:t xml:space="preserve"> </w:t>
+      </w:r>
+      <w:r>
+        <w:rPr>
+          <w:rFonts w:ascii="Consolas" w:hAnsi="Consolas"/>
+          <w:sz w:val="18"/>
+        </w:rPr>
+        <w:t>a3a517f</w:t>
+      </w:r>
+      <w:r>
+        <w:t xml:space="preserve">: VAC enable/disable crash fix + Vol/Mute routed to VAC </w:t>
+      </w:r>
+      <w:r>
+        <w:rPr>
+          <w:rFonts w:ascii="Consolas" w:hAnsi="Consolas"/>
+          <w:sz w:val="18"/>
+        </w:rPr>
+        <w:t>77dc55d</w:t>
+      </w:r>
+      <w:r>
+        <w:t xml:space="preserve"> (#161) + Thetis-format TX MIC/ALC/LEV metering + #49 profile Leveler/ALC fields </w:t>
+      </w:r>
+      <w:r>
+        <w:rPr>
+          <w:rFonts w:ascii="Consolas" w:hAnsi="Consolas"/>
+          <w:sz w:val="18"/>
+        </w:rPr>
+        <w:t>9594bd5</w:t>
+      </w:r>
+      <w:r>
+        <w:t xml:space="preserve"> (#160).  v0.3.1 addresses the v0.3.0-banner "TX metering UNVERIFIED" loose-end in code (#160 bench close-out / Brent+Timmy field-confirm still in progress). Interim VAC-UI fixes (</w:t>
+      </w:r>
+      <w:r>
+        <w:rPr>
+          <w:rFonts w:ascii="Consolas" w:hAnsi="Consolas"/>
+          <w:sz w:val="18"/>
+        </w:rPr>
+        <w:t>88bdab1</w:t>
+      </w:r>
+      <w:r>
+        <w:t xml:space="preserve"> relabel, </w:t>
+      </w:r>
+      <w:r>
+        <w:rPr>
+          <w:rFonts w:ascii="Consolas" w:hAnsi="Consolas"/>
+          <w:sz w:val="18"/>
+        </w:rPr>
+        <w:t>b57bd09</w:t>
+      </w:r>
+      <w:r>
+        <w:t xml:space="preserve"> combine, </w:t>
+      </w:r>
+      <w:r>
+        <w:rPr>
+          <w:rFonts w:ascii="Consolas" w:hAnsi="Consolas"/>
+          <w:sz w:val="18"/>
+        </w:rPr>
+        <w:t>a01d308</w:t>
+      </w:r>
+      <w:r>
+        <w:t xml:space="preserve"> output-"(none)") shipped along the way.</w:t>
+      </w:r>
+    </w:p>
+    <w:p>
+      <w:pPr>
+        <w:pStyle w:val="ListBullet"/>
+        <w:ind w:left="360"/>
+      </w:pPr>
+      <w:r>
+        <w:rPr>
+          <w:b/>
+        </w:rPr>
+        <w:t>Stage F — native TX DSP rack (pre-WDSP-TXA mic rack):</w:t>
+      </w:r>
+    </w:p>
+    <w:p>
+      <w:pPr>
+        <w:pStyle w:val="ListBullet"/>
+        <w:ind w:left="792"/>
+      </w:pPr>
+      <w:r>
+        <w:rPr>
+          <w:b/>
+        </w:rPr>
+        <w:t>EQ #50</w:t>
+      </w:r>
+      <w:r>
+        <w:t xml:space="preserve"> — native ParamEq (RBJ biquad cascade) </w:t>
+      </w:r>
+      <w:r>
+        <w:rPr>
+          <w:rFonts w:ascii="Consolas" w:hAnsi="Consolas"/>
+          <w:sz w:val="18"/>
+        </w:rPr>
+        <w:t>edbaa52</w:t>
+      </w:r>
+      <w:r>
+        <w:t>;</w:t>
+      </w:r>
+    </w:p>
+    <w:p>
+      <w:r>
+        <w:t xml:space="preserve">EqModel + EESDR3-style panel </w:t>
+      </w:r>
+      <w:r>
+        <w:rPr>
+          <w:rFonts w:ascii="Consolas" w:hAnsi="Consolas"/>
+          <w:sz w:val="18"/>
+        </w:rPr>
+        <w:t>17a28b7</w:t>
+      </w:r>
+      <w:r>
+        <w:t xml:space="preserve">; wired into the live TX mic rack </w:t>
+      </w:r>
+      <w:r>
+        <w:rPr>
+          <w:rFonts w:ascii="Consolas" w:hAnsi="Consolas"/>
+          <w:sz w:val="18"/>
+        </w:rPr>
+        <w:t>eb92231</w:t>
+      </w:r>
+      <w:r>
+        <w:t>.</w:t>
+      </w:r>
+    </w:p>
+    <w:p>
+      <w:pPr>
+        <w:pStyle w:val="ListBullet"/>
+        <w:ind w:left="792"/>
+      </w:pPr>
+      <w:r>
+        <w:rPr>
+          <w:b/>
+        </w:rPr>
+        <w:t>Digital-mode auto-bypass</w:t>
+      </w:r>
+      <w:r>
+        <w:t xml:space="preserve"> of the native mic DSP (DIGU/DIGL)</w:t>
+      </w:r>
+    </w:p>
+    <w:p>
+      <w:r>
+        <w:rPr>
+          <w:rFonts w:ascii="Consolas" w:hAnsi="Consolas"/>
+          <w:sz w:val="18"/>
+        </w:rPr>
+        <w:t>c8441a6</w:t>
+      </w:r>
+      <w:r>
+        <w:t>.</w:t>
+      </w:r>
+    </w:p>
+    <w:p>
+      <w:pPr>
+        <w:pStyle w:val="ListBullet"/>
+        <w:ind w:left="792"/>
+      </w:pPr>
+      <w:r>
+        <w:rPr>
+          <w:b/>
+        </w:rPr>
+        <w:t>Speech #88</w:t>
+      </w:r>
+      <w:r>
+        <w:t xml:space="preserve"> — native SpeechProcessor (Auto-AGC leveller +</w:t>
+      </w:r>
+    </w:p>
+    <w:p>
+      <w:r>
+        <w:t xml:space="preserve">de-esser) </w:t>
+      </w:r>
+      <w:r>
+        <w:rPr>
+          <w:rFonts w:ascii="Consolas" w:hAnsi="Consolas"/>
+          <w:sz w:val="18"/>
+        </w:rPr>
+        <w:t>902b814</w:t>
+      </w:r>
+      <w:r>
+        <w:t xml:space="preserve">; Speech panel + EQ analyzer + Reset-All </w:t>
+      </w:r>
+      <w:r>
+        <w:rPr>
+          <w:rFonts w:ascii="Consolas" w:hAnsi="Consolas"/>
+          <w:sz w:val="18"/>
+        </w:rPr>
+        <w:t>93adb39</w:t>
+      </w:r>
+      <w:r>
+        <w:t>.</w:t>
+      </w:r>
+    </w:p>
+    <w:p>
+      <w:pPr>
+        <w:pStyle w:val="ListBullet"/>
+        <w:ind w:left="792"/>
+      </w:pPr>
+      <w:r>
+        <w:rPr>
+          <w:b/>
+        </w:rPr>
+        <w:t>Combinator #51</w:t>
+      </w:r>
+      <w:r>
+        <w:t xml:space="preserve"> — native engine </w:t>
+      </w:r>
+      <w:r>
+        <w:rPr>
+          <w:rFonts w:ascii="Consolas" w:hAnsi="Consolas"/>
+          <w:sz w:val="18"/>
+        </w:rPr>
+        <w:t>013bf12</w:t>
+      </w:r>
+      <w:r>
+        <w:t>; model+panel+dock</w:t>
+      </w:r>
+    </w:p>
+    <w:p>
+      <w:r>
+        <w:rPr>
+          <w:rFonts w:ascii="Consolas" w:hAnsi="Consolas"/>
+          <w:sz w:val="18"/>
+        </w:rPr>
+        <w:t>61e16c4</w:t>
+      </w:r>
+      <w:r>
+        <w:t xml:space="preserve">; wired into the live rack after EQ </w:t>
+      </w:r>
+      <w:r>
+        <w:rPr>
+          <w:rFonts w:ascii="Consolas" w:hAnsi="Consolas"/>
+          <w:sz w:val="18"/>
+        </w:rPr>
+        <w:t>b53ae35</w:t>
+      </w:r>
+      <w:r>
+        <w:t>.</w:t>
+      </w:r>
+    </w:p>
+    <w:p>
+      <w:pPr>
+        <w:pStyle w:val="ListBullet"/>
+        <w:ind w:left="792"/>
+      </w:pPr>
+      <w:r>
+        <w:rPr>
+          <w:b/>
+        </w:rPr>
+        <w:t>Plate #52</w:t>
+      </w:r>
+      <w:r>
+        <w:t xml:space="preserve"> — native Schroeder–Moorer engine </w:t>
+      </w:r>
+      <w:r>
+        <w:rPr>
+          <w:rFonts w:ascii="Consolas" w:hAnsi="Consolas"/>
+          <w:sz w:val="18"/>
+        </w:rPr>
+        <w:t>ae9c5d3</w:t>
+      </w:r>
+      <w:r>
+        <w:t>;</w:t>
+      </w:r>
+    </w:p>
+    <w:p>
+      <w:r>
+        <w:t xml:space="preserve">PlateModel + "Plating" panel </w:t>
+      </w:r>
+      <w:r>
+        <w:rPr>
+          <w:rFonts w:ascii="Consolas" w:hAnsi="Consolas"/>
+          <w:sz w:val="18"/>
+        </w:rPr>
+        <w:t>0cfd7e5</w:t>
+      </w:r>
+      <w:r>
+        <w:t xml:space="preserve">; wired after Combinator </w:t>
+      </w:r>
+      <w:r>
+        <w:rPr>
+          <w:rFonts w:ascii="Consolas" w:hAnsi="Consolas"/>
+          <w:sz w:val="18"/>
+        </w:rPr>
+        <w:t>e96a6e8</w:t>
+      </w:r>
+      <w:r>
+        <w:t>.</w:t>
+      </w:r>
+    </w:p>
+    <w:p>
+      <w:pPr>
+        <w:pStyle w:val="ListBullet"/>
+        <w:ind w:left="792"/>
+      </w:pPr>
+      <w:r>
+        <w:t>Rack-lamp dim in digital/CW + EQ analyzer recolor (#163)</w:t>
+      </w:r>
+    </w:p>
+    <w:p>
+      <w:r>
+        <w:rPr>
+          <w:rFonts w:ascii="Consolas" w:hAnsi="Consolas"/>
+          <w:sz w:val="18"/>
+        </w:rPr>
+        <w:t>9be1fc1</w:t>
+      </w:r>
+      <w:r>
+        <w:t xml:space="preserve"> / </w:t>
+      </w:r>
+      <w:r>
+        <w:rPr>
+          <w:rFonts w:ascii="Consolas" w:hAnsi="Consolas"/>
+          <w:sz w:val="18"/>
+        </w:rPr>
+        <w:t>558d5d9</w:t>
+      </w:r>
+      <w:r>
+        <w:t>.</w:t>
+      </w:r>
+    </w:p>
+    <w:p>
+      <w:pPr>
+        <w:pStyle w:val="ListBullet"/>
+        <w:ind w:left="360"/>
+      </w:pPr>
+      <w:r>
+        <w:rPr>
+          <w:b/>
+        </w:rPr>
+        <w:t>Profiles #49 (TX/RX profile manager):</w:t>
+      </w:r>
+      <w:r>
+        <w:t xml:space="preserve"> rack</w:t>
+      </w:r>
+    </w:p>
+    <w:p>
+      <w:r>
+        <w:t xml:space="preserve">saveState/loadState round-trip </w:t>
+      </w:r>
+      <w:r>
+        <w:rPr>
+          <w:rFonts w:ascii="Consolas" w:hAnsi="Consolas"/>
+          <w:sz w:val="18"/>
+        </w:rPr>
+        <w:t>e0f264e</w:t>
+      </w:r>
+      <w:r>
+        <w:t xml:space="preserve"> (Stage 1); schema v3 bundling the native rack blobs </w:t>
+      </w:r>
+      <w:r>
+        <w:rPr>
+          <w:rFonts w:ascii="Consolas" w:hAnsi="Consolas"/>
+          <w:sz w:val="18"/>
+        </w:rPr>
+        <w:t>b453320</w:t>
+      </w:r>
+      <w:r>
+        <w:t xml:space="preserve"> (Stage 2); rack wired into profile capture/apply </w:t>
+      </w:r>
+      <w:r>
+        <w:rPr>
+          <w:rFonts w:ascii="Consolas" w:hAnsi="Consolas"/>
+          <w:sz w:val="18"/>
+        </w:rPr>
+        <w:t>29f9b92</w:t>
+      </w:r>
+      <w:r>
+        <w:t xml:space="preserve"> (Stage 3).  Sideband- and band-agnostic SSB profile </w:t>
+      </w:r>
+      <w:r>
+        <w:rPr>
+          <w:rFonts w:ascii="Consolas" w:hAnsi="Consolas"/>
+          <w:sz w:val="18"/>
+        </w:rPr>
+        <w:t>296cafc</w:t>
+      </w:r>
+      <w:r>
+        <w:t xml:space="preserve">.  Panel-lock float-drag fix </w:t>
+      </w:r>
+      <w:r>
+        <w:rPr>
+          <w:rFonts w:ascii="Consolas" w:hAnsi="Consolas"/>
+          <w:sz w:val="18"/>
+        </w:rPr>
+        <w:t>a82eb77</w:t>
+      </w:r>
+      <w:r>
+        <w:t xml:space="preserve"> (exclude TX rack panels from LOCK) + lock also blocks resize/custom-float </w:t>
+      </w:r>
+      <w:r>
+        <w:rPr>
+          <w:rFonts w:ascii="Consolas" w:hAnsi="Consolas"/>
+          <w:sz w:val="18"/>
+        </w:rPr>
+        <w:t>cf976c1</w:t>
+      </w:r>
+      <w:r>
+        <w:t xml:space="preserve">.  TX Speech profile capture + toggle-lamp refresh on recall (#162) </w:t>
+      </w:r>
+      <w:r>
+        <w:rPr>
+          <w:rFonts w:ascii="Consolas" w:hAnsi="Consolas"/>
+          <w:sz w:val="18"/>
+        </w:rPr>
+        <w:t>c17960c</w:t>
+      </w:r>
+      <w:r>
+        <w:t xml:space="preserve"> / </w:t>
+      </w:r>
+      <w:r>
+        <w:rPr>
+          <w:rFonts w:ascii="Consolas" w:hAnsi="Consolas"/>
+          <w:sz w:val="18"/>
+        </w:rPr>
+        <w:t>46a428f</w:t>
+      </w:r>
+      <w:r>
+        <w:t>.</w:t>
+      </w:r>
+    </w:p>
+    <w:p>
+      <w:pPr>
+        <w:pStyle w:val="ListBullet"/>
+        <w:ind w:left="360"/>
+      </w:pPr>
+      <w:r>
+        <w:rPr>
+          <w:b/>
+        </w:rPr>
+        <w:t>TX audio monitor #90</w:t>
+      </w:r>
+      <w:r>
+        <w:t xml:space="preserve"> — Route 1 (MON button + Monitor slider,</w:t>
+      </w:r>
+    </w:p>
+    <w:p>
+      <w:r>
+        <w:t xml:space="preserve">HL2 jack) </w:t>
+      </w:r>
+      <w:r>
+        <w:rPr>
+          <w:rFonts w:ascii="Consolas" w:hAnsi="Consolas"/>
+          <w:sz w:val="18"/>
+        </w:rPr>
+        <w:t>6e6a282</w:t>
+      </w:r>
+      <w:r>
+        <w:t xml:space="preserve">; Routes 2+3 (VAC device + TCI RX-audio) </w:t>
+      </w:r>
+      <w:r>
+        <w:rPr>
+          <w:rFonts w:ascii="Consolas" w:hAnsi="Consolas"/>
+          <w:sz w:val="18"/>
+        </w:rPr>
+        <w:t>e1fd186</w:t>
+      </w:r>
+      <w:r>
+        <w:t>.  Reference-verified against Thetis audio.cs.</w:t>
+      </w:r>
+    </w:p>
+    <w:p>
+      <w:pPr>
+        <w:pStyle w:val="ListBullet"/>
+        <w:ind w:left="360"/>
+      </w:pPr>
+      <w:r>
+        <w:rPr>
+          <w:b/>
+        </w:rPr>
+        <w:t>#164</w:t>
+      </w:r>
+      <w:r>
+        <w:t xml:space="preserve"> — inline Audio-panel "Out" output-device picker wired +</w:t>
+      </w:r>
+    </w:p>
+    <w:p>
+      <w:r>
+        <w:t xml:space="preserve">MON-&gt;MON-TX relabel </w:t>
+      </w:r>
+      <w:r>
+        <w:rPr>
+          <w:rFonts w:ascii="Consolas" w:hAnsi="Consolas"/>
+          <w:sz w:val="18"/>
+        </w:rPr>
+        <w:t>740f769</w:t>
+      </w:r>
+      <w:r>
+        <w:t>.</w:t>
+      </w:r>
+    </w:p>
+    <w:p>
+      <w:pPr>
+        <w:pStyle w:val="ListBullet"/>
+        <w:ind w:left="360"/>
+      </w:pPr>
+      <w:r>
+        <w:t xml:space="preserve">USER_GUIDE catch-up commits (minor): </w:t>
+      </w:r>
+      <w:r>
+        <w:rPr>
+          <w:rFonts w:ascii="Consolas" w:hAnsi="Consolas"/>
+          <w:sz w:val="18"/>
+        </w:rPr>
+        <w:t>66adc5e</w:t>
+      </w:r>
+      <w:r>
+        <w:t xml:space="preserve">, </w:t>
+      </w:r>
+      <w:r>
+        <w:rPr>
+          <w:rFonts w:ascii="Consolas" w:hAnsi="Consolas"/>
+          <w:sz w:val="18"/>
+        </w:rPr>
+        <w:t>266d8cd</w:t>
+      </w:r>
+      <w:r>
+        <w:t>,</w:t>
+      </w:r>
+    </w:p>
+    <w:p>
+      <w:r>
+        <w:rPr>
+          <w:rFonts w:ascii="Consolas" w:hAnsi="Consolas"/>
+          <w:sz w:val="18"/>
+        </w:rPr>
+        <w:t>dc45485</w:t>
+      </w:r>
+      <w:r>
+        <w:t>.</w:t>
+      </w:r>
+    </w:p>
+    <w:p>
+      <w:pPr>
+        <w:pStyle w:val="Heading3"/>
+      </w:pPr>
+      <w:r>
+        <w:t>2026-06-13 — P4 Wire-LIVE switchover + v0.2.3 release ([DONE] HL2 bench PASSED)</w:t>
+      </w:r>
+    </w:p>
+    <w:p>
+      <w:pPr>
+        <w:pStyle w:val="ListBullet"/>
+        <w:ind w:left="360"/>
+      </w:pPr>
+      <w:r>
+        <w:rPr>
+          <w:b/>
+        </w:rPr>
+        <w:t>P4.a prep</w:t>
+      </w:r>
+      <w:r>
+        <w:t xml:space="preserve"> (wire-inert): sendProtocol1Samples verbatim</w:t>
+      </w:r>
+    </w:p>
+    <w:p>
+      <w:r>
+        <w:rPr>
+          <w:rFonts w:ascii="Consolas" w:hAnsi="Consolas"/>
+          <w:sz w:val="18"/>
+        </w:rPr>
+        <w:t>a4aa8c3</w:t>
+      </w:r>
+      <w:r>
+        <w:t xml:space="preserve"> + SetTXAPostGen/TxReadBufp/hWriteThreadMain field types </w:t>
+      </w:r>
+      <w:r>
+        <w:rPr>
+          <w:rFonts w:ascii="Consolas" w:hAnsi="Consolas"/>
+          <w:sz w:val="18"/>
+        </w:rPr>
+        <w:t>baef866</w:t>
+      </w:r>
+      <w:r>
+        <w:t>.</w:t>
+      </w:r>
+    </w:p>
+    <w:p>
+      <w:pPr>
+        <w:pStyle w:val="ListBullet"/>
+        <w:ind w:left="360"/>
+      </w:pPr>
+      <w:r>
+        <w:rPr>
+          <w:b/>
+        </w:rPr>
+        <w:t>P4.b SHIPPED</w:t>
+      </w:r>
+      <w:r>
+        <w:t xml:space="preserve"> (3 commits, operator HL2 bench PASSED 2026-06-13):</w:t>
+      </w:r>
+    </w:p>
+    <w:p>
+      <w:r>
+        <w:rPr>
+          <w:rFonts w:ascii="Consolas" w:hAnsi="Consolas"/>
+          <w:sz w:val="18"/>
+        </w:rPr>
+        <w:t>fb9ec41</w:t>
+      </w:r>
+      <w:r>
+        <w:t xml:space="preserve"> Wire-LIVE RX-out gate, </w:t>
+      </w:r>
+      <w:r>
+        <w:rPr>
+          <w:rFonts w:ascii="Consolas" w:hAnsi="Consolas"/>
+          <w:sz w:val="18"/>
+        </w:rPr>
+        <w:t>0b551b4</w:t>
+      </w:r>
+      <w:r>
+        <w:t xml:space="preserve"> first modulated RF through the direct-port chain, </w:t>
+      </w:r>
+      <w:r>
+        <w:rPr>
+          <w:rFonts w:ascii="Consolas" w:hAnsi="Consolas"/>
+          <w:sz w:val="18"/>
+        </w:rPr>
+        <w:t>9db2c50</w:t>
+      </w:r>
+      <w:r>
+        <w:t xml:space="preserve"> SSB sideband fix (USB transmits USB, 9100-verified).  Plus </w:t>
+      </w:r>
+      <w:r>
+        <w:rPr>
+          <w:rFonts w:ascii="Consolas" w:hAnsi="Consolas"/>
+          <w:sz w:val="18"/>
+        </w:rPr>
+        <w:t>84dbb12</w:t>
+      </w:r>
+      <w:r>
+        <w:t xml:space="preserve"> TUN panadapter-spike fix (display-only, Thetis-exact zero-beat).</w:t>
+      </w:r>
+    </w:p>
+    <w:p>
+      <w:pPr>
+        <w:pStyle w:val="ListBullet"/>
+        <w:ind w:left="360"/>
+      </w:pPr>
+      <w:r>
+        <w:rPr>
+          <w:b/>
+        </w:rPr>
+        <w:t>§7 retirements DONE:</w:t>
+      </w:r>
+      <w:r>
+        <w:t xml:space="preserve"> </w:t>
+      </w:r>
+      <w:r>
+        <w:rPr>
+          <w:rFonts w:ascii="Consolas" w:hAnsi="Consolas"/>
+          <w:sz w:val="18"/>
+        </w:rPr>
+        <w:t>fe6a438</w:t>
+      </w:r>
+      <w:r>
+        <w:t xml:space="preserve"> OutboundRing+Ep2SendThread,</w:t>
+      </w:r>
+    </w:p>
+    <w:p>
+      <w:r>
+        <w:rPr>
+          <w:rFonts w:ascii="Consolas" w:hAnsi="Consolas"/>
+          <w:sz w:val="18"/>
+        </w:rPr>
+        <w:t>99fd24a</w:t>
+      </w:r>
+      <w:r>
+        <w:t xml:space="preserve"> txWorkerLoop+composeCC+keepalive, </w:t>
+      </w:r>
+      <w:r>
+        <w:rPr>
+          <w:rFonts w:ascii="Consolas" w:hAnsi="Consolas"/>
+          <w:sz w:val="18"/>
+        </w:rPr>
+        <w:t>e711256</w:t>
+      </w:r>
+      <w:r>
+        <w:t xml:space="preserve"> old HL2-jack EP2 ring.</w:t>
+      </w:r>
+    </w:p>
+    <w:p>
+      <w:pPr>
+        <w:pStyle w:val="ListBullet"/>
+        <w:ind w:left="360"/>
+      </w:pPr>
+      <w:r>
+        <w:rPr>
+          <w:b/>
+        </w:rPr>
+        <w:t>TCI digital TX re-home</w:t>
+      </w:r>
+      <w:r>
+        <w:t xml:space="preserve"> </w:t>
+      </w:r>
+      <w:r>
+        <w:rPr>
+          <w:rFonts w:ascii="Consolas" w:hAnsi="Consolas"/>
+          <w:sz w:val="18"/>
+        </w:rPr>
+        <w:t>bd61d07</w:t>
+      </w:r>
+      <w:r>
+        <w:t xml:space="preserve"> (first FT8 QSOs via MSHV/TCI</w:t>
+      </w:r>
+    </w:p>
+    <w:p>
+      <w:r>
+        <w:t xml:space="preserve">through the verbatim chain) + space-bar PTT toggle </w:t>
+      </w:r>
+      <w:r>
+        <w:rPr>
+          <w:rFonts w:ascii="Consolas" w:hAnsi="Consolas"/>
+          <w:sz w:val="18"/>
+        </w:rPr>
+        <w:t>2824ebf</w:t>
+      </w:r>
+      <w:r>
+        <w:t xml:space="preserve"> (#157).</w:t>
+      </w:r>
+    </w:p>
+    <w:p>
+      <w:pPr>
+        <w:pStyle w:val="ListBullet"/>
+        <w:ind w:left="360"/>
+      </w:pPr>
+      <w:r>
+        <w:t xml:space="preserve">Released </w:t>
+      </w:r>
+      <w:r>
+        <w:rPr>
+          <w:b/>
+        </w:rPr>
+        <w:t>v0.2.3</w:t>
+      </w:r>
+      <w:r>
+        <w:t xml:space="preserve"> "Transmit (SSB + digital TCI) on air"</w:t>
+      </w:r>
+    </w:p>
+    <w:p>
+      <w:r>
+        <w:rPr>
+          <w:rFonts w:ascii="Consolas" w:hAnsi="Consolas"/>
+          <w:sz w:val="18"/>
+        </w:rPr>
+        <w:t>e8aafbc</w:t>
+      </w:r>
+      <w:r>
+        <w:t xml:space="preserve"> (tags </w:t>
+      </w:r>
+      <w:r>
+        <w:rPr>
+          <w:rFonts w:ascii="Consolas" w:hAnsi="Consolas"/>
+          <w:sz w:val="18"/>
+        </w:rPr>
+        <w:t>v0.2.3</w:t>
+      </w:r>
+      <w:r>
+        <w:t xml:space="preserve"> + </w:t>
+      </w:r>
+      <w:r>
+        <w:rPr>
+          <w:rFonts w:ascii="Consolas" w:hAnsi="Consolas"/>
+          <w:sz w:val="18"/>
+        </w:rPr>
+        <w:t>tx-working-2026-06-13</w:t>
+      </w:r>
+      <w:r>
+        <w:t>).</w:t>
+      </w:r>
+    </w:p>
+    <w:p>
+      <w:pPr>
+        <w:pStyle w:val="Heading3"/>
+      </w:pPr>
+      <w:r>
         <w:t>2026-06-12 — P0.d cmbuffs/cmaster/cmsetup VERBATIM port ([DONE] HL2 bench PASSED)</w:t>
       </w:r>
     </w:p>
@@ -7027,10 +9425,78 @@
         <w:rPr>
           <w:b/>
         </w:rPr>
-        <w:t>Then:</w:t>
-      </w:r>
-      <w:r>
-        <w:t xml:space="preserve"> wait for operator decision on which Stage (C / D / E / F / open-questions item) to land next.  Each Stage gets its own grounded design + reference-read + smallest-revertable- step + bench-gated implementation pattern matching the Stage B arc.</w:t>
+        <w:t>Then — current open queue (one task):</w:t>
+      </w:r>
+      <w:r>
+        <w:t xml:space="preserve"> an </w:t>
+      </w:r>
+      <w:r>
+        <w:rPr>
+          <w:b/>
+        </w:rPr>
+        <w:t>AM/DSB sideband bug</w:t>
+      </w:r>
+      <w:r>
+        <w:t xml:space="preserve"> — AM and DSB modes produce only the upper sideband (lower sideband missing).  RX-DSP investigation: the WDSP passband for AM/DSB is likely being set one-sided instead of symmetric (-W..+W around DC).  Grounded design + reference- read + smallest-revertable-step + bench-gate, matching the Stage B arc.</w:t>
+      </w:r>
+    </w:p>
+    <w:p>
+      <w:r>
+        <w:t xml:space="preserve">Also pending operator discussion: </w:t>
+      </w:r>
+      <w:r>
+        <w:rPr>
+          <w:b/>
+        </w:rPr>
+        <w:t>GitHub / main-branch posture</w:t>
+      </w:r>
+      <w:r>
+        <w:t xml:space="preserve"> (</w:t>
+      </w:r>
+      <w:r>
+        <w:rPr>
+          <w:rFonts w:ascii="Consolas" w:hAnsi="Consolas"/>
+          <w:sz w:val="18"/>
+        </w:rPr>
+        <w:t>main</w:t>
+      </w:r>
+      <w:r>
+        <w:t xml:space="preserve"> vs </w:t>
+      </w:r>
+      <w:r>
+        <w:rPr>
+          <w:rFonts w:ascii="Consolas" w:hAnsi="Consolas"/>
+          <w:sz w:val="18"/>
+        </w:rPr>
+        <w:t>tx-rebuild</w:t>
+      </w:r>
+      <w:r>
+        <w:t xml:space="preserve"> reconciliation; current HEAD == </w:t>
+      </w:r>
+      <w:r>
+        <w:rPr>
+          <w:rFonts w:ascii="Consolas" w:hAnsi="Consolas"/>
+          <w:sz w:val="18"/>
+        </w:rPr>
+        <w:t>tx-rebuild</w:t>
+      </w:r>
+      <w:r>
+        <w:t xml:space="preserve"> == </w:t>
+      </w:r>
+      <w:r>
+        <w:rPr>
+          <w:rFonts w:ascii="Consolas" w:hAnsi="Consolas"/>
+          <w:sz w:val="18"/>
+        </w:rPr>
+        <w:t>dc45485</w:t>
+      </w:r>
+      <w:r>
+        <w:t>).</w:t>
+      </w:r>
+    </w:p>
+    <w:p>
+      <w:r>
+        <w:t>The earlier post-P4 ordering (TX metering -&gt; Stage F DSP rack -&gt; Profiles -&gt; RX2/Split -&gt; PureSignal) is largely SHIPPED through v0.3.1: TX metering closed (#160), Stage F native DSP rack + Profiles #49 + TX monitor #90 all landed (see the SHIPPED-WORK LOG).  Still PEND: RX2 + Split (#96–#101) and PureSignal (Stage G/H, v0.3) — both remain as the next major arcs after the AM/DSB fix.</w:t>
       </w:r>
     </w:p>
     <w:p>
@@ -7042,7 +9508,17 @@
     </w:p>
     <w:p>
       <w:r>
-        <w:t>*Last updated: 2026-06-08 EOD — Stage B aamix.c port shipped + bench-validated.  Next port target = operator's call.*</w:t>
+        <w:t xml:space="preserve">*Last updated: 2026-06-17 — post-P4 native work SHIPPED: VAC closeout v0.3.1 (TX metering #160 addresses the v0.3.0 UNVERIFIED loose-end in code; #160 bench close-out + tester field-confirm still in progress), Stage-F native TX DSP rack (EQ #50 / Speech #88 / Combinator #51 / Plate #52), Profiles #49, TX monitor #90 + Out picker #164.  P1/obbuffs flipped [WIP]-&gt;[DONE] (wire-LIVE since P4.b).  HEAD == tx-rebuild == </w:t>
+      </w:r>
+      <w:r>
+        <w:rPr>
+          <w:rFonts w:ascii="Consolas" w:hAnsi="Consolas"/>
+          <w:sz w:val="18"/>
+        </w:rPr>
+        <w:t>dc45485</w:t>
+      </w:r>
+      <w:r>
+        <w:t>.  Active task: AM/DSB-only-upper-sideband RX-DSP bug.  RX2/Split + PureSignal remain PEND.*</w:t>
       </w:r>
     </w:p>
     <w:sectPr>
@@ -7067,7 +9543,7 @@
         <w:color w:val="808080"/>
         <w:sz w:val="16"/>
       </w:rPr>
-      <w:t>Lyra-cpp Execution Plan — auto-generated 2026-06-12 19:00 (source: docs/EXECUTION_PLAN.md)</w:t>
+      <w:t>Lyra-cpp — Thetis Direct-Port Plan (TX) — auto-generated 2026-06-17 15:00 (source: THETIS_DIRECT_PORT_PLAN.md)</w:t>
     </w:r>
   </w:p>
 </w:hdr>

</xml_diff>

<commit_message>
docs: CW TX (#105) port plan mapped + v0.4.0/main EOD reconcile
- NEW docs/architecture/cw_tx_design.md — full CW transmit port plan from a
  2-lane reference dive (Thetis host cwx.cs/console.cs/TXA.c + HL2 wire
  networkproto1.c + operator HL2+ gateware RTL). Key finding: HL2 CW is
  100% gateware-keyed (no host/WDSP carrier; EP2 TX-I/Q bypassed during CW;
  FPGA envelope ramp + HW sidetone). The verbatim EP2 CW packer is already
  in tree (NetworkProto1.cpp:99-108, dormant). Build order C-1..C-5;
  flagged 0x0b C&C collision with the shipped ATT-on-TX step-attenuator.
- THETIS_DIRECT_PORT_PLAN: resume pointer reconciled — AM/DSB fixed +
  v0.4.0 released, main is the trunk, CW TX design mapped (+ regen pdf/docx).
- SESSION_LOG: 2026-06-17 EOD entry (UI batch, main consolidation, v0.4.0
  release, #156 parked, CW TX mapped) (+ regen pdf).

Co-Authored-By: Claude Opus 4.8 (1M context) <noreply@anthropic.com>
</commit_message>
<xml_diff>
--- a/docs/THETIS_DIRECT_PORT_PLAN.docx
+++ b/docs/THETIS_DIRECT_PORT_PLAN.docx
@@ -9425,33 +9425,10 @@
         <w:rPr>
           <w:b/>
         </w:rPr>
-        <w:t>Then — current open queue (one task):</w:t>
-      </w:r>
-      <w:r>
-        <w:t xml:space="preserve"> an </w:t>
-      </w:r>
-      <w:r>
-        <w:rPr>
-          <w:b/>
-        </w:rPr>
-        <w:t>AM/DSB sideband bug</w:t>
-      </w:r>
-      <w:r>
-        <w:t xml:space="preserve"> — AM and DSB modes produce only the upper sideband (lower sideband missing).  RX-DSP investigation: the WDSP passband for AM/DSB is likely being set one-sided instead of symmetric (-W..+W around DC).  Grounded design + reference- read + smallest-revertable-step + bench-gate, matching the Stage B arc.</w:t>
-      </w:r>
-    </w:p>
-    <w:p>
-      <w:r>
-        <w:t xml:space="preserve">Also pending operator discussion: </w:t>
-      </w:r>
-      <w:r>
-        <w:rPr>
-          <w:b/>
-        </w:rPr>
-        <w:t>GitHub / main-branch posture</w:t>
-      </w:r>
-      <w:r>
-        <w:t xml:space="preserve"> (</w:t>
+        <w:t>Branch posture (RESOLVED 2026-06-17):</w:t>
+      </w:r>
+      <w:r>
+        <w:t xml:space="preserve"> </w:t>
       </w:r>
       <w:r>
         <w:rPr>
@@ -9461,7 +9438,27 @@
         <w:t>main</w:t>
       </w:r>
       <w:r>
-        <w:t xml:space="preserve"> vs </w:t>
+        <w:t xml:space="preserve"> is the working trunk again — </w:t>
+      </w:r>
+      <w:r>
+        <w:rPr>
+          <w:rFonts w:ascii="Consolas" w:hAnsi="Consolas"/>
+          <w:sz w:val="18"/>
+        </w:rPr>
+        <w:t>main</w:t>
+      </w:r>
+      <w:r>
+        <w:t xml:space="preserve"> == </w:t>
+      </w:r>
+      <w:r>
+        <w:rPr>
+          <w:rFonts w:ascii="Consolas" w:hAnsi="Consolas"/>
+          <w:sz w:val="18"/>
+        </w:rPr>
+        <w:t>origin/main</w:t>
+      </w:r>
+      <w:r>
+        <w:t xml:space="preserve"> == </w:t>
       </w:r>
       <w:r>
         <w:rPr>
@@ -9471,7 +9468,36 @@
         <w:t>tx-rebuild</w:t>
       </w:r>
       <w:r>
-        <w:t xml:space="preserve"> reconciliation; current HEAD == </w:t>
+        <w:t xml:space="preserve"> == the </w:t>
+      </w:r>
+      <w:r>
+        <w:rPr>
+          <w:b/>
+        </w:rPr>
+        <w:t>v0.4.0</w:t>
+      </w:r>
+      <w:r>
+        <w:t xml:space="preserve"> release commit. Operator consolidated onto </w:t>
+      </w:r>
+      <w:r>
+        <w:rPr>
+          <w:rFonts w:ascii="Consolas" w:hAnsi="Consolas"/>
+          <w:sz w:val="18"/>
+        </w:rPr>
+        <w:t>main</w:t>
+      </w:r>
+      <w:r>
+        <w:t xml:space="preserve"> (TX largely done) to stop forgetting to fast-forward it. Do future work on </w:t>
+      </w:r>
+      <w:r>
+        <w:rPr>
+          <w:rFonts w:ascii="Consolas" w:hAnsi="Consolas"/>
+          <w:sz w:val="18"/>
+        </w:rPr>
+        <w:t>main</w:t>
+      </w:r>
+      <w:r>
+        <w:t xml:space="preserve">; </w:t>
       </w:r>
       <w:r>
         <w:rPr>
@@ -9481,22 +9507,122 @@
         <w:t>tx-rebuild</w:t>
       </w:r>
       <w:r>
-        <w:t xml:space="preserve"> == </w:t>
+        <w:t xml:space="preserve"> is a legacy ref.</w:t>
+      </w:r>
+    </w:p>
+    <w:p>
+      <w:r>
+        <w:rPr>
+          <w:b/>
+        </w:rPr>
+        <w:t>SHIPPED since the last revision of this pointer:</w:t>
+      </w:r>
+      <w:r>
+        <w:t xml:space="preserve"> the AM/DSB one-sided bug is </w:t>
+      </w:r>
+      <w:r>
+        <w:rPr>
+          <w:b/>
+        </w:rPr>
+        <w:t>FIXED</w:t>
+      </w:r>
+      <w:r>
+        <w:t xml:space="preserve"> (it was the SSB-only TX modulator, not an RX-DSP bug — RX was correct; the one-sided signal was the operator's own transmit) →</w:t>
+      </w:r>
+    </w:p>
+    <w:p>
+      <w:r>
+        <w:rPr>
+          <w:b/>
+        </w:rPr>
+        <w:t>native AM/DSB/SAM/FM transmit + AM carrier level</w:t>
+      </w:r>
+      <w:r>
+        <w:t xml:space="preserve"> shipped (#106/#93). Plus operator-visible ATT-on-TX (§15.31) and a UI-readability batch.</w:t>
+      </w:r>
+    </w:p>
+    <w:p>
+      <w:r>
+        <w:rPr>
+          <w:b/>
+        </w:rPr>
+        <w:t>Released v0.4.0</w:t>
+      </w:r>
+      <w:r>
+        <w:t xml:space="preserve"> (33 commits since v0.3.1; installer published to GitHub).</w:t>
+      </w:r>
+    </w:p>
+    <w:p>
+      <w:r>
+        <w:rPr>
+          <w:b/>
+        </w:rPr>
+        <w:t>Next major candidate — CW transmit (#105): DESIGN MAPPED 2026-06-17.</w:t>
+      </w:r>
+      <w:r>
+        <w:t xml:space="preserve"> See </w:t>
+      </w:r>
+      <w:r>
+        <w:rPr>
+          <w:b/>
+        </w:rPr>
+        <w:t>`docs/architecture/cw_tx_design.md`</w:t>
+      </w:r>
+      <w:r>
+        <w:t xml:space="preserve"> (full port plan from a 2-lane reference dive). Key finding: HL2 CW is </w:t>
+      </w:r>
+      <w:r>
+        <w:rPr>
+          <w:b/>
+        </w:rPr>
+        <w:t>100 % gateware-keyed</w:t>
+      </w:r>
+      <w:r>
+        <w:t xml:space="preserve"> — no host DSP/WDSP carrier synthesis, EP2 TX-I/Q bypassed during CW; the host sends key-state bits (the verbatim packer is ALREADY in tree at </w:t>
       </w:r>
       <w:r>
         <w:rPr>
           <w:rFonts w:ascii="Consolas" w:hAnsi="Consolas"/>
           <w:sz w:val="18"/>
         </w:rPr>
-        <w:t>dc45485</w:t>
-      </w:r>
-      <w:r>
-        <w:t>).</w:t>
+        <w:t>NetworkProto1.cpp:99-108</w:t>
+      </w:r>
+      <w:r>
+        <w:t xml:space="preserve">, dormant). Build order C-1..C-5 in the design doc; watch the </w:t>
+      </w:r>
+      <w:r>
+        <w:rPr>
+          <w:b/>
+        </w:rPr>
+        <w:t>0x0b C&amp;C register collision</w:t>
+      </w:r>
+      <w:r>
+        <w:t xml:space="preserve"> with the shipped ATT-on-TX step-attenuator before composing CW keyer config.</w:t>
       </w:r>
     </w:p>
     <w:p>
       <w:r>
-        <w:t>The earlier post-P4 ordering (TX metering -&gt; Stage F DSP rack -&gt; Profiles -&gt; RX2/Split -&gt; PureSignal) is largely SHIPPED through v0.3.1: TX metering closed (#160), Stage F native DSP rack + Profiles #49 + TX monitor #90 all landed (see the SHIPPED-WORK LOG).  Still PEND: RX2 + Split (#96–#101) and PureSignal (Stage G/H, v0.3) — both remain as the next major arcs after the AM/DSB fix.</w:t>
+        <w:t xml:space="preserve">Other open major arcs (unchanged): </w:t>
+      </w:r>
+      <w:r>
+        <w:rPr>
+          <w:b/>
+        </w:rPr>
+        <w:t>RX2 + Split</w:t>
+      </w:r>
+      <w:r>
+        <w:t xml:space="preserve"> (#96–#101) and</w:t>
+      </w:r>
+    </w:p>
+    <w:p>
+      <w:r>
+        <w:rPr>
+          <w:b/>
+        </w:rPr>
+        <w:t>PureSignal</w:t>
+      </w:r>
+      <w:r>
+        <w:t xml:space="preserve"> (Stage G/H). Smaller items: VOX (#91), voice keyer (#89), DSP buffer/latency options (#159), FM operator-knob refinement (#107), parked #156 (restart-after-hard-kill, intermittent).</w:t>
       </w:r>
     </w:p>
     <w:p>
@@ -9508,17 +9634,71 @@
     </w:p>
     <w:p>
       <w:r>
-        <w:t xml:space="preserve">*Last updated: 2026-06-17 — post-P4 native work SHIPPED: VAC closeout v0.3.1 (TX metering #160 addresses the v0.3.0 UNVERIFIED loose-end in code; #160 bench close-out + tester field-confirm still in progress), Stage-F native TX DSP rack (EQ #50 / Speech #88 / Combinator #51 / Plate #52), Profiles #49, TX monitor #90 + Out picker #164.  P1/obbuffs flipped [WIP]-&gt;[DONE] (wire-LIVE since P4.b).  HEAD == tx-rebuild == </w:t>
+        <w:t xml:space="preserve">*Last updated: 2026-06-17 EOD — </w:t>
+      </w:r>
+      <w:r>
+        <w:rPr>
+          <w:b/>
+        </w:rPr>
+        <w:t>v0.4.0 RELEASED</w:t>
+      </w:r>
+      <w:r>
+        <w:t xml:space="preserve"> (AM/DSB/FM transmit + AM carrier #106/#93, native TX DSP rack EQ/Speech/Combinator/Plate, Profiles</w:t>
+      </w:r>
+    </w:p>
+    <w:p>
+      <w:r>
+        <w:t xml:space="preserve">#49, TX monitor #90, ATT-on-TX §15.31, UI-readability batch).  </w:t>
       </w:r>
       <w:r>
         <w:rPr>
           <w:rFonts w:ascii="Consolas" w:hAnsi="Consolas"/>
           <w:sz w:val="18"/>
         </w:rPr>
-        <w:t>dc45485</w:t>
-      </w:r>
-      <w:r>
-        <w:t>.  Active task: AM/DSB-only-upper-sideband RX-DSP bug.  RX2/Split + PureSignal remain PEND.*</w:t>
+        <w:t>main</w:t>
+      </w:r>
+      <w:r>
+        <w:t xml:space="preserve"> is the trunk again: </w:t>
+      </w:r>
+      <w:r>
+        <w:rPr>
+          <w:rFonts w:ascii="Consolas" w:hAnsi="Consolas"/>
+          <w:sz w:val="18"/>
+        </w:rPr>
+        <w:t>main</w:t>
+      </w:r>
+      <w:r>
+        <w:t>==</w:t>
+      </w:r>
+      <w:r>
+        <w:rPr>
+          <w:rFonts w:ascii="Consolas" w:hAnsi="Consolas"/>
+          <w:sz w:val="18"/>
+        </w:rPr>
+        <w:t>origin/main</w:t>
+      </w:r>
+      <w:r>
+        <w:t>==</w:t>
+      </w:r>
+      <w:r>
+        <w:rPr>
+          <w:rFonts w:ascii="Consolas" w:hAnsi="Consolas"/>
+          <w:sz w:val="18"/>
+        </w:rPr>
+        <w:t>tx-rebuild</w:t>
+      </w:r>
+      <w:r>
+        <w:t xml:space="preserve">==v0.4.0.  CW TX (#105) DESIGN MAPPED → </w:t>
+      </w:r>
+      <w:r>
+        <w:rPr>
+          <w:rFonts w:ascii="Consolas" w:hAnsi="Consolas"/>
+          <w:sz w:val="18"/>
+        </w:rPr>
+        <w:t>docs/architecture/cw_tx_design.md</w:t>
+      </w:r>
+      <w:r>
+        <w:t>.  RX2/Split + PureSignal remain the next major arcs.*</w:t>
       </w:r>
     </w:p>
     <w:sectPr>
@@ -9543,7 +9723,7 @@
         <w:color w:val="808080"/>
         <w:sz w:val="16"/>
       </w:rPr>
-      <w:t>Lyra-cpp — Thetis Direct-Port Plan (TX) — auto-generated 2026-06-17 15:00 (source: THETIS_DIRECT_PORT_PLAN.md)</w:t>
+      <w:t>Thetis Direct Port Plan — auto-generated 2026-06-17 20:26 (source: THETIS_DIRECT_PORT_PLAN.md)</w:t>
     </w:r>
   </w:p>
 </w:hdr>

</xml_diff>

<commit_message>
docs: regenerate SESSION_LOG + THETIS_DIRECT_PORT_PLAN PDF/DOCX siblings
Regenerate the PDF (and DOCX, where it exists) siblings for the CW-TX doc
updates, via the existing tools/sync_execution_plan.py (the same ReportLab
converter that produced them) so the rendered artifacts stay current with
the markdown source:
  py tools/sync_execution_plan.py --md docs/THETIS_DIRECT_PORT_PLAN.md \
     --docx ...docx --pdf-path ...pdf --pdf --title "Thetis Direct Port Plan"
  py tools/sync_execution_plan.py --md docs/SESSION_LOG.md \
     --pdf-path ...pdf --pdf --no-docx --title "lyra-cpp — Session Log"

Co-Authored-By: Claude Opus 4.8 (1M context) <noreply@anthropic.com>
</commit_message>
<xml_diff>
--- a/docs/THETIS_DIRECT_PORT_PLAN.docx
+++ b/docs/THETIS_DIRECT_PORT_PLAN.docx
@@ -9557,19 +9557,30 @@
         <w:rPr>
           <w:b/>
         </w:rPr>
-        <w:t>Next major candidate — CW transmit (#105): DESIGN MAPPED 2026-06-17.</w:t>
-      </w:r>
-      <w:r>
-        <w:t xml:space="preserve"> See </w:t>
+        <w:t>CW transmit (#105) — ON AIR 2026-06-18 (CW-2/CW-3a/CW-3b/CW-4 SHIPPED).</w:t>
+      </w:r>
+      <w:r>
+        <w:t xml:space="preserve"> Design </w:t>
       </w:r>
       <w:r>
         <w:rPr>
-          <w:b/>
+          <w:rFonts w:ascii="Consolas" w:hAnsi="Consolas"/>
+          <w:sz w:val="18"/>
         </w:rPr>
-        <w:t>`docs/architecture/cw_tx_design.md`</w:t>
-      </w:r>
-      <w:r>
-        <w:t xml:space="preserve"> (full port plan from a 2-lane reference dive). Key finding: HL2 CW is </w:t>
+        <w:t>docs/architecture/cw_tx_design.md</w:t>
+      </w:r>
+      <w:r>
+        <w:t xml:space="preserve">; software-keyer design </w:t>
+      </w:r>
+      <w:r>
+        <w:rPr>
+          <w:rFonts w:ascii="Consolas" w:hAnsi="Consolas"/>
+          <w:sz w:val="18"/>
+        </w:rPr>
+        <w:t>docs/architecture/cw3_software_keyer_design.md</w:t>
+      </w:r>
+      <w:r>
+        <w:t xml:space="preserve">. HL2 CW is </w:t>
       </w:r>
       <w:r>
         <w:rPr>
@@ -9578,7 +9589,7 @@
         <w:t>100 % gateware-keyed</w:t>
       </w:r>
       <w:r>
-        <w:t xml:space="preserve"> — no host DSP/WDSP carrier synthesis, EP2 TX-I/Q bypassed during CW; the host sends key-state bits (the verbatim packer is ALREADY in tree at </w:t>
+        <w:t xml:space="preserve"> (confirmed vs radio.v/dsopenhpsdr1.v) — no host DSP/WDSP carrier; host sends key-state bits, the verbatim EP2 packer (</w:t>
       </w:r>
       <w:r>
         <w:rPr>
@@ -9588,16 +9599,297 @@
         <w:t>NetworkProto1.cpp:99-108</w:t>
       </w:r>
       <w:r>
-        <w:t xml:space="preserve">, dormant). Build order C-1..C-5 in the design doc; watch the </w:t>
-      </w:r>
+        <w:t xml:space="preserve">) carries them, gated by </w:t>
+      </w:r>
+      <w:r>
+        <w:rPr>
+          <w:rFonts w:ascii="Consolas" w:hAnsi="Consolas"/>
+          <w:sz w:val="18"/>
+        </w:rPr>
+        <w:t>cw_enable</w:t>
+      </w:r>
+      <w:r>
+        <w:t xml:space="preserve"> which also enables the gateware CWX decode (</w:t>
+      </w:r>
+      <w:r>
+        <w:rPr>
+          <w:rFonts w:ascii="Consolas" w:hAnsi="Consolas"/>
+          <w:sz w:val="18"/>
+        </w:rPr>
+        <w:t>cmd_data[24]</w:t>
+      </w:r>
+      <w:r>
+        <w:t xml:space="preserve"> = the 0x0f C1 bit).</w:t>
+      </w:r>
+    </w:p>
+    <w:p>
+      <w:pPr>
+        <w:pStyle w:val="ListBullet"/>
+        <w:ind w:left="360"/>
+      </w:pPr>
       <w:r>
         <w:rPr>
           <w:b/>
         </w:rPr>
-        <w:t>0x0b C&amp;C register collision</w:t>
-      </w:r>
-      <w:r>
-        <w:t xml:space="preserve"> with the shipped ATT-on-TX step-attenuator before composing CW keyer config.</w:t>
+        <w:t>CW-2 paddle</w:t>
+      </w:r>
+      <w:r>
+        <w:t xml:space="preserve"> (gateware iambic) — SHIPPED + operator-confirmed;</w:t>
+      </w:r>
+    </w:p>
+    <w:p>
+      <w:r>
+        <w:t>carrier-on-marker, QSK/Semi/Manual break-in, CW MON sidetone, foot-switch.</w:t>
+      </w:r>
+    </w:p>
+    <w:p>
+      <w:pPr>
+        <w:pStyle w:val="ListBullet"/>
+        <w:ind w:left="360"/>
+      </w:pPr>
+      <w:r>
+        <w:rPr>
+          <w:b/>
+        </w:rPr>
+        <w:t>CW-3a/3b</w:t>
+      </w:r>
+      <w:r>
+        <w:t xml:space="preserve"> host software keyer (CWX) + chip→floating CW console —</w:t>
+      </w:r>
+    </w:p>
+    <w:p>
+      <w:r>
+        <w:t xml:space="preserve">SHIPPED </w:t>
+      </w:r>
+      <w:r>
+        <w:rPr>
+          <w:rFonts w:ascii="Consolas" w:hAnsi="Consolas"/>
+          <w:sz w:val="18"/>
+        </w:rPr>
+        <w:t>8904749</w:t>
+      </w:r>
+      <w:r>
+        <w:t xml:space="preserve">. </w:t>
+      </w:r>
+      <w:r>
+        <w:rPr>
+          <w:rFonts w:ascii="Consolas" w:hAnsi="Consolas"/>
+          <w:sz w:val="18"/>
+        </w:rPr>
+        <w:t>tx/CwMorse</w:t>
+      </w:r>
+      <w:r>
+        <w:t xml:space="preserve"> (PARIS + operator weight) + </w:t>
+      </w:r>
+      <w:r>
+        <w:rPr>
+          <w:rFonts w:ascii="Consolas" w:hAnsi="Consolas"/>
+          <w:sz w:val="18"/>
+        </w:rPr>
+        <w:t>tx/CwKeyer</w:t>
+      </w:r>
+      <w:r>
+        <w:t xml:space="preserve"> (dedicated timer thread) + HL2Stream </w:t>
+      </w:r>
+      <w:r>
+        <w:rPr>
+          <w:rFonts w:ascii="Consolas" w:hAnsi="Consolas"/>
+          <w:sz w:val="18"/>
+        </w:rPr>
+        <w:t>sendCw</w:t>
+      </w:r>
+      <w:r>
+        <w:t>/</w:t>
+      </w:r>
+      <w:r>
+        <w:rPr>
+          <w:rFonts w:ascii="Consolas" w:hAnsi="Consolas"/>
+          <w:sz w:val="18"/>
+        </w:rPr>
+        <w:t>abortCw</w:t>
+      </w:r>
+      <w:r>
+        <w:t>/</w:t>
+      </w:r>
+      <w:r>
+        <w:rPr>
+          <w:rFonts w:ascii="Consolas" w:hAnsi="Consolas"/>
+          <w:sz w:val="18"/>
+        </w:rPr>
+        <w:t>setCwx*</w:t>
+      </w:r>
+      <w:r>
+        <w:t xml:space="preserve"> + </w:t>
+      </w:r>
+      <w:r>
+        <w:rPr>
+          <w:rFonts w:ascii="Consolas" w:hAnsi="Consolas"/>
+          <w:sz w:val="18"/>
+        </w:rPr>
+        <w:t>qml/CwConsolePanel</w:t>
+      </w:r>
+      <w:r>
+        <w:t xml:space="preserve">. Host drives </w:t>
+      </w:r>
+      <w:r>
+        <w:rPr>
+          <w:rFonts w:ascii="Consolas" w:hAnsi="Consolas"/>
+          <w:sz w:val="18"/>
+        </w:rPr>
+        <w:t>tx[0].cwx</w:t>
+      </w:r>
+      <w:r>
+        <w:t>/</w:t>
+      </w:r>
+      <w:r>
+        <w:rPr>
+          <w:rFonts w:ascii="Consolas" w:hAnsi="Consolas"/>
+          <w:sz w:val="18"/>
+        </w:rPr>
+        <w:t>cwx_ptt</w:t>
+      </w:r>
+      <w:r>
+        <w:t>; gateware keys.</w:t>
+      </w:r>
+    </w:p>
+    <w:p>
+      <w:pPr>
+        <w:pStyle w:val="ListBullet"/>
+        <w:ind w:left="360"/>
+      </w:pPr>
+      <w:r>
+        <w:rPr>
+          <w:b/>
+        </w:rPr>
+        <w:t>CW-4</w:t>
+      </w:r>
+      <w:r>
+        <w:t xml:space="preserve"> CW-over-TCI — SHIPPED </w:t>
+      </w:r>
+      <w:r>
+        <w:rPr>
+          <w:rFonts w:ascii="Consolas" w:hAnsi="Consolas"/>
+          <w:sz w:val="18"/>
+        </w:rPr>
+        <w:t>fcfcb6b</w:t>
+      </w:r>
+      <w:r>
+        <w:t>, verified vs the **EESDR TCI</w:t>
+      </w:r>
+    </w:p>
+    <w:p>
+      <w:r>
+        <w:t>manual** (</w:t>
+      </w:r>
+      <w:r>
+        <w:rPr>
+          <w:rFonts w:ascii="Consolas" w:hAnsi="Consolas"/>
+          <w:sz w:val="18"/>
+        </w:rPr>
+        <w:t>docs/TCI Protocol.pdf</w:t>
+      </w:r>
+      <w:r>
+        <w:t xml:space="preserve"> §3.2) + Thetis TCIServer.cs + SDRLogger+. </w:t>
+      </w:r>
+      <w:r>
+        <w:rPr>
+          <w:rFonts w:ascii="Consolas" w:hAnsi="Consolas"/>
+          <w:sz w:val="18"/>
+        </w:rPr>
+        <w:t>cw_macros</w:t>
+      </w:r>
+      <w:r>
+        <w:t xml:space="preserve"> / </w:t>
+      </w:r>
+      <w:r>
+        <w:rPr>
+          <w:rFonts w:ascii="Consolas" w:hAnsi="Consolas"/>
+          <w:sz w:val="18"/>
+        </w:rPr>
+        <w:t>cw_msg</w:t>
+      </w:r>
+      <w:r>
+        <w:t>(+</w:t>
+      </w:r>
+      <w:r>
+        <w:rPr>
+          <w:rFonts w:ascii="Consolas" w:hAnsi="Consolas"/>
+          <w:sz w:val="18"/>
+        </w:rPr>
+        <w:t>$N</w:t>
+      </w:r>
+      <w:r>
+        <w:t xml:space="preserve">) / </w:t>
+      </w:r>
+      <w:r>
+        <w:rPr>
+          <w:rFonts w:ascii="Consolas" w:hAnsi="Consolas"/>
+          <w:sz w:val="18"/>
+        </w:rPr>
+        <w:t>cw_macros_speed</w:t>
+      </w:r>
+      <w:r>
+        <w:t xml:space="preserve"> / </w:t>
+      </w:r>
+      <w:r>
+        <w:rPr>
+          <w:rFonts w:ascii="Consolas" w:hAnsi="Consolas"/>
+          <w:sz w:val="18"/>
+        </w:rPr>
+        <w:t>cw_macros_stop</w:t>
+      </w:r>
+      <w:r>
+        <w:t xml:space="preserve"> → the CW-3 keyer; reserved-char un-escape; CW-mode-only.</w:t>
+      </w:r>
+    </w:p>
+    <w:p>
+      <w:pPr>
+        <w:pStyle w:val="ListBullet"/>
+        <w:ind w:left="360"/>
+      </w:pPr>
+      <w:r>
+        <w:t xml:space="preserve">The earlier </w:t>
+      </w:r>
+      <w:r>
+        <w:rPr>
+          <w:b/>
+        </w:rPr>
+        <w:t>0x0b register-collision</w:t>
+      </w:r>
+      <w:r>
+        <w:t xml:space="preserve"> worry was a non-issue: </w:t>
+      </w:r>
+      <w:r>
+        <w:rPr>
+          <w:rFonts w:ascii="Consolas" w:hAnsi="Consolas"/>
+          <w:sz w:val="18"/>
+        </w:rPr>
+        <w:t>cw_enable</w:t>
+      </w:r>
+    </w:p>
+    <w:p>
+      <w:r>
+        <w:t>(0x0f C1) is what arms both sides; the step-att path is separate.</w:t>
+      </w:r>
+    </w:p>
+    <w:p>
+      <w:pPr>
+        <w:pStyle w:val="ListBullet"/>
+        <w:ind w:left="360"/>
+      </w:pPr>
+      <w:r>
+        <w:rPr>
+          <w:b/>
+        </w:rPr>
+        <w:t>NEXT — CW-5 (#173):</w:t>
+      </w:r>
+      <w:r>
+        <w:t xml:space="preserve"> RX CW decoder (faithful port of SDRLogger+'s</w:t>
+      </w:r>
+    </w:p>
+    <w:p>
+      <w:r>
+        <w:t>Bayesian/AFC/Farnsworth decoder) into the console's reserved pane + macros field. Plus CW follow-ons (Semi/Manual host-MOX for CWX, F-key memories, CWFWKeyer toggle; TCI cw_terminal/cw_macros_delay/macro syntax).</w:t>
       </w:r>
     </w:p>
     <w:p>
@@ -9634,21 +9926,46 @@
     </w:p>
     <w:p>
       <w:r>
-        <w:t xml:space="preserve">*Last updated: 2026-06-17 EOD — </w:t>
+        <w:t xml:space="preserve">*Last updated: 2026-06-18 — </w:t>
       </w:r>
       <w:r>
         <w:rPr>
           <w:b/>
         </w:rPr>
-        <w:t>v0.4.0 RELEASED</w:t>
-      </w:r>
-      <w:r>
-        <w:t xml:space="preserve"> (AM/DSB/FM transmit + AM carrier #106/#93, native TX DSP rack EQ/Speech/Combinator/Plate, Profiles</w:t>
-      </w:r>
-    </w:p>
-    <w:p>
-      <w:r>
-        <w:t xml:space="preserve">#49, TX monitor #90, ATT-on-TX §15.31, UI-readability batch).  </w:t>
+        <w:t>CW TX ON AIR (#105)</w:t>
+      </w:r>
+      <w:r>
+        <w:t>: CW-2 paddle (gateware iambic) + CW-3a/3b host software keyer (CWX) &amp; chip→floating CW console (</w:t>
+      </w:r>
+      <w:r>
+        <w:rPr>
+          <w:rFonts w:ascii="Consolas" w:hAnsi="Consolas"/>
+          <w:sz w:val="18"/>
+        </w:rPr>
+        <w:t>8904749</w:t>
+      </w:r>
+      <w:r>
+        <w:t>) + CW-4 CW-over-TCI (</w:t>
+      </w:r>
+      <w:r>
+        <w:rPr>
+          <w:rFonts w:ascii="Consolas" w:hAnsi="Consolas"/>
+          <w:sz w:val="18"/>
+        </w:rPr>
+        <w:t>fcfcb6b</w:t>
+      </w:r>
+      <w:r>
+        <w:t>, EESDR-spec-verified) + USER_GUIDE CW section (</w:t>
+      </w:r>
+      <w:r>
+        <w:rPr>
+          <w:rFonts w:ascii="Consolas" w:hAnsi="Consolas"/>
+          <w:sz w:val="18"/>
+        </w:rPr>
+        <w:t>2a09824</w:t>
+      </w:r>
+      <w:r>
+        <w:t xml:space="preserve">), all on </w:t>
       </w:r>
       <w:r>
         <w:rPr>
@@ -9658,17 +9975,7 @@
         <w:t>main</w:t>
       </w:r>
       <w:r>
-        <w:t xml:space="preserve"> is the trunk again: </w:t>
-      </w:r>
-      <w:r>
-        <w:rPr>
-          <w:rFonts w:ascii="Consolas" w:hAnsi="Consolas"/>
-          <w:sz w:val="18"/>
-        </w:rPr>
-        <w:t>main</w:t>
-      </w:r>
-      <w:r>
-        <w:t>==</w:t>
+        <w:t>/</w:t>
       </w:r>
       <w:r>
         <w:rPr>
@@ -9678,27 +9985,7 @@
         <w:t>origin/main</w:t>
       </w:r>
       <w:r>
-        <w:t>==</w:t>
-      </w:r>
-      <w:r>
-        <w:rPr>
-          <w:rFonts w:ascii="Consolas" w:hAnsi="Consolas"/>
-          <w:sz w:val="18"/>
-        </w:rPr>
-        <w:t>tx-rebuild</w:t>
-      </w:r>
-      <w:r>
-        <w:t xml:space="preserve">==v0.4.0.  CW TX (#105) DESIGN MAPPED → </w:t>
-      </w:r>
-      <w:r>
-        <w:rPr>
-          <w:rFonts w:ascii="Consolas" w:hAnsi="Consolas"/>
-          <w:sz w:val="18"/>
-        </w:rPr>
-        <w:t>docs/architecture/cw_tx_design.md</w:t>
-      </w:r>
-      <w:r>
-        <w:t>.  RX2/Split + PureSignal remain the next major arcs.*</w:t>
+        <w:t>.  NEXT = CW-5 (#173) RX CW decoder.  Prior (2026-06-17): v0.4.0 RELEASED (AM/DSB/FM transmit + AM carrier #106/#93, native TX DSP rack, Profiles #49, TX monitor #90, ATT-on-TX §15.31).  RX2/Split + PureSignal remain the next major arcs.*</w:t>
       </w:r>
     </w:p>
     <w:sectPr>
@@ -9723,7 +10010,7 @@
         <w:color w:val="808080"/>
         <w:sz w:val="16"/>
       </w:rPr>
-      <w:t>Thetis Direct Port Plan — auto-generated 2026-06-17 20:26 (source: THETIS_DIRECT_PORT_PLAN.md)</w:t>
+      <w:t>Thetis Direct Port Plan — auto-generated 2026-06-18 19:26 (source: THETIS_DIRECT_PORT_PLAN.md)</w:t>
     </w:r>
   </w:p>
 </w:hdr>

</xml_diff>

<commit_message>
docs: v0.4.1 EOD — session log + Thetis port plan (PHROT #109 + TX protection #169/#170)
Co-Authored-By: Claude Opus 4.8 (1M context) <noreply@anthropic.com>
</commit_message>
<xml_diff>
--- a/docs/THETIS_DIRECT_PORT_PLAN.docx
+++ b/docs/THETIS_DIRECT_PORT_PLAN.docx
@@ -4494,6 +4494,205 @@
           </w:p>
         </w:tc>
       </w:tr>
+      <w:tr>
+        <w:tc>
+          <w:tcPr>
+            <w:tcW w:type="dxa" w:w="2556"/>
+          </w:tcPr>
+          <w:p>
+            <w:r>
+              <w:rPr>
+                <w:sz w:val="18"/>
+              </w:rPr>
+            </w:r>
+            <w:r>
+              <w:rPr>
+                <w:rFonts w:ascii="Consolas" w:hAnsi="Consolas"/>
+                <w:sz w:val="18"/>
+              </w:rPr>
+              <w:t>wdsp\phrotate.c</w:t>
+            </w:r>
+            <w:r>
+              <w:rPr>
+                <w:sz w:val="18"/>
+              </w:rPr>
+              <w:t xml:space="preserve"> (PHROT)</w:t>
+            </w:r>
+          </w:p>
+        </w:tc>
+        <w:tc>
+          <w:tcPr>
+            <w:tcW w:type="dxa" w:w="2556"/>
+          </w:tcPr>
+          <w:p>
+            <w:r>
+              <w:rPr>
+                <w:sz w:val="18"/>
+              </w:rPr>
+            </w:r>
+            <w:r>
+              <w:rPr>
+                <w:sz w:val="18"/>
+              </w:rPr>
+              <w:t xml:space="preserve">cffi binding (SetTXAPHROTRun) via </w:t>
+            </w:r>
+            <w:r>
+              <w:rPr>
+                <w:rFonts w:ascii="Consolas" w:hAnsi="Consolas"/>
+                <w:sz w:val="18"/>
+              </w:rPr>
+              <w:t>wire/wdspcalls</w:t>
+            </w:r>
+          </w:p>
+        </w:tc>
+        <w:tc>
+          <w:tcPr>
+            <w:tcW w:type="dxa" w:w="2556"/>
+          </w:tcPr>
+          <w:p>
+            <w:r>
+              <w:rPr>
+                <w:sz w:val="18"/>
+              </w:rPr>
+            </w:r>
+            <w:r>
+              <w:rPr>
+                <w:sz w:val="18"/>
+              </w:rPr>
+              <w:t>[DONE]</w:t>
+            </w:r>
+          </w:p>
+        </w:tc>
+        <w:tc>
+          <w:tcPr>
+            <w:tcW w:type="dxa" w:w="2556"/>
+          </w:tcPr>
+          <w:p>
+            <w:r>
+              <w:rPr>
+                <w:sz w:val="18"/>
+              </w:rPr>
+            </w:r>
+            <w:r>
+              <w:rPr>
+                <w:b/>
+                <w:sz w:val="18"/>
+              </w:rPr>
+              <w:t>#109 v0.4.1.</w:t>
+            </w:r>
+            <w:r>
+              <w:rPr>
+                <w:sz w:val="18"/>
+              </w:rPr>
+              <w:t xml:space="preserve"> WDSP TXA phase rotator (all-pass speech symmetrizer → lower peak-to-average → more average talk power). </w:t>
+            </w:r>
+            <w:r>
+              <w:rPr>
+                <w:rFonts w:ascii="Consolas" w:hAnsi="Consolas"/>
+                <w:sz w:val="18"/>
+              </w:rPr>
+              <w:t>SetTXAPHROTRun</w:t>
+            </w:r>
+            <w:r>
+              <w:rPr>
+                <w:sz w:val="18"/>
+              </w:rPr>
+              <w:t xml:space="preserve"> added to the </w:t>
+            </w:r>
+            <w:r>
+              <w:rPr>
+                <w:rFonts w:ascii="Consolas" w:hAnsi="Consolas"/>
+                <w:sz w:val="18"/>
+              </w:rPr>
+              <w:t>wire/wdspcalls</w:t>
+            </w:r>
+            <w:r>
+              <w:rPr>
+                <w:sz w:val="18"/>
+              </w:rPr>
+              <w:t xml:space="preserve"> X-macro seam (</w:t>
+            </w:r>
+            <w:r>
+              <w:rPr>
+                <w:rFonts w:ascii="Consolas" w:hAnsi="Consolas"/>
+                <w:sz w:val="18"/>
+              </w:rPr>
+              <w:t>d99794d</w:t>
+            </w:r>
+            <w:r>
+              <w:rPr>
+                <w:sz w:val="18"/>
+              </w:rPr>
+              <w:t xml:space="preserve">); </w:t>
+            </w:r>
+            <w:r>
+              <w:rPr>
+                <w:rFonts w:ascii="Consolas" w:hAnsi="Consolas"/>
+                <w:sz w:val="18"/>
+              </w:rPr>
+              <w:t>TxControl.setPhrotRun</w:t>
+            </w:r>
+            <w:r>
+              <w:rPr>
+                <w:sz w:val="18"/>
+              </w:rPr>
+              <w:t xml:space="preserve"> callback → </w:t>
+            </w:r>
+            <w:r>
+              <w:rPr>
+                <w:rFonts w:ascii="Consolas" w:hAnsi="Consolas"/>
+                <w:sz w:val="18"/>
+              </w:rPr>
+              <w:t>lyra::wire::SetTXAPHROTRun(txch, run)</w:t>
+            </w:r>
+            <w:r>
+              <w:rPr>
+                <w:sz w:val="18"/>
+              </w:rPr>
+              <w:t xml:space="preserve">. </w:t>
+            </w:r>
+            <w:r>
+              <w:rPr>
+                <w:rFonts w:ascii="Consolas" w:hAnsi="Consolas"/>
+                <w:sz w:val="18"/>
+              </w:rPr>
+              <w:t>HL2Stream::phrotEnabled</w:t>
+            </w:r>
+            <w:r>
+              <w:rPr>
+                <w:sz w:val="18"/>
+              </w:rPr>
+              <w:t xml:space="preserve"> Q_PROPERTY (Settings → TX, default ON = reference posture; parity with Thetis Setup PHROT — fully exposed there, not hidden). </w:t>
+            </w:r>
+            <w:r>
+              <w:rPr>
+                <w:b/>
+                <w:sz w:val="18"/>
+              </w:rPr>
+              <w:t>Effective run is mode-gated</w:t>
+            </w:r>
+            <w:r>
+              <w:rPr>
+                <w:sz w:val="18"/>
+              </w:rPr>
+              <w:t xml:space="preserve"> in one chokepoint </w:t>
+            </w:r>
+            <w:r>
+              <w:rPr>
+                <w:rFonts w:ascii="Consolas" w:hAnsi="Consolas"/>
+                <w:sz w:val="18"/>
+              </w:rPr>
+              <w:t>applyPhrotRun()</w:t>
+            </w:r>
+            <w:r>
+              <w:rPr>
+                <w:sz w:val="18"/>
+              </w:rPr>
+              <w:t xml:space="preserve"> = `phrotEnabled_ &amp;&amp; !(txMode==DIGU\</w:t>
+            </w:r>
+          </w:p>
+        </w:tc>
+      </w:tr>
     </w:tbl>
     <w:p/>
     <w:p>
@@ -7729,6 +7928,259 @@
         <w:pStyle w:val="Heading3"/>
       </w:pPr>
       <w:r>
+        <w:t>2026-06-19 — v0.4.1: TX protection (#169/#170) + PHROT (#109)</w:t>
+      </w:r>
+    </w:p>
+    <w:p>
+      <w:pPr>
+        <w:pStyle w:val="ListBullet"/>
+        <w:ind w:left="360"/>
+      </w:pPr>
+      <w:r>
+        <w:rPr>
+          <w:b/>
+        </w:rPr>
+        <w:t>#169 SWR protection</w:t>
+      </w:r>
+      <w:r>
+        <w:t xml:space="preserve"> + </w:t>
+      </w:r>
+      <w:r>
+        <w:rPr>
+          <w:b/>
+        </w:rPr>
+        <w:t>#170a drive cap</w:t>
+      </w:r>
+      <w:r>
+        <w:t xml:space="preserve"> (</w:t>
+      </w:r>
+      <w:r>
+        <w:rPr>
+          <w:rFonts w:ascii="Consolas" w:hAnsi="Consolas"/>
+          <w:sz w:val="18"/>
+        </w:rPr>
+        <w:t>6c3e8e7</w:t>
+      </w:r>
+      <w:r>
+        <w:t>) — Lyra-native TX</w:t>
+      </w:r>
+    </w:p>
+    <w:p>
+      <w:r>
+        <w:t xml:space="preserve">safety on </w:t>
+      </w:r>
+      <w:r>
+        <w:rPr>
+          <w:rFonts w:ascii="Consolas" w:hAnsi="Consolas"/>
+          <w:sz w:val="18"/>
+        </w:rPr>
+        <w:t>HL2Stream</w:t>
+      </w:r>
+      <w:r>
+        <w:t xml:space="preserve"> (joins the TX-timeout / ATT-on-TX operator surface, not a standalone QObject). 50 ms eval QTimer armed on the MOX edge decodes </w:t>
+      </w:r>
+      <w:r>
+        <w:rPr>
+          <w:rFonts w:ascii="Consolas" w:hAnsi="Consolas"/>
+          <w:sz w:val="18"/>
+        </w:rPr>
+        <w:t>prn-&gt;tx[0].fwd/rev_power</w:t>
+      </w:r>
+      <w:r>
+        <w:t xml:space="preserve"> → calibration-free SWR; trips via the single </w:t>
+      </w:r>
+      <w:r>
+        <w:rPr>
+          <w:rFonts w:ascii="Consolas" w:hAnsi="Consolas"/>
+          <w:sz w:val="18"/>
+        </w:rPr>
+        <w:t>requestMox(false)</w:t>
+      </w:r>
+      <w:r>
+        <w:t xml:space="preserve"> funnel above the user limit (default 5:1) with 4 false-trigger guards + latch + PROT lamp. Optional Fold action (×0.5 drive via </w:t>
+      </w:r>
+      <w:r>
+        <w:rPr>
+          <w:rFonts w:ascii="Consolas" w:hAnsi="Consolas"/>
+          <w:sz w:val="18"/>
+        </w:rPr>
+        <w:t>applyDriveLevelNoPersist</w:t>
+      </w:r>
+      <w:r>
+        <w:t xml:space="preserve">, escalates to trip at floor). Drive cap clamps at the one </w:t>
+      </w:r>
+      <w:r>
+        <w:rPr>
+          <w:rFonts w:ascii="Consolas" w:hAnsi="Consolas"/>
+          <w:sz w:val="18"/>
+        </w:rPr>
+        <w:t>setTxDriveLevel</w:t>
+      </w:r>
+      <w:r>
+        <w:t xml:space="preserve"> chokepoint. #170b over-power trip DEFERRED by operator. Design </w:t>
+      </w:r>
+      <w:r>
+        <w:rPr>
+          <w:rFonts w:ascii="Consolas" w:hAnsi="Consolas"/>
+          <w:sz w:val="18"/>
+        </w:rPr>
+        <w:t>docs/architecture/tx_protection_design.md</w:t>
+      </w:r>
+      <w:r>
+        <w:t>.</w:t>
+      </w:r>
+    </w:p>
+    <w:p>
+      <w:pPr>
+        <w:pStyle w:val="ListBullet"/>
+        <w:ind w:left="360"/>
+      </w:pPr>
+      <w:r>
+        <w:rPr>
+          <w:b/>
+        </w:rPr>
+        <w:t>#109 PHROT</w:t>
+      </w:r>
+      <w:r>
+        <w:t xml:space="preserve"> (</w:t>
+      </w:r>
+      <w:r>
+        <w:rPr>
+          <w:rFonts w:ascii="Consolas" w:hAnsi="Consolas"/>
+          <w:sz w:val="18"/>
+        </w:rPr>
+        <w:t>d99794d</w:t>
+      </w:r>
+      <w:r>
+        <w:t xml:space="preserve"> toggle + </w:t>
+      </w:r>
+      <w:r>
+        <w:rPr>
+          <w:rFonts w:ascii="Consolas" w:hAnsi="Consolas"/>
+          <w:sz w:val="18"/>
+        </w:rPr>
+        <w:t>165e176</w:t>
+      </w:r>
+      <w:r>
+        <w:t xml:space="preserve"> digital auto-off) — WDSP TXA</w:t>
+      </w:r>
+    </w:p>
+    <w:p>
+      <w:r>
+        <w:t xml:space="preserve">phase rotator via the </w:t>
+      </w:r>
+      <w:r>
+        <w:rPr>
+          <w:rFonts w:ascii="Consolas" w:hAnsi="Consolas"/>
+          <w:sz w:val="18"/>
+        </w:rPr>
+        <w:t>wire/wdspcalls</w:t>
+      </w:r>
+      <w:r>
+        <w:t xml:space="preserve"> </w:t>
+      </w:r>
+      <w:r>
+        <w:rPr>
+          <w:rFonts w:ascii="Consolas" w:hAnsi="Consolas"/>
+          <w:sz w:val="18"/>
+        </w:rPr>
+        <w:t>SetTXAPHROTRun</w:t>
+      </w:r>
+      <w:r>
+        <w:t xml:space="preserve"> seam; see the WDSP TX chain registry row. Effective run mode-gated in </w:t>
+      </w:r>
+      <w:r>
+        <w:rPr>
+          <w:rFonts w:ascii="Consolas" w:hAnsi="Consolas"/>
+          <w:sz w:val="18"/>
+        </w:rPr>
+        <w:t>applyPhrotRun()</w:t>
+      </w:r>
+      <w:r>
+        <w:t xml:space="preserve"> (auto-off DIGU/DIGL). Parity with Thetis Setup PHROT.</w:t>
+      </w:r>
+    </w:p>
+    <w:p>
+      <w:pPr>
+        <w:pStyle w:val="ListBullet"/>
+        <w:ind w:left="360"/>
+      </w:pPr>
+      <w:r>
+        <w:rPr>
+          <w:b/>
+        </w:rPr>
+        <w:t>Released v0.4.1</w:t>
+      </w:r>
+      <w:r>
+        <w:t xml:space="preserve"> — bump (</w:t>
+      </w:r>
+      <w:r>
+        <w:rPr>
+          <w:rFonts w:ascii="Consolas" w:hAnsi="Consolas"/>
+          <w:sz w:val="18"/>
+        </w:rPr>
+        <w:t>eff9a5d</w:t>
+      </w:r>
+      <w:r>
+        <w:t xml:space="preserve">), main FF </w:t>
+      </w:r>
+      <w:r>
+        <w:rPr>
+          <w:rFonts w:ascii="Consolas" w:hAnsi="Consolas"/>
+          <w:sz w:val="18"/>
+        </w:rPr>
+        <w:t>1c6de15..eff9a5d</w:t>
+      </w:r>
+      <w:r>
+        <w:t>, tag</w:t>
+      </w:r>
+    </w:p>
+    <w:p>
+      <w:r>
+        <w:rPr>
+          <w:rFonts w:ascii="Consolas" w:hAnsi="Consolas"/>
+          <w:sz w:val="18"/>
+        </w:rPr>
+        <w:t>v0.4.1</w:t>
+      </w:r>
+      <w:r>
+        <w:t xml:space="preserve">, GitHub release + </w:t>
+      </w:r>
+      <w:r>
+        <w:rPr>
+          <w:rFonts w:ascii="Consolas" w:hAnsi="Consolas"/>
+          <w:sz w:val="18"/>
+        </w:rPr>
+        <w:t>dist/Lyra-Setup-0.4.1.exe</w:t>
+      </w:r>
+      <w:r>
+        <w:t xml:space="preserve"> (68.1 MB).</w:t>
+      </w:r>
+    </w:p>
+    <w:p>
+      <w:pPr>
+        <w:pStyle w:val="ListBullet"/>
+        <w:ind w:left="360"/>
+      </w:pPr>
+      <w:r>
+        <w:t xml:space="preserve">Full arc in </w:t>
+      </w:r>
+      <w:r>
+        <w:rPr>
+          <w:rFonts w:ascii="Consolas" w:hAnsi="Consolas"/>
+          <w:sz w:val="18"/>
+        </w:rPr>
+        <w:t>SESSION_LOG.md</w:t>
+      </w:r>
+      <w:r>
+        <w:t xml:space="preserve"> 2026-06-19.</w:t>
+      </w:r>
+    </w:p>
+    <w:p>
+      <w:pPr>
+        <w:pStyle w:val="Heading3"/>
+      </w:pPr>
+      <w:r>
         <w:t>2026-06-14 -&gt; 2026-06-17 — post-P4: VAC v0.3.0/v0.3.1, native TX DSP rack, Profiles, TX monitor (#90), Out picker</w:t>
       </w:r>
     </w:p>
@@ -9458,26 +9910,26 @@
         <w:t>origin/main</w:t>
       </w:r>
       <w:r>
-        <w:t xml:space="preserve"> == </w:t>
+        <w:t xml:space="preserve"> == the </w:t>
+      </w:r>
+      <w:r>
+        <w:rPr>
+          <w:b/>
+        </w:rPr>
+        <w:t>v0.4.1</w:t>
+      </w:r>
+      <w:r>
+        <w:t xml:space="preserve"> release commit (</w:t>
       </w:r>
       <w:r>
         <w:rPr>
           <w:rFonts w:ascii="Consolas" w:hAnsi="Consolas"/>
           <w:sz w:val="18"/>
         </w:rPr>
-        <w:t>tx-rebuild</w:t>
-      </w:r>
-      <w:r>
-        <w:t xml:space="preserve"> == the </w:t>
-      </w:r>
-      <w:r>
-        <w:rPr>
-          <w:b/>
-        </w:rPr>
-        <w:t>v0.4.0</w:t>
-      </w:r>
-      <w:r>
-        <w:t xml:space="preserve"> release commit. Operator consolidated onto </w:t>
+        <w:t>eff9a5d</w:t>
+      </w:r>
+      <w:r>
+        <w:t xml:space="preserve">). Operator consolidated onto </w:t>
       </w:r>
       <w:r>
         <w:rPr>
@@ -9926,7 +10378,91 @@
     </w:p>
     <w:p>
       <w:r>
-        <w:t xml:space="preserve">*Last updated: 2026-06-18 — </w:t>
+        <w:t xml:space="preserve">*Last updated: 2026-06-19 — </w:t>
+      </w:r>
+      <w:r>
+        <w:rPr>
+          <w:b/>
+        </w:rPr>
+        <w:t>v0.4.1 RELEASED</w:t>
+      </w:r>
+      <w:r>
+        <w:t xml:space="preserve">: TX protection (#169 SWR cut + Fold / #170a drive cap) + PHROT (#109, WDSP </w:t>
+      </w:r>
+      <w:r>
+        <w:rPr>
+          <w:rFonts w:ascii="Consolas" w:hAnsi="Consolas"/>
+          <w:sz w:val="18"/>
+        </w:rPr>
+        <w:t>SetTXAPHROTRun</w:t>
+      </w:r>
+      <w:r>
+        <w:t xml:space="preserve"> w/ digital auto-off). Commits </w:t>
+      </w:r>
+      <w:r>
+        <w:rPr>
+          <w:rFonts w:ascii="Consolas" w:hAnsi="Consolas"/>
+          <w:sz w:val="18"/>
+        </w:rPr>
+        <w:t>6c3e8e7</w:t>
+      </w:r>
+      <w:r>
+        <w:t>/</w:t>
+      </w:r>
+      <w:r>
+        <w:rPr>
+          <w:rFonts w:ascii="Consolas" w:hAnsi="Consolas"/>
+          <w:sz w:val="18"/>
+        </w:rPr>
+        <w:t>d99794d</w:t>
+      </w:r>
+      <w:r>
+        <w:t>/</w:t>
+      </w:r>
+      <w:r>
+        <w:rPr>
+          <w:rFonts w:ascii="Consolas" w:hAnsi="Consolas"/>
+          <w:sz w:val="18"/>
+        </w:rPr>
+        <w:t>165e176</w:t>
+      </w:r>
+      <w:r>
+        <w:t>/</w:t>
+      </w:r>
+      <w:r>
+        <w:rPr>
+          <w:rFonts w:ascii="Consolas" w:hAnsi="Consolas"/>
+          <w:sz w:val="18"/>
+        </w:rPr>
+        <w:t>eff9a5d</w:t>
+      </w:r>
+      <w:r>
+        <w:t xml:space="preserve">; main FF </w:t>
+      </w:r>
+      <w:r>
+        <w:rPr>
+          <w:rFonts w:ascii="Consolas" w:hAnsi="Consolas"/>
+          <w:sz w:val="18"/>
+        </w:rPr>
+        <w:t>1c6de15..eff9a5d</w:t>
+      </w:r>
+      <w:r>
+        <w:t xml:space="preserve">; tag </w:t>
+      </w:r>
+      <w:r>
+        <w:rPr>
+          <w:rFonts w:ascii="Consolas" w:hAnsi="Consolas"/>
+          <w:sz w:val="18"/>
+        </w:rPr>
+        <w:t>v0.4.1</w:t>
+      </w:r>
+      <w:r>
+        <w:t xml:space="preserve"> + GitHub release + installer. #170b over-power trip DEFERRED. NEXT major arcs unchanged (CW-5 #173, RX2/Split</w:t>
+      </w:r>
+    </w:p>
+    <w:p>
+      <w:r>
+        <w:t xml:space="preserve">#96–#101, PureSignal). Prior (2026-06-18) — </w:t>
       </w:r>
       <w:r>
         <w:rPr>
@@ -10010,7 +10546,7 @@
         <w:color w:val="808080"/>
         <w:sz w:val="16"/>
       </w:rPr>
-      <w:t>Thetis Direct Port Plan — auto-generated 2026-06-18 19:26 (source: THETIS_DIRECT_PORT_PLAN.md)</w:t>
+      <w:t>Lyra-cpp — Thetis Direct-Port Plan (TX) — auto-generated 2026-06-19 20:45 (source: THETIS_DIRECT_PORT_PLAN.md)</w:t>
     </w:r>
   </w:p>
 </w:hdr>

</xml_diff>

<commit_message>
docs: record v0.7.0 FM TX in the Thetis direct-port plan + add Remaining-Work checklist
FM is a TX modulator concern, so the v0.7.0 FM transmit refinements
(fix #2 AF brick-wall + FM-aware bandwidth + pre-emphasis Off/Comm +
mic-rack auto-bypass + Tuning-panel pre-emph chip / Dev→RX-BW) get a
SHIPPED-WORK LOG entry in THETIS_DIRECT_PORT_PLAN.md, and the RESUME
POINTER + trailer are refreshed to v0.7.0 (PureSignal + RX2/Split are
the remaining major TX-port arcs). Regenerated the plan PDF/DOCX.

New docs/REMAINING_WORK.md (+ PDF): a standalone what's-left checklist —
the list is much smaller now (two big arcs left, RX2/Split and
PureSignal, plus a handful of TX/CW follow-ons).

Co-Authored-By: Claude Opus 4.8 (1M context) <noreply@anthropic.com>
</commit_message>
<xml_diff>
--- a/docs/THETIS_DIRECT_PORT_PLAN.docx
+++ b/docs/THETIS_DIRECT_PORT_PLAN.docx
@@ -7928,6 +7928,298 @@
         <w:pStyle w:val="Heading3"/>
       </w:pPr>
       <w:r>
+        <w:t>2026-06-29 — v0.7.0: FM transmit refinements [TX-relevant slice]</w:t>
+      </w:r>
+    </w:p>
+    <w:p>
+      <w:r>
+        <w:t xml:space="preserve">FM is a TX modulator concern, so it belongs here. The FM TX "beat Thetis" arc reached a complete stopping point and shipped in v0.7.0 (release commit </w:t>
+      </w:r>
+      <w:r>
+        <w:rPr>
+          <w:rFonts w:ascii="Consolas" w:hAnsi="Consolas"/>
+          <w:sz w:val="18"/>
+        </w:rPr>
+        <w:t>7737d60</w:t>
+      </w:r>
+      <w:r>
+        <w:t xml:space="preserve">; the Tuner-memory headline is pure-UI and NOT a TX-port item — see SESSION_LOG 2026-06-29). The WDSP study-first discipline held: </w:t>
+      </w:r>
+      <w:r>
+        <w:rPr>
+          <w:rFonts w:ascii="Consolas" w:hAnsi="Consolas"/>
+          <w:sz w:val="18"/>
+        </w:rPr>
+        <w:t>fmmod.c</w:t>
+      </w:r>
+      <w:r>
+        <w:t xml:space="preserve"> + </w:t>
+      </w:r>
+      <w:r>
+        <w:rPr>
+          <w:rFonts w:ascii="Consolas" w:hAnsi="Consolas"/>
+          <w:sz w:val="18"/>
+        </w:rPr>
+        <w:t>emph.c</w:t>
+      </w:r>
+      <w:r>
+        <w:t xml:space="preserve"> read in full before touching shipped behaviour.</w:t>
+      </w:r>
+    </w:p>
+    <w:p>
+      <w:pPr>
+        <w:pStyle w:val="ListBullet"/>
+        <w:ind w:left="360"/>
+      </w:pPr>
+      <w:r>
+        <w:rPr>
+          <w:b/>
+        </w:rPr>
+        <w:t>Fix #2 — clean audio band-limit</w:t>
+      </w:r>
+      <w:r>
+        <w:t xml:space="preserve"> (</w:t>
+      </w:r>
+      <w:r>
+        <w:rPr>
+          <w:rFonts w:ascii="Consolas" w:hAnsi="Consolas"/>
+          <w:sz w:val="18"/>
+        </w:rPr>
+        <w:t>b72bc50</w:t>
+      </w:r>
+      <w:r>
+        <w:t>). The FM primary</w:t>
+      </w:r>
+    </w:p>
+    <w:p>
+      <w:r>
+        <w:t xml:space="preserve">bandpass </w:t>
+      </w:r>
+      <w:r>
+        <w:rPr>
+          <w:rFonts w:ascii="Consolas" w:hAnsi="Consolas"/>
+          <w:sz w:val="18"/>
+        </w:rPr>
+        <w:t>bp0</w:t>
+      </w:r>
+      <w:r>
+        <w:t xml:space="preserve"> runs on the AUDIO before </w:t>
+      </w:r>
+      <w:r>
+        <w:rPr>
+          <w:rFonts w:ascii="Consolas" w:hAnsi="Consolas"/>
+          <w:sz w:val="18"/>
+        </w:rPr>
+        <w:t>xfmmod</w:t>
+      </w:r>
+      <w:r>
+        <w:t xml:space="preserve">, so it is now a symmetric </w:t>
+      </w:r>
+      <w:r>
+        <w:rPr>
+          <w:b/>
+        </w:rPr>
+        <w:t>±3 kHz brick-wall AF low-pass</w:t>
+      </w:r>
+      <w:r>
+        <w:t xml:space="preserve"> (was inheriting the wide SSB/ESSB ±(dev+3k) ≈ ±8 k, over-feeding the modulator). The occupied-RF (Carson) clamp stays owned by the modulator's own internal bandpass, pinned via </w:t>
+      </w:r>
+      <w:r>
+        <w:rPr>
+          <w:rFonts w:ascii="Consolas" w:hAnsi="Consolas"/>
+          <w:sz w:val="18"/>
+        </w:rPr>
+        <w:t>SetTXAFMAFFreqs(txch, 300, 3000)</w:t>
+      </w:r>
+      <w:r>
+        <w:t xml:space="preserve"> on FM entry. Supersedes the bp0 value shipped in v0.6.0's Fix #1.</w:t>
+      </w:r>
+    </w:p>
+    <w:p>
+      <w:pPr>
+        <w:pStyle w:val="ListBullet"/>
+        <w:ind w:left="360"/>
+      </w:pPr>
+      <w:r>
+        <w:rPr>
+          <w:b/>
+        </w:rPr>
+        <w:t>FM-aware bandwidth</w:t>
+      </w:r>
+      <w:r>
+        <w:t xml:space="preserve"> (</w:t>
+      </w:r>
+      <w:r>
+        <w:rPr>
+          <w:rFonts w:ascii="Consolas" w:hAnsi="Consolas"/>
+          <w:sz w:val="18"/>
+        </w:rPr>
+        <w:t>4f32ca1</w:t>
+      </w:r>
+      <w:r>
+        <w:t>). In FM the TX-BW selector + RX↔TX</w:t>
+      </w:r>
+    </w:p>
+    <w:p>
+      <w:r>
+        <w:t xml:space="preserve">lock are disabled (FM occupied width is derived from deviation, not a chosen width); the TX BW box is a read-only </w:t>
+      </w:r>
+      <w:r>
+        <w:rPr>
+          <w:rFonts w:ascii="Consolas" w:hAnsi="Consolas"/>
+          <w:sz w:val="18"/>
+        </w:rPr>
+        <w:t>&lt;N&gt; k (auto)</w:t>
+      </w:r>
+      <w:r>
+        <w:t xml:space="preserve"> Carson readout (2·(dev+3k), live-tracks Dev). FM RX BW presets switched from the SSB list to FM channel widths 8/10/12/16 k.</w:t>
+      </w:r>
+    </w:p>
+    <w:p>
+      <w:pPr>
+        <w:pStyle w:val="ListBullet"/>
+        <w:ind w:left="360"/>
+      </w:pPr>
+      <w:r>
+        <w:rPr>
+          <w:b/>
+        </w:rPr>
+        <w:t>Pre-emphasis selector Off/Comm</w:t>
+      </w:r>
+      <w:r>
+        <w:t xml:space="preserve"> (</w:t>
+      </w:r>
+      <w:r>
+        <w:rPr>
+          <w:rFonts w:ascii="Consolas" w:hAnsi="Consolas"/>
+          <w:sz w:val="18"/>
+        </w:rPr>
+        <w:t>a826c8c</w:t>
+      </w:r>
+      <w:r>
+        <w:t>, fix #3a). WDSP-native</w:t>
+      </w:r>
+    </w:p>
+    <w:p>
+      <w:r>
+        <w:t xml:space="preserve">via </w:t>
+      </w:r>
+      <w:r>
+        <w:rPr>
+          <w:rFonts w:ascii="Consolas" w:hAnsi="Consolas"/>
+          <w:sz w:val="18"/>
+        </w:rPr>
+        <w:t>SetTXAFMEmphPosition</w:t>
+      </w:r>
+      <w:r>
+        <w:t xml:space="preserve"> (position 1 = run = the 6 dB/oct comms curve, voice default; 2 = bypass = true Off for data / flat HF). The </w:t>
+      </w:r>
+      <w:r>
+        <w:rPr>
+          <w:rFonts w:ascii="Consolas" w:hAnsi="Consolas"/>
+          <w:sz w:val="18"/>
+        </w:rPr>
+        <w:t>xfmmod</w:t>
+      </w:r>
+      <w:r>
+        <w:t xml:space="preserve"> true-FM path means the 6 dB/oct comms curve is the correct pre-emphasis (read confirmed in </w:t>
+      </w:r>
+      <w:r>
+        <w:rPr>
+          <w:rFonts w:ascii="Consolas" w:hAnsi="Consolas"/>
+          <w:sz w:val="18"/>
+        </w:rPr>
+        <w:t>fmmod.c</w:t>
+      </w:r>
+      <w:r>
+        <w:t>).</w:t>
+      </w:r>
+    </w:p>
+    <w:p>
+      <w:pPr>
+        <w:pStyle w:val="ListBullet"/>
+        <w:ind w:left="360"/>
+      </w:pPr>
+      <w:r>
+        <w:rPr>
+          <w:b/>
+        </w:rPr>
+        <w:t>Native mic rack auto-bypass on FM</w:t>
+      </w:r>
+      <w:r>
+        <w:t xml:space="preserve"> (</w:t>
+      </w:r>
+      <w:r>
+        <w:rPr>
+          <w:rFonts w:ascii="Consolas" w:hAnsi="Consolas"/>
+          <w:sz w:val="18"/>
+        </w:rPr>
+        <w:t>12c8991</w:t>
+      </w:r>
+      <w:r>
+        <w:t>, #3b-3). The whole</w:t>
+      </w:r>
+    </w:p>
+    <w:p>
+      <w:r>
+        <w:t>native TX rack (EQ + Combinator + Plate + speech enhancements) auto-bypasses in FM, same forced-auto as the digital modes — a multiband compressor into FM's pre-emphasis = mush. One-line predicate change (</w:t>
+      </w:r>
+      <w:r>
+        <w:rPr>
+          <w:rFonts w:ascii="Consolas" w:hAnsi="Consolas"/>
+          <w:sz w:val="18"/>
+        </w:rPr>
+        <w:t>txModeBypassesRack</w:t>
+      </w:r>
+      <w:r>
+        <w:t xml:space="preserve"> now fires for FM).</w:t>
+      </w:r>
+    </w:p>
+    <w:p>
+      <w:pPr>
+        <w:pStyle w:val="ListBullet"/>
+        <w:ind w:left="360"/>
+      </w:pPr>
+      <w:r>
+        <w:rPr>
+          <w:b/>
+        </w:rPr>
+        <w:t>Tuning-panel pre-emph chip + Dev→RX-BW auto-size</w:t>
+      </w:r>
+      <w:r>
+        <w:t xml:space="preserve"> (</w:t>
+      </w:r>
+      <w:r>
+        <w:rPr>
+          <w:rFonts w:ascii="Consolas" w:hAnsi="Consolas"/>
+          <w:sz w:val="18"/>
+        </w:rPr>
+        <w:t>67abf05</w:t>
+      </w:r>
+      <w:r>
+        <w:t>).</w:t>
+      </w:r>
+    </w:p>
+    <w:p>
+      <w:r>
+        <w:t xml:space="preserve">The Tuning panel FM row mirrors the Settings pre-emph Comm/Off via the shared </w:t>
+      </w:r>
+      <w:r>
+        <w:rPr>
+          <w:rFonts w:ascii="Consolas" w:hAnsi="Consolas"/>
+          <w:sz w:val="18"/>
+        </w:rPr>
+        <w:t>Stream.fmEmphasisMode</w:t>
+      </w:r>
+      <w:r>
+        <w:t xml:space="preserve"> prop; the Dev spinner auto-sets RX BW to the smallest FM preset ≥ Carson (RX now follows TX, Thetis-style, still overridable).</w:t>
+      </w:r>
+    </w:p>
+    <w:p>
+      <w:pPr>
+        <w:pStyle w:val="Heading3"/>
+      </w:pPr>
+      <w:r>
         <w:t>2026-06-24 — v0.4.8: CW transmit metering (#105) [TX-relevant slice]</w:t>
       </w:r>
     </w:p>
@@ -10519,16 +10811,22 @@
     </w:p>
     <w:p>
       <w:r>
-        <w:t xml:space="preserve">Other open major arcs (unchanged): </w:t>
-      </w:r>
-      <w:r>
         <w:rPr>
           <w:b/>
         </w:rPr>
-        <w:t>RX2 + Split</w:t>
-      </w:r>
-      <w:r>
-        <w:t xml:space="preserve"> (#96–#101) and</w:t>
+        <w:t>SHIPPED SINCE (TX-relevant, through v0.7.0):</w:t>
+      </w:r>
+      <w:r>
+        <w:t xml:space="preserve"> CW-5 RX decoder (#173, v0.4.5) + decoder-accuracy A-series (v0.4.10); CW macros (#176, v0.4.5); TX waterfall callsign ID (#175, v0.4.5); the TX power model + fine-drive arc (per-band PA Gain calibration + auto-tuning watts cap, v0.6.0); and the </w:t>
+      </w:r>
+      <w:r>
+        <w:rPr>
+          <w:b/>
+        </w:rPr>
+        <w:t>FM transmit refinements</w:t>
+      </w:r>
+      <w:r>
+        <w:t xml:space="preserve"> (v0.7.0 — see the SHIPPED-WORK LOG top entry; FM is now at a complete stopping point, fixes #2/#3a/#3b done).</w:t>
       </w:r>
     </w:p>
     <w:p>
@@ -10536,10 +10834,54 @@
         <w:rPr>
           <w:b/>
         </w:rPr>
+        <w:t>Remaining open TX-port / major arcs:</w:t>
+      </w:r>
+      <w:r>
+        <w:t xml:space="preserve"> </w:t>
+      </w:r>
+      <w:r>
+        <w:rPr>
+          <w:b/>
+        </w:rPr>
+        <w:t>RX2 + Split</w:t>
+      </w:r>
+      <w:r>
+        <w:t xml:space="preserve"> (#96–#101),</w:t>
+      </w:r>
+    </w:p>
+    <w:p>
+      <w:r>
+        <w:rPr>
+          <w:b/>
+        </w:rPr>
         <w:t>PureSignal</w:t>
       </w:r>
       <w:r>
-        <w:t xml:space="preserve"> (Stage G/H). Smaller items: VOX (#91), voice keyer (#89), DSP buffer/latency options (#159), FM operator-knob refinement (#107), parked #156 (restart-after-hard-kill, intermittent).</w:t>
+        <w:t xml:space="preserve"> (Stage G/H — the last big TX-port pillar; needs the TX analyzer port to reference parity, #140/Stage E.1 prerequisite). Smaller TX items still open: VOX (#91), voice keyer (#89), DSP buffer/latency options (#159), external CW keyer (#171), CW keyer settings panel (#186),</w:t>
+      </w:r>
+    </w:p>
+    <w:p>
+      <w:r>
+        <w:t xml:space="preserve">#114 post-FrameComposer TX-policy plumbing, #118 Step-14 Stage 2b, #119 non-HL2 FrameComposer branches (needs tester hardware), parked #156 (restart-after-hard-kill, intermittent). A standalone </w:t>
+      </w:r>
+      <w:r>
+        <w:rPr>
+          <w:b/>
+        </w:rPr>
+        <w:t>what's-left checklist</w:t>
+      </w:r>
+      <w:r>
+        <w:t xml:space="preserve"> lives in </w:t>
+      </w:r>
+      <w:r>
+        <w:rPr>
+          <w:rFonts w:ascii="Consolas" w:hAnsi="Consolas"/>
+          <w:sz w:val="18"/>
+        </w:rPr>
+        <w:t>docs/REMAINING_WORK.md</w:t>
+      </w:r>
+      <w:r>
+        <w:t>.</w:t>
       </w:r>
     </w:p>
     <w:p>
@@ -10551,7 +10893,85 @@
     </w:p>
     <w:p>
       <w:r>
-        <w:t xml:space="preserve">*Last updated: 2026-06-19 — </w:t>
+        <w:t xml:space="preserve">*Last updated: 2026-06-29 — </w:t>
+      </w:r>
+      <w:r>
+        <w:rPr>
+          <w:b/>
+        </w:rPr>
+        <w:t>v0.7.0 RELEASED</w:t>
+      </w:r>
+      <w:r>
+        <w:t xml:space="preserve"> (release commit </w:t>
+      </w:r>
+      <w:r>
+        <w:rPr>
+          <w:rFonts w:ascii="Consolas" w:hAnsi="Consolas"/>
+          <w:sz w:val="18"/>
+        </w:rPr>
+        <w:t>7737d60</w:t>
+      </w:r>
+      <w:r>
+        <w:t xml:space="preserve">). TX-relevant slice = the </w:t>
+      </w:r>
+      <w:r>
+        <w:rPr>
+          <w:b/>
+        </w:rPr>
+        <w:t>FM transmit refinements</w:t>
+      </w:r>
+      <w:r>
+        <w:t xml:space="preserve"> (fix #2 AF brick-wall </w:t>
+      </w:r>
+      <w:r>
+        <w:rPr>
+          <w:rFonts w:ascii="Consolas" w:hAnsi="Consolas"/>
+          <w:sz w:val="18"/>
+        </w:rPr>
+        <w:t>b72bc50</w:t>
+      </w:r>
+      <w:r>
+        <w:t xml:space="preserve"> + FM-aware bandwidth </w:t>
+      </w:r>
+      <w:r>
+        <w:rPr>
+          <w:rFonts w:ascii="Consolas" w:hAnsi="Consolas"/>
+          <w:sz w:val="18"/>
+        </w:rPr>
+        <w:t>4f32ca1</w:t>
+      </w:r>
+      <w:r>
+        <w:t xml:space="preserve"> + pre-emphasis Off/Comm </w:t>
+      </w:r>
+      <w:r>
+        <w:rPr>
+          <w:rFonts w:ascii="Consolas" w:hAnsi="Consolas"/>
+          <w:sz w:val="18"/>
+        </w:rPr>
+        <w:t>a826c8c</w:t>
+      </w:r>
+      <w:r>
+        <w:t xml:space="preserve"> + mic-rack auto-bypass </w:t>
+      </w:r>
+      <w:r>
+        <w:rPr>
+          <w:rFonts w:ascii="Consolas" w:hAnsi="Consolas"/>
+          <w:sz w:val="18"/>
+        </w:rPr>
+        <w:t>12c8991</w:t>
+      </w:r>
+      <w:r>
+        <w:t xml:space="preserve"> + Tuning-panel pre-emph chip / Dev→RX-BW </w:t>
+      </w:r>
+      <w:r>
+        <w:rPr>
+          <w:rFonts w:ascii="Consolas" w:hAnsi="Consolas"/>
+          <w:sz w:val="18"/>
+        </w:rPr>
+        <w:t>67abf05</w:t>
+      </w:r>
+      <w:r>
+        <w:t xml:space="preserve">) — FM TX "beat Thetis" arc now at a complete stopping point. The v0.7.0 headline (Tuner manual-ATU memory) is pure-UI, not a TX-port item. NEXT major TX-port arcs unchanged: PureSignal (Stage G/H, the last pillar) + RX2/Split (#96–#101). Prior: 2026-06-19 — </w:t>
       </w:r>
       <w:r>
         <w:rPr>
@@ -10719,7 +11139,7 @@
         <w:color w:val="808080"/>
         <w:sz w:val="16"/>
       </w:rPr>
-      <w:t>LYRA-CPP — THETIS DIRECT-PORT PLAN (TX) — auto-generated 2026-06-24 18:49 (source: THETIS_DIRECT_PORT_PLAN.md)</w:t>
+      <w:t>lyra-cpp - Thetis Direct-Port Plan (TX) — auto-generated 2026-06-29 19:18 (source: THETIS_DIRECT_PORT_PLAN.md)</w:t>
     </w:r>
   </w:p>
 </w:hdr>

</xml_diff>